<commit_message>
id required in all input fields : optional and hassmann menu pages
</commit_message>
<xml_diff>
--- a/out-Materialuebersicht.docx
+++ b/out-Materialuebersicht.docx
@@ -43,7 +43,7 @@
               <w:t>:</w:t>
             </w:r>
             <w:r>
-              <w:t xml:space="preserve"> Frau Zahir Calderon</w:t>
+              <w:t xml:space="preserve"> Frau Duncan Cross</w:t>
             </w:r>
             <w:proofErr w:type="spellStart"/>
             <w:r>
@@ -72,7 +72,7 @@
               <w:t>:</w:t>
             </w:r>
             <w:r>
-              <w:t xml:space="preserve"> Odit reiciendis fugi, Aliquid ab in ipsam  Commodi duis volupta</w:t>
+              <w:t xml:space="preserve"> Id vel laborum magna, Non quidem cupiditat Ipsa amet est volu</w:t>
             </w:r>
             <w:proofErr w:type="spellStart"/>
             <w:r>
@@ -113,7 +113,7 @@
               <w:t>:</w:t>
             </w:r>
             <w:r>
-              <w:t xml:space="preserve"> 2017-01-15</w:t>
+              <w:t xml:space="preserve"> 2018-10-07</w:t>
             </w:r>
             <w:proofErr w:type="spellStart"/>
             <w:r>
@@ -142,7 +142,7 @@
               <w:t>:</w:t>
             </w:r>
             <w:r>
-              <w:t xml:space="preserve"> ANG2025-1008-151949</w:t>
+              <w:t xml:space="preserve"> ANG2025-1107-141120</w:t>
             </w:r>
             <w:proofErr w:type="spellStart"/>
             <w:r>
@@ -372,7 +372,7 @@
                 <w:sz w:val="20"/>
                 <w:szCs w:val="20"/>
               </w:rPr>
-              <w:t/>
+              <w:t xml:space="preserve">AGD9060</w:t>
             </w:r>
             <w:proofErr w:type="spellStart"/>
             <w:r>
@@ -409,7 +409,7 @@
                 <w:sz w:val="20"/>
                 <w:szCs w:val="20"/>
               </w:rPr>
-              <w:t xml:space="preserve">Fußboden individ.5.0 1500x200mm Lava beige (8 Paneele=2,4m/2) VIGOUR</w:t>
+              <w:t xml:space="preserve">Ablaufgarnitur Rohbauset m.Sifon BH60mm f.flache Duschw.m.90mm Ablauf TRINNITY</w:t>
             </w:r>
             <w:proofErr w:type="spellStart"/>
             <w:r>
@@ -446,7 +446,7 @@
                 <w:sz w:val="20"/>
                 <w:szCs w:val="20"/>
               </w:rPr>
-              <w:t xml:space="preserve">12</w:t>
+              <w:t xml:space="preserve">1</w:t>
             </w:r>
             <w:proofErr w:type="spellStart"/>
             <w:r>
@@ -564,7 +564,7 @@
                 <w:sz w:val="20"/>
                 <w:szCs w:val="20"/>
               </w:rPr>
-              <w:t xml:space="preserve">AGD9060</w:t>
+              <w:t xml:space="preserve">CARESMH</w:t>
             </w:r>
             <w:proofErr w:type="spellStart"/>
             <w:r>
@@ -601,7 +601,7 @@
                 <w:sz w:val="20"/>
                 <w:szCs w:val="20"/>
               </w:rPr>
-              <w:t xml:space="preserve">Ablaufgarnitur Rohbauset m. Sifon BH60mm f. Flache Duschw. m. 90mm Ablauf TRINNITY</w:t>
+              <w:t xml:space="preserve">CARE Sanitär Silikon Manhatten 310ml</w:t>
             </w:r>
             <w:proofErr w:type="spellStart"/>
             <w:r>
@@ -756,7 +756,7 @@
                 <w:sz w:val="20"/>
                 <w:szCs w:val="20"/>
               </w:rPr>
-              <w:t xml:space="preserve">CLPESG40</w:t>
+              <w:t xml:space="preserve">id01</w:t>
             </w:r>
             <w:proofErr w:type="spellStart"/>
             <w:r>
@@ -793,7 +793,7 @@
                 <w:sz w:val="20"/>
                 <w:szCs w:val="20"/>
               </w:rPr>
-              <w:t xml:space="preserve">Haltegriff clivia plus 32/400mm m. Ros. Edelstahl glatt poliert, VIGOUR</w:t>
+              <w:t xml:space="preserve">id01</w:t>
             </w:r>
             <w:proofErr w:type="spellStart"/>
             <w:r>
@@ -830,7 +830,7 @@
                 <w:sz w:val="20"/>
                 <w:szCs w:val="20"/>
               </w:rPr>
-              <w:t xml:space="preserve">2</w:t>
+              <w:t xml:space="preserve">1</w:t>
             </w:r>
             <w:proofErr w:type="spellStart"/>
             <w:r>
@@ -948,7 +948,7 @@
                 <w:sz w:val="20"/>
                 <w:szCs w:val="20"/>
               </w:rPr>
-              <w:t xml:space="preserve">DEDS2503E</w:t>
+              <w:t xml:space="preserve">id02</w:t>
             </w:r>
             <w:proofErr w:type="spellStart"/>
             <w:r>
@@ -985,7 +985,7 @@
                 <w:sz w:val="20"/>
                 <w:szCs w:val="20"/>
               </w:rPr>
-              <w:t xml:space="preserve">Duschsystem derby Thermostat m KB 250mm HB 3.2 3-fach edge u. Schl. verchr. VIG (verchromt)</w:t>
+              <w:t xml:space="preserve">id02</w:t>
             </w:r>
             <w:proofErr w:type="spellStart"/>
             <w:r>
@@ -1022,7 +1022,7 @@
                 <w:sz w:val="20"/>
                 <w:szCs w:val="20"/>
               </w:rPr>
-              <w:t xml:space="preserve">2</w:t>
+              <w:t xml:space="preserve">1</w:t>
             </w:r>
             <w:proofErr w:type="spellStart"/>
             <w:r>
@@ -1140,7 +1140,7 @@
                 <w:sz w:val="20"/>
                 <w:szCs w:val="20"/>
               </w:rPr>
-              <w:t xml:space="preserve">HASSMANN_CUSTOM</w:t>
+              <w:t xml:space="preserve">id03</w:t>
             </w:r>
             <w:proofErr w:type="spellStart"/>
             <w:r>
@@ -1177,7 +1177,7 @@
                 <w:sz w:val="20"/>
                 <w:szCs w:val="20"/>
               </w:rPr>
-              <w:t xml:space="preserve">HASSMANN_CUSTOM</w:t>
+              <w:t xml:space="preserve">id03</w:t>
             </w:r>
             <w:proofErr w:type="spellStart"/>
             <w:r>
@@ -1332,7 +1332,7 @@
                 <w:sz w:val="20"/>
                 <w:szCs w:val="20"/>
               </w:rPr>
-              <w:t xml:space="preserve">KM02</w:t>
+              <w:t xml:space="preserve">id04</w:t>
             </w:r>
             <w:proofErr w:type="spellStart"/>
             <w:r>
@@ -1369,7 +1369,7 @@
                 <w:sz w:val="20"/>
                 <w:szCs w:val="20"/>
               </w:rPr>
-              <w:t xml:space="preserve">Kleinmaterial groß</w:t>
+              <w:t xml:space="preserve">id04</w:t>
             </w:r>
             <w:proofErr w:type="spellStart"/>
             <w:r>
@@ -1524,7 +1524,7 @@
                 <w:sz w:val="20"/>
                 <w:szCs w:val="20"/>
               </w:rPr>
-              <w:t xml:space="preserve">SLA10080</w:t>
+              <w:t xml:space="preserve">id09</w:t>
             </w:r>
             <w:proofErr w:type="spellStart"/>
             <w:r>
@@ -1561,7 +1561,7 @@
                 <w:sz w:val="20"/>
                 <w:szCs w:val="20"/>
               </w:rPr>
-              <w:t xml:space="preserve">Duschwanne Slate 100x80x3cm Mineralguss weiss Nuovvo</w:t>
+              <w:t xml:space="preserve">id09</w:t>
             </w:r>
             <w:proofErr w:type="spellStart"/>
             <w:r>
@@ -1716,7 +1716,7 @@
                 <w:sz w:val="20"/>
                 <w:szCs w:val="20"/>
               </w:rPr>
-              <w:t xml:space="preserve">STELZ</w:t>
+              <w:t xml:space="preserve">id100</w:t>
             </w:r>
             <w:proofErr w:type="spellStart"/>
             <w:r>
@@ -1753,7 +1753,7 @@
                 <w:sz w:val="20"/>
                 <w:szCs w:val="20"/>
               </w:rPr>
-              <w:t xml:space="preserve">Stelzlager höhenverstellar Set</w:t>
+              <w:t xml:space="preserve">id100</w:t>
             </w:r>
             <w:proofErr w:type="spellStart"/>
             <w:r>
@@ -1908,7 +1908,7 @@
                 <w:sz w:val="20"/>
                 <w:szCs w:val="20"/>
               </w:rPr>
-              <w:t xml:space="preserve">TRBDSET7</w:t>
+              <w:t xml:space="preserve">KM02</w:t>
             </w:r>
             <w:proofErr w:type="spellStart"/>
             <w:r>
@@ -1945,7 +1945,7 @@
                 <w:sz w:val="20"/>
                 <w:szCs w:val="20"/>
               </w:rPr>
-              <w:t xml:space="preserve">TRINNITY Bodenabdichtung BASIS-Set 7 qm Dichtb., Sockelb., Außen- + Innenecke</w:t>
+              <w:t xml:space="preserve">Kleinmaterial groß</w:t>
             </w:r>
             <w:proofErr w:type="spellStart"/>
             <w:r>
@@ -1982,7 +1982,7 @@
                 <w:sz w:val="20"/>
                 <w:szCs w:val="20"/>
               </w:rPr>
-              <w:t xml:space="preserve">3</w:t>
+              <w:t xml:space="preserve">1</w:t>
             </w:r>
             <w:proofErr w:type="spellStart"/>
             <w:r>
@@ -2100,7 +2100,7 @@
                 <w:sz w:val="20"/>
                 <w:szCs w:val="20"/>
               </w:rPr>
-              <w:t xml:space="preserve">TRWDB</w:t>
+              <w:t xml:space="preserve">STELZ</w:t>
             </w:r>
             <w:proofErr w:type="spellStart"/>
             <w:r>
@@ -2137,7 +2137,7 @@
                 <w:sz w:val="20"/>
                 <w:szCs w:val="20"/>
               </w:rPr>
-              <w:t xml:space="preserve">TRINNITY Wannenabdichtband-Set 3,4 m Nass-/Trockenanbindung entspr. DIN 18534</w:t>
+              <w:t xml:space="preserve">Stelzlager höhenverstellar Set</w:t>
             </w:r>
             <w:proofErr w:type="spellStart"/>
             <w:r>
@@ -2292,7 +2292,7 @@
                 <w:sz w:val="20"/>
                 <w:szCs w:val="20"/>
               </w:rPr>
-              <w:t xml:space="preserve">TRWDSET5</w:t>
+              <w:t xml:space="preserve">TECEADS</w:t>
             </w:r>
             <w:proofErr w:type="spellStart"/>
             <w:r>
@@ -2329,7 +2329,7 @@
                 <w:sz w:val="20"/>
                 <w:szCs w:val="20"/>
               </w:rPr>
-              <w:t xml:space="preserve">TRINNITY Wandabdichtung BASIS-Set 5 qm DW bis 100 x 100 / BW bis 180 x 80 cm</w:t>
+              <w:t xml:space="preserve">Tece Seal System Abdichtungsset für Wanddurchführungen</w:t>
             </w:r>
             <w:proofErr w:type="spellStart"/>
             <w:r>
@@ -2366,7 +2366,7 @@
                 <w:sz w:val="20"/>
                 <w:szCs w:val="20"/>
               </w:rPr>
-              <w:t xml:space="preserve">1</w:t>
+              <w:t xml:space="preserve">2</w:t>
             </w:r>
             <w:proofErr w:type="spellStart"/>
             <w:r>
@@ -2484,7 +2484,7 @@
                 <w:sz w:val="20"/>
                 <w:szCs w:val="20"/>
               </w:rPr>
-              <w:t xml:space="preserve">V3A</w:t>
+              <w:t xml:space="preserve">TRWDB</w:t>
             </w:r>
             <w:proofErr w:type="spellStart"/>
             <w:r>
@@ -2521,7 +2521,7 @@
                 <w:sz w:val="20"/>
                 <w:szCs w:val="20"/>
               </w:rPr>
-              <w:t xml:space="preserve">Abschlussprofil 3.0 255 cm silber eloxiert VIGOUR</w:t>
+              <w:t xml:space="preserve">TRINNITY Wannenabdichtband-Set 3,4 m Nass-/Trockenanbindung entspr. DIN 18534</w:t>
             </w:r>
             <w:proofErr w:type="spellStart"/>
             <w:r>
@@ -2558,7 +2558,7 @@
                 <w:sz w:val="20"/>
                 <w:szCs w:val="20"/>
               </w:rPr>
-              <w:t xml:space="preserve">2</w:t>
+              <w:t xml:space="preserve">1</w:t>
             </w:r>
             <w:proofErr w:type="spellStart"/>
             <w:r>
@@ -2676,7 +2676,7 @@
                 <w:sz w:val="20"/>
                 <w:szCs w:val="20"/>
               </w:rPr>
-              <w:t xml:space="preserve">V3WV09</w:t>
+              <w:t xml:space="preserve">TRWDSET5</w:t>
             </w:r>
             <w:proofErr w:type="spellStart"/>
             <w:r>
@@ -2713,7 +2713,7 @@
                 <w:sz w:val="20"/>
                 <w:szCs w:val="20"/>
               </w:rPr>
-              <w:t xml:space="preserve">Wandverkleidung 3.0 Alu 1497x 2550mm Marmor weiß VIGOUR Standardfarbe: weiß</w:t>
+              <w:t xml:space="preserve">TRINNITY Wandabdichtung BASIS-Set 5 qm DW bis 100 x 100 / BW bis 180 x 80 cm</w:t>
             </w:r>
             <w:proofErr w:type="spellStart"/>
             <w:r>
@@ -2750,7 +2750,7 @@
                 <w:sz w:val="20"/>
                 <w:szCs w:val="20"/>
               </w:rPr>
-              <w:t xml:space="preserve">2</w:t>
+              <w:t xml:space="preserve">1</w:t>
             </w:r>
             <w:proofErr w:type="spellStart"/>
             <w:r>
@@ -2868,7 +2868,7 @@
                 <w:sz w:val="20"/>
                 <w:szCs w:val="20"/>
               </w:rPr>
-              <w:t xml:space="preserve">V4FK600</w:t>
+              <w:t xml:space="preserve">V3A</w:t>
             </w:r>
             <w:proofErr w:type="spellStart"/>
             <w:r>
@@ -2905,7 +2905,7 @@
                 <w:sz w:val="20"/>
                 <w:szCs w:val="20"/>
               </w:rPr>
-              <w:t xml:space="preserve">Flächenkleber 3.0/4.0/5.0 Fußboden und Wandverkleidungspaneele 600ml VIGOUR</w:t>
+              <w:t xml:space="preserve">Abschlussprofil 3.0 255 cm silber eloxiert VIGOUR</w:t>
             </w:r>
             <w:proofErr w:type="spellStart"/>
             <w:r>
@@ -2942,391 +2942,7 @@
                 <w:sz w:val="20"/>
                 <w:szCs w:val="20"/>
               </w:rPr>
-              <w:t xml:space="preserve">4</w:t>
-            </w:r>
-            <w:proofErr w:type="spellStart"/>
-            <w:r>
-              <w:rPr>
-                <w:sz w:val="20"/>
-                <w:szCs w:val="20"/>
-              </w:rPr>
-              <w:t/>
-            </w:r>
-            <w:proofErr w:type="spellEnd"/>
-            <w:r>
-              <w:rPr>
-                <w:sz w:val="20"/>
-                <w:szCs w:val="20"/>
-              </w:rPr>
-              <w:t/>
-            </w:r>
-          </w:p>
-        </w:tc>
-        <w:tc>
-          <w:tcPr>
-            <w:tcW w:w="878" w:type="dxa"/>
-          </w:tcPr>
-          <w:p>
-            <w:pPr>
-              <w:rPr>
-                <w:sz w:val="20"/>
-                <w:szCs w:val="20"/>
-                <w:lang w:val="de-DE"/>
-              </w:rPr>
-            </w:pPr>
-            <w:r>
-              <w:rPr>
-                <w:sz w:val="20"/>
-                <w:szCs w:val="20"/>
-              </w:rPr>
-              <w:t xml:space="preserve">Stck.</w:t>
-            </w:r>
-          </w:p>
-        </w:tc>
-        <w:tc>
-          <w:tcPr>
-            <w:tcW w:w="1303" w:type="dxa"/>
-          </w:tcPr>
-          <w:p>
-            <w:pPr>
-              <w:rPr>
-                <w:sz w:val="20"/>
-                <w:szCs w:val="20"/>
-                <w:lang w:val="de-DE"/>
-              </w:rPr>
-            </w:pPr>
-            <w:r>
-              <w:rPr>
-                <w:sz w:val="20"/>
-                <w:szCs w:val="20"/>
-              </w:rPr>
-              <w:t/>
-            </w:r>
-            <w:proofErr w:type="spellStart"/>
-            <w:r>
-              <w:rPr>
-                <w:sz w:val="20"/>
-                <w:szCs w:val="20"/>
-              </w:rPr>
-              <w:t/>
-            </w:r>
-            <w:proofErr w:type="spellEnd"/>
-            <w:r>
-              <w:rPr>
-                <w:sz w:val="20"/>
-                <w:szCs w:val="20"/>
-              </w:rPr>
-              <w:t/>
-            </w:r>
-          </w:p>
-        </w:tc>
-      </w:tr>
-      <w:tr>
-        <w:tc>
-          <w:tcPr>
-            <w:tcW w:w="2836" w:type="dxa"/>
-          </w:tcPr>
-          <w:p>
-            <w:pPr>
-              <w:rPr>
-                <w:sz w:val="20"/>
-                <w:szCs w:val="20"/>
-                <w:lang w:val="de-DE"/>
-              </w:rPr>
-            </w:pPr>
-            <w:r>
-              <w:rPr>
-                <w:sz w:val="20"/>
-                <w:szCs w:val="20"/>
-              </w:rPr>
-              <w:t xml:space="preserve">15</w:t>
-            </w:r>
-          </w:p>
-        </w:tc>
-        <w:tc>
-          <w:tcPr>
-            <w:tcW w:w="2041" w:type="dxa"/>
-          </w:tcPr>
-          <w:p>
-            <w:pPr>
-              <w:rPr>
-                <w:sz w:val="20"/>
-                <w:szCs w:val="20"/>
-                <w:lang w:val="de-DE"/>
-              </w:rPr>
-            </w:pPr>
-            <w:r>
-              <w:rPr>
-                <w:sz w:val="20"/>
-                <w:szCs w:val="20"/>
-              </w:rPr>
-              <w:t xml:space="preserve">V4RKIT</w:t>
-            </w:r>
-            <w:proofErr w:type="spellStart"/>
-            <w:r>
-              <w:rPr>
-                <w:sz w:val="20"/>
-                <w:szCs w:val="20"/>
-              </w:rPr>
-              <w:t/>
-            </w:r>
-            <w:proofErr w:type="spellEnd"/>
-            <w:r>
-              <w:rPr>
-                <w:sz w:val="20"/>
-                <w:szCs w:val="20"/>
-              </w:rPr>
-              <w:t/>
-            </w:r>
-          </w:p>
-        </w:tc>
-        <w:tc>
-          <w:tcPr>
-            <w:tcW w:w="1440" w:type="dxa"/>
-          </w:tcPr>
-          <w:p>
-            <w:pPr>
-              <w:rPr>
-                <w:sz w:val="20"/>
-                <w:szCs w:val="20"/>
-                <w:lang w:val="de-DE"/>
-              </w:rPr>
-            </w:pPr>
-            <w:r>
-              <w:rPr>
-                <w:sz w:val="20"/>
-                <w:szCs w:val="20"/>
-              </w:rPr>
-              <w:t xml:space="preserve">Wandverkleidungsklebstoff 3.0/4.0 für Wandverkleidungspaneel VIGOUR</w:t>
-            </w:r>
-            <w:proofErr w:type="spellStart"/>
-            <w:r>
-              <w:rPr>
-                <w:sz w:val="20"/>
-                <w:szCs w:val="20"/>
-              </w:rPr>
-              <w:t/>
-            </w:r>
-            <w:proofErr w:type="spellEnd"/>
-            <w:r>
-              <w:rPr>
-                <w:sz w:val="20"/>
-                <w:szCs w:val="20"/>
-              </w:rPr>
-              <w:t/>
-            </w:r>
-          </w:p>
-        </w:tc>
-        <w:tc>
-          <w:tcPr>
-            <w:tcW w:w="853" w:type="dxa"/>
-          </w:tcPr>
-          <w:p>
-            <w:pPr>
-              <w:rPr>
-                <w:sz w:val="20"/>
-                <w:szCs w:val="20"/>
-                <w:lang w:val="de-DE"/>
-              </w:rPr>
-            </w:pPr>
-            <w:r>
-              <w:rPr>
-                <w:sz w:val="20"/>
-                <w:szCs w:val="20"/>
-              </w:rPr>
               <w:t xml:space="preserve">1</w:t>
-            </w:r>
-            <w:proofErr w:type="spellStart"/>
-            <w:r>
-              <w:rPr>
-                <w:sz w:val="20"/>
-                <w:szCs w:val="20"/>
-              </w:rPr>
-              <w:t/>
-            </w:r>
-            <w:proofErr w:type="spellEnd"/>
-            <w:r>
-              <w:rPr>
-                <w:sz w:val="20"/>
-                <w:szCs w:val="20"/>
-              </w:rPr>
-              <w:t/>
-            </w:r>
-          </w:p>
-        </w:tc>
-        <w:tc>
-          <w:tcPr>
-            <w:tcW w:w="878" w:type="dxa"/>
-          </w:tcPr>
-          <w:p>
-            <w:pPr>
-              <w:rPr>
-                <w:sz w:val="20"/>
-                <w:szCs w:val="20"/>
-                <w:lang w:val="de-DE"/>
-              </w:rPr>
-            </w:pPr>
-            <w:r>
-              <w:rPr>
-                <w:sz w:val="20"/>
-                <w:szCs w:val="20"/>
-              </w:rPr>
-              <w:t xml:space="preserve">Stck.</w:t>
-            </w:r>
-          </w:p>
-        </w:tc>
-        <w:tc>
-          <w:tcPr>
-            <w:tcW w:w="1303" w:type="dxa"/>
-          </w:tcPr>
-          <w:p>
-            <w:pPr>
-              <w:rPr>
-                <w:sz w:val="20"/>
-                <w:szCs w:val="20"/>
-                <w:lang w:val="de-DE"/>
-              </w:rPr>
-            </w:pPr>
-            <w:r>
-              <w:rPr>
-                <w:sz w:val="20"/>
-                <w:szCs w:val="20"/>
-              </w:rPr>
-              <w:t/>
-            </w:r>
-            <w:proofErr w:type="spellStart"/>
-            <w:r>
-              <w:rPr>
-                <w:sz w:val="20"/>
-                <w:szCs w:val="20"/>
-              </w:rPr>
-              <w:t/>
-            </w:r>
-            <w:proofErr w:type="spellEnd"/>
-            <w:r>
-              <w:rPr>
-                <w:sz w:val="20"/>
-                <w:szCs w:val="20"/>
-              </w:rPr>
-              <w:t/>
-            </w:r>
-          </w:p>
-        </w:tc>
-      </w:tr>
-      <w:tr>
-        <w:tc>
-          <w:tcPr>
-            <w:tcW w:w="2836" w:type="dxa"/>
-          </w:tcPr>
-          <w:p>
-            <w:pPr>
-              <w:rPr>
-                <w:sz w:val="20"/>
-                <w:szCs w:val="20"/>
-                <w:lang w:val="de-DE"/>
-              </w:rPr>
-            </w:pPr>
-            <w:r>
-              <w:rPr>
-                <w:sz w:val="20"/>
-                <w:szCs w:val="20"/>
-              </w:rPr>
-              <w:t xml:space="preserve">16</w:t>
-            </w:r>
-          </w:p>
-        </w:tc>
-        <w:tc>
-          <w:tcPr>
-            <w:tcW w:w="2041" w:type="dxa"/>
-          </w:tcPr>
-          <w:p>
-            <w:pPr>
-              <w:rPr>
-                <w:sz w:val="20"/>
-                <w:szCs w:val="20"/>
-                <w:lang w:val="de-DE"/>
-              </w:rPr>
-            </w:pPr>
-            <w:r>
-              <w:rPr>
-                <w:sz w:val="20"/>
-                <w:szCs w:val="20"/>
-              </w:rPr>
-              <w:t xml:space="preserve">V4RPKIT</w:t>
-            </w:r>
-            <w:proofErr w:type="spellStart"/>
-            <w:r>
-              <w:rPr>
-                <w:sz w:val="20"/>
-                <w:szCs w:val="20"/>
-              </w:rPr>
-              <w:t/>
-            </w:r>
-            <w:proofErr w:type="spellEnd"/>
-            <w:r>
-              <w:rPr>
-                <w:sz w:val="20"/>
-                <w:szCs w:val="20"/>
-              </w:rPr>
-              <w:t/>
-            </w:r>
-          </w:p>
-        </w:tc>
-        <w:tc>
-          <w:tcPr>
-            <w:tcW w:w="1440" w:type="dxa"/>
-          </w:tcPr>
-          <w:p>
-            <w:pPr>
-              <w:rPr>
-                <w:sz w:val="20"/>
-                <w:szCs w:val="20"/>
-                <w:lang w:val="de-DE"/>
-              </w:rPr>
-            </w:pPr>
-            <w:r>
-              <w:rPr>
-                <w:sz w:val="20"/>
-                <w:szCs w:val="20"/>
-              </w:rPr>
-              <w:t xml:space="preserve">3.0 / 4.0 Profilklebstoff für Wandverkleidungsprofil VIGOUR</w:t>
-            </w:r>
-            <w:proofErr w:type="spellStart"/>
-            <w:r>
-              <w:rPr>
-                <w:sz w:val="20"/>
-                <w:szCs w:val="20"/>
-              </w:rPr>
-              <w:t/>
-            </w:r>
-            <w:proofErr w:type="spellEnd"/>
-            <w:r>
-              <w:rPr>
-                <w:sz w:val="20"/>
-                <w:szCs w:val="20"/>
-              </w:rPr>
-              <w:t/>
-            </w:r>
-          </w:p>
-        </w:tc>
-        <w:tc>
-          <w:tcPr>
-            <w:tcW w:w="853" w:type="dxa"/>
-          </w:tcPr>
-          <w:p>
-            <w:pPr>
-              <w:rPr>
-                <w:sz w:val="20"/>
-                <w:szCs w:val="20"/>
-                <w:lang w:val="de-DE"/>
-              </w:rPr>
-            </w:pPr>
-            <w:r>
-              <w:rPr>
-                <w:sz w:val="20"/>
-                <w:szCs w:val="20"/>
-              </w:rPr>
-              <w:t xml:space="preserve">2</w:t>
             </w:r>
             <w:proofErr w:type="spellStart"/>
             <w:r>

</xml_diff>

<commit_message>
id now is displayed for all freier posten
</commit_message>
<xml_diff>
--- a/out-Materialuebersicht.docx
+++ b/out-Materialuebersicht.docx
@@ -142,7 +142,7 @@
               <w:t>:</w:t>
             </w:r>
             <w:r>
-              <w:t xml:space="preserve"> ANG2025-1107-141120</w:t>
+              <w:t xml:space="preserve"> ANG2025-1107-143801</w:t>
             </w:r>
             <w:proofErr w:type="spellStart"/>
             <w:r>
@@ -1332,7 +1332,7 @@
                 <w:sz w:val="20"/>
                 <w:szCs w:val="20"/>
               </w:rPr>
-              <w:t xml:space="preserve">id04</w:t>
+              <w:t xml:space="preserve">id05</w:t>
             </w:r>
             <w:proofErr w:type="spellStart"/>
             <w:r>
@@ -1369,7 +1369,7 @@
                 <w:sz w:val="20"/>
                 <w:szCs w:val="20"/>
               </w:rPr>
-              <w:t xml:space="preserve">id04</w:t>
+              <w:t xml:space="preserve">id05</w:t>
             </w:r>
             <w:proofErr w:type="spellStart"/>
             <w:r>
@@ -1524,7 +1524,7 @@
                 <w:sz w:val="20"/>
                 <w:szCs w:val="20"/>
               </w:rPr>
-              <w:t xml:space="preserve">id09</w:t>
+              <w:t xml:space="preserve">KM02</w:t>
             </w:r>
             <w:proofErr w:type="spellStart"/>
             <w:r>
@@ -1561,7 +1561,7 @@
                 <w:sz w:val="20"/>
                 <w:szCs w:val="20"/>
               </w:rPr>
-              <w:t xml:space="preserve">id09</w:t>
+              <w:t xml:space="preserve">Kleinmaterial groß</w:t>
             </w:r>
             <w:proofErr w:type="spellStart"/>
             <w:r>
@@ -1716,7 +1716,7 @@
                 <w:sz w:val="20"/>
                 <w:szCs w:val="20"/>
               </w:rPr>
-              <w:t xml:space="preserve">id100</w:t>
+              <w:t xml:space="preserve">STELZ</w:t>
             </w:r>
             <w:proofErr w:type="spellStart"/>
             <w:r>
@@ -1753,7 +1753,7 @@
                 <w:sz w:val="20"/>
                 <w:szCs w:val="20"/>
               </w:rPr>
-              <w:t xml:space="preserve">id100</w:t>
+              <w:t xml:space="preserve">Stelzlager höhenverstellar Set</w:t>
             </w:r>
             <w:proofErr w:type="spellStart"/>
             <w:r>
@@ -1908,7 +1908,7 @@
                 <w:sz w:val="20"/>
                 <w:szCs w:val="20"/>
               </w:rPr>
-              <w:t xml:space="preserve">KM02</w:t>
+              <w:t xml:space="preserve">TRWDB</w:t>
             </w:r>
             <w:proofErr w:type="spellStart"/>
             <w:r>
@@ -1945,7 +1945,7 @@
                 <w:sz w:val="20"/>
                 <w:szCs w:val="20"/>
               </w:rPr>
-              <w:t xml:space="preserve">Kleinmaterial groß</w:t>
+              <w:t xml:space="preserve">TRINNITY Wannenabdichtband-Set 3,4 m Nass-/Trockenanbindung entspr. DIN 18534</w:t>
             </w:r>
             <w:proofErr w:type="spellStart"/>
             <w:r>
@@ -2100,7 +2100,7 @@
                 <w:sz w:val="20"/>
                 <w:szCs w:val="20"/>
               </w:rPr>
-              <w:t xml:space="preserve">STELZ</w:t>
+              <w:t xml:space="preserve">TRWDSET5</w:t>
             </w:r>
             <w:proofErr w:type="spellStart"/>
             <w:r>
@@ -2137,7 +2137,7 @@
                 <w:sz w:val="20"/>
                 <w:szCs w:val="20"/>
               </w:rPr>
-              <w:t xml:space="preserve">Stelzlager höhenverstellar Set</w:t>
+              <w:t xml:space="preserve">TRINNITY Wandabdichtung BASIS-Set 5 qm DW bis 100 x 100 / BW bis 180 x 80 cm</w:t>
             </w:r>
             <w:proofErr w:type="spellStart"/>
             <w:r>
@@ -2272,582 +2272,6 @@
                 <w:szCs w:val="20"/>
               </w:rPr>
               <w:t xml:space="preserve">11</w:t>
-            </w:r>
-          </w:p>
-        </w:tc>
-        <w:tc>
-          <w:tcPr>
-            <w:tcW w:w="2041" w:type="dxa"/>
-          </w:tcPr>
-          <w:p>
-            <w:pPr>
-              <w:rPr>
-                <w:sz w:val="20"/>
-                <w:szCs w:val="20"/>
-                <w:lang w:val="de-DE"/>
-              </w:rPr>
-            </w:pPr>
-            <w:r>
-              <w:rPr>
-                <w:sz w:val="20"/>
-                <w:szCs w:val="20"/>
-              </w:rPr>
-              <w:t xml:space="preserve">TECEADS</w:t>
-            </w:r>
-            <w:proofErr w:type="spellStart"/>
-            <w:r>
-              <w:rPr>
-                <w:sz w:val="20"/>
-                <w:szCs w:val="20"/>
-              </w:rPr>
-              <w:t/>
-            </w:r>
-            <w:proofErr w:type="spellEnd"/>
-            <w:r>
-              <w:rPr>
-                <w:sz w:val="20"/>
-                <w:szCs w:val="20"/>
-              </w:rPr>
-              <w:t/>
-            </w:r>
-          </w:p>
-        </w:tc>
-        <w:tc>
-          <w:tcPr>
-            <w:tcW w:w="1440" w:type="dxa"/>
-          </w:tcPr>
-          <w:p>
-            <w:pPr>
-              <w:rPr>
-                <w:sz w:val="20"/>
-                <w:szCs w:val="20"/>
-                <w:lang w:val="de-DE"/>
-              </w:rPr>
-            </w:pPr>
-            <w:r>
-              <w:rPr>
-                <w:sz w:val="20"/>
-                <w:szCs w:val="20"/>
-              </w:rPr>
-              <w:t xml:space="preserve">Tece Seal System Abdichtungsset für Wanddurchführungen</w:t>
-            </w:r>
-            <w:proofErr w:type="spellStart"/>
-            <w:r>
-              <w:rPr>
-                <w:sz w:val="20"/>
-                <w:szCs w:val="20"/>
-              </w:rPr>
-              <w:t/>
-            </w:r>
-            <w:proofErr w:type="spellEnd"/>
-            <w:r>
-              <w:rPr>
-                <w:sz w:val="20"/>
-                <w:szCs w:val="20"/>
-              </w:rPr>
-              <w:t/>
-            </w:r>
-          </w:p>
-        </w:tc>
-        <w:tc>
-          <w:tcPr>
-            <w:tcW w:w="853" w:type="dxa"/>
-          </w:tcPr>
-          <w:p>
-            <w:pPr>
-              <w:rPr>
-                <w:sz w:val="20"/>
-                <w:szCs w:val="20"/>
-                <w:lang w:val="de-DE"/>
-              </w:rPr>
-            </w:pPr>
-            <w:r>
-              <w:rPr>
-                <w:sz w:val="20"/>
-                <w:szCs w:val="20"/>
-              </w:rPr>
-              <w:t xml:space="preserve">2</w:t>
-            </w:r>
-            <w:proofErr w:type="spellStart"/>
-            <w:r>
-              <w:rPr>
-                <w:sz w:val="20"/>
-                <w:szCs w:val="20"/>
-              </w:rPr>
-              <w:t/>
-            </w:r>
-            <w:proofErr w:type="spellEnd"/>
-            <w:r>
-              <w:rPr>
-                <w:sz w:val="20"/>
-                <w:szCs w:val="20"/>
-              </w:rPr>
-              <w:t/>
-            </w:r>
-          </w:p>
-        </w:tc>
-        <w:tc>
-          <w:tcPr>
-            <w:tcW w:w="878" w:type="dxa"/>
-          </w:tcPr>
-          <w:p>
-            <w:pPr>
-              <w:rPr>
-                <w:sz w:val="20"/>
-                <w:szCs w:val="20"/>
-                <w:lang w:val="de-DE"/>
-              </w:rPr>
-            </w:pPr>
-            <w:r>
-              <w:rPr>
-                <w:sz w:val="20"/>
-                <w:szCs w:val="20"/>
-              </w:rPr>
-              <w:t xml:space="preserve">Stck.</w:t>
-            </w:r>
-          </w:p>
-        </w:tc>
-        <w:tc>
-          <w:tcPr>
-            <w:tcW w:w="1303" w:type="dxa"/>
-          </w:tcPr>
-          <w:p>
-            <w:pPr>
-              <w:rPr>
-                <w:sz w:val="20"/>
-                <w:szCs w:val="20"/>
-                <w:lang w:val="de-DE"/>
-              </w:rPr>
-            </w:pPr>
-            <w:r>
-              <w:rPr>
-                <w:sz w:val="20"/>
-                <w:szCs w:val="20"/>
-              </w:rPr>
-              <w:t/>
-            </w:r>
-            <w:proofErr w:type="spellStart"/>
-            <w:r>
-              <w:rPr>
-                <w:sz w:val="20"/>
-                <w:szCs w:val="20"/>
-              </w:rPr>
-              <w:t/>
-            </w:r>
-            <w:proofErr w:type="spellEnd"/>
-            <w:r>
-              <w:rPr>
-                <w:sz w:val="20"/>
-                <w:szCs w:val="20"/>
-              </w:rPr>
-              <w:t/>
-            </w:r>
-          </w:p>
-        </w:tc>
-      </w:tr>
-      <w:tr>
-        <w:tc>
-          <w:tcPr>
-            <w:tcW w:w="2836" w:type="dxa"/>
-          </w:tcPr>
-          <w:p>
-            <w:pPr>
-              <w:rPr>
-                <w:sz w:val="20"/>
-                <w:szCs w:val="20"/>
-                <w:lang w:val="de-DE"/>
-              </w:rPr>
-            </w:pPr>
-            <w:r>
-              <w:rPr>
-                <w:sz w:val="20"/>
-                <w:szCs w:val="20"/>
-              </w:rPr>
-              <w:t xml:space="preserve">12</w:t>
-            </w:r>
-          </w:p>
-        </w:tc>
-        <w:tc>
-          <w:tcPr>
-            <w:tcW w:w="2041" w:type="dxa"/>
-          </w:tcPr>
-          <w:p>
-            <w:pPr>
-              <w:rPr>
-                <w:sz w:val="20"/>
-                <w:szCs w:val="20"/>
-                <w:lang w:val="de-DE"/>
-              </w:rPr>
-            </w:pPr>
-            <w:r>
-              <w:rPr>
-                <w:sz w:val="20"/>
-                <w:szCs w:val="20"/>
-              </w:rPr>
-              <w:t xml:space="preserve">TRWDB</w:t>
-            </w:r>
-            <w:proofErr w:type="spellStart"/>
-            <w:r>
-              <w:rPr>
-                <w:sz w:val="20"/>
-                <w:szCs w:val="20"/>
-              </w:rPr>
-              <w:t/>
-            </w:r>
-            <w:proofErr w:type="spellEnd"/>
-            <w:r>
-              <w:rPr>
-                <w:sz w:val="20"/>
-                <w:szCs w:val="20"/>
-              </w:rPr>
-              <w:t/>
-            </w:r>
-          </w:p>
-        </w:tc>
-        <w:tc>
-          <w:tcPr>
-            <w:tcW w:w="1440" w:type="dxa"/>
-          </w:tcPr>
-          <w:p>
-            <w:pPr>
-              <w:rPr>
-                <w:sz w:val="20"/>
-                <w:szCs w:val="20"/>
-                <w:lang w:val="de-DE"/>
-              </w:rPr>
-            </w:pPr>
-            <w:r>
-              <w:rPr>
-                <w:sz w:val="20"/>
-                <w:szCs w:val="20"/>
-              </w:rPr>
-              <w:t xml:space="preserve">TRINNITY Wannenabdichtband-Set 3,4 m Nass-/Trockenanbindung entspr. DIN 18534</w:t>
-            </w:r>
-            <w:proofErr w:type="spellStart"/>
-            <w:r>
-              <w:rPr>
-                <w:sz w:val="20"/>
-                <w:szCs w:val="20"/>
-              </w:rPr>
-              <w:t/>
-            </w:r>
-            <w:proofErr w:type="spellEnd"/>
-            <w:r>
-              <w:rPr>
-                <w:sz w:val="20"/>
-                <w:szCs w:val="20"/>
-              </w:rPr>
-              <w:t/>
-            </w:r>
-          </w:p>
-        </w:tc>
-        <w:tc>
-          <w:tcPr>
-            <w:tcW w:w="853" w:type="dxa"/>
-          </w:tcPr>
-          <w:p>
-            <w:pPr>
-              <w:rPr>
-                <w:sz w:val="20"/>
-                <w:szCs w:val="20"/>
-                <w:lang w:val="de-DE"/>
-              </w:rPr>
-            </w:pPr>
-            <w:r>
-              <w:rPr>
-                <w:sz w:val="20"/>
-                <w:szCs w:val="20"/>
-              </w:rPr>
-              <w:t xml:space="preserve">1</w:t>
-            </w:r>
-            <w:proofErr w:type="spellStart"/>
-            <w:r>
-              <w:rPr>
-                <w:sz w:val="20"/>
-                <w:szCs w:val="20"/>
-              </w:rPr>
-              <w:t/>
-            </w:r>
-            <w:proofErr w:type="spellEnd"/>
-            <w:r>
-              <w:rPr>
-                <w:sz w:val="20"/>
-                <w:szCs w:val="20"/>
-              </w:rPr>
-              <w:t/>
-            </w:r>
-          </w:p>
-        </w:tc>
-        <w:tc>
-          <w:tcPr>
-            <w:tcW w:w="878" w:type="dxa"/>
-          </w:tcPr>
-          <w:p>
-            <w:pPr>
-              <w:rPr>
-                <w:sz w:val="20"/>
-                <w:szCs w:val="20"/>
-                <w:lang w:val="de-DE"/>
-              </w:rPr>
-            </w:pPr>
-            <w:r>
-              <w:rPr>
-                <w:sz w:val="20"/>
-                <w:szCs w:val="20"/>
-              </w:rPr>
-              <w:t xml:space="preserve">Stck.</w:t>
-            </w:r>
-          </w:p>
-        </w:tc>
-        <w:tc>
-          <w:tcPr>
-            <w:tcW w:w="1303" w:type="dxa"/>
-          </w:tcPr>
-          <w:p>
-            <w:pPr>
-              <w:rPr>
-                <w:sz w:val="20"/>
-                <w:szCs w:val="20"/>
-                <w:lang w:val="de-DE"/>
-              </w:rPr>
-            </w:pPr>
-            <w:r>
-              <w:rPr>
-                <w:sz w:val="20"/>
-                <w:szCs w:val="20"/>
-              </w:rPr>
-              <w:t/>
-            </w:r>
-            <w:proofErr w:type="spellStart"/>
-            <w:r>
-              <w:rPr>
-                <w:sz w:val="20"/>
-                <w:szCs w:val="20"/>
-              </w:rPr>
-              <w:t/>
-            </w:r>
-            <w:proofErr w:type="spellEnd"/>
-            <w:r>
-              <w:rPr>
-                <w:sz w:val="20"/>
-                <w:szCs w:val="20"/>
-              </w:rPr>
-              <w:t/>
-            </w:r>
-          </w:p>
-        </w:tc>
-      </w:tr>
-      <w:tr>
-        <w:tc>
-          <w:tcPr>
-            <w:tcW w:w="2836" w:type="dxa"/>
-          </w:tcPr>
-          <w:p>
-            <w:pPr>
-              <w:rPr>
-                <w:sz w:val="20"/>
-                <w:szCs w:val="20"/>
-                <w:lang w:val="de-DE"/>
-              </w:rPr>
-            </w:pPr>
-            <w:r>
-              <w:rPr>
-                <w:sz w:val="20"/>
-                <w:szCs w:val="20"/>
-              </w:rPr>
-              <w:t xml:space="preserve">13</w:t>
-            </w:r>
-          </w:p>
-        </w:tc>
-        <w:tc>
-          <w:tcPr>
-            <w:tcW w:w="2041" w:type="dxa"/>
-          </w:tcPr>
-          <w:p>
-            <w:pPr>
-              <w:rPr>
-                <w:sz w:val="20"/>
-                <w:szCs w:val="20"/>
-                <w:lang w:val="de-DE"/>
-              </w:rPr>
-            </w:pPr>
-            <w:r>
-              <w:rPr>
-                <w:sz w:val="20"/>
-                <w:szCs w:val="20"/>
-              </w:rPr>
-              <w:t xml:space="preserve">TRWDSET5</w:t>
-            </w:r>
-            <w:proofErr w:type="spellStart"/>
-            <w:r>
-              <w:rPr>
-                <w:sz w:val="20"/>
-                <w:szCs w:val="20"/>
-              </w:rPr>
-              <w:t/>
-            </w:r>
-            <w:proofErr w:type="spellEnd"/>
-            <w:r>
-              <w:rPr>
-                <w:sz w:val="20"/>
-                <w:szCs w:val="20"/>
-              </w:rPr>
-              <w:t/>
-            </w:r>
-          </w:p>
-        </w:tc>
-        <w:tc>
-          <w:tcPr>
-            <w:tcW w:w="1440" w:type="dxa"/>
-          </w:tcPr>
-          <w:p>
-            <w:pPr>
-              <w:rPr>
-                <w:sz w:val="20"/>
-                <w:szCs w:val="20"/>
-                <w:lang w:val="de-DE"/>
-              </w:rPr>
-            </w:pPr>
-            <w:r>
-              <w:rPr>
-                <w:sz w:val="20"/>
-                <w:szCs w:val="20"/>
-              </w:rPr>
-              <w:t xml:space="preserve">TRINNITY Wandabdichtung BASIS-Set 5 qm DW bis 100 x 100 / BW bis 180 x 80 cm</w:t>
-            </w:r>
-            <w:proofErr w:type="spellStart"/>
-            <w:r>
-              <w:rPr>
-                <w:sz w:val="20"/>
-                <w:szCs w:val="20"/>
-              </w:rPr>
-              <w:t/>
-            </w:r>
-            <w:proofErr w:type="spellEnd"/>
-            <w:r>
-              <w:rPr>
-                <w:sz w:val="20"/>
-                <w:szCs w:val="20"/>
-              </w:rPr>
-              <w:t/>
-            </w:r>
-          </w:p>
-        </w:tc>
-        <w:tc>
-          <w:tcPr>
-            <w:tcW w:w="853" w:type="dxa"/>
-          </w:tcPr>
-          <w:p>
-            <w:pPr>
-              <w:rPr>
-                <w:sz w:val="20"/>
-                <w:szCs w:val="20"/>
-                <w:lang w:val="de-DE"/>
-              </w:rPr>
-            </w:pPr>
-            <w:r>
-              <w:rPr>
-                <w:sz w:val="20"/>
-                <w:szCs w:val="20"/>
-              </w:rPr>
-              <w:t xml:space="preserve">1</w:t>
-            </w:r>
-            <w:proofErr w:type="spellStart"/>
-            <w:r>
-              <w:rPr>
-                <w:sz w:val="20"/>
-                <w:szCs w:val="20"/>
-              </w:rPr>
-              <w:t/>
-            </w:r>
-            <w:proofErr w:type="spellEnd"/>
-            <w:r>
-              <w:rPr>
-                <w:sz w:val="20"/>
-                <w:szCs w:val="20"/>
-              </w:rPr>
-              <w:t/>
-            </w:r>
-          </w:p>
-        </w:tc>
-        <w:tc>
-          <w:tcPr>
-            <w:tcW w:w="878" w:type="dxa"/>
-          </w:tcPr>
-          <w:p>
-            <w:pPr>
-              <w:rPr>
-                <w:sz w:val="20"/>
-                <w:szCs w:val="20"/>
-                <w:lang w:val="de-DE"/>
-              </w:rPr>
-            </w:pPr>
-            <w:r>
-              <w:rPr>
-                <w:sz w:val="20"/>
-                <w:szCs w:val="20"/>
-              </w:rPr>
-              <w:t xml:space="preserve">Stck.</w:t>
-            </w:r>
-          </w:p>
-        </w:tc>
-        <w:tc>
-          <w:tcPr>
-            <w:tcW w:w="1303" w:type="dxa"/>
-          </w:tcPr>
-          <w:p>
-            <w:pPr>
-              <w:rPr>
-                <w:sz w:val="20"/>
-                <w:szCs w:val="20"/>
-                <w:lang w:val="de-DE"/>
-              </w:rPr>
-            </w:pPr>
-            <w:r>
-              <w:rPr>
-                <w:sz w:val="20"/>
-                <w:szCs w:val="20"/>
-              </w:rPr>
-              <w:t/>
-            </w:r>
-            <w:proofErr w:type="spellStart"/>
-            <w:r>
-              <w:rPr>
-                <w:sz w:val="20"/>
-                <w:szCs w:val="20"/>
-              </w:rPr>
-              <w:t/>
-            </w:r>
-            <w:proofErr w:type="spellEnd"/>
-            <w:r>
-              <w:rPr>
-                <w:sz w:val="20"/>
-                <w:szCs w:val="20"/>
-              </w:rPr>
-              <w:t/>
-            </w:r>
-          </w:p>
-        </w:tc>
-      </w:tr>
-      <w:tr>
-        <w:tc>
-          <w:tcPr>
-            <w:tcW w:w="2836" w:type="dxa"/>
-          </w:tcPr>
-          <w:p>
-            <w:pPr>
-              <w:rPr>
-                <w:sz w:val="20"/>
-                <w:szCs w:val="20"/>
-                <w:lang w:val="de-DE"/>
-              </w:rPr>
-            </w:pPr>
-            <w:r>
-              <w:rPr>
-                <w:sz w:val="20"/>
-                <w:szCs w:val="20"/>
-              </w:rPr>
-              <w:t xml:space="preserve">14</w:t>
             </w:r>
           </w:p>
         </w:tc>

</xml_diff>

<commit_message>
angebote file for bwt
</commit_message>
<xml_diff>
--- a/out-Materialuebersicht.docx
+++ b/out-Materialuebersicht.docx
@@ -43,7 +43,7 @@
               <w:t>:</w:t>
             </w:r>
             <w:r>
-              <w:t xml:space="preserve"> Frau Kitra Sloan</w:t>
+              <w:t xml:space="preserve"> Frau Lacy Nichols</w:t>
             </w:r>
             <w:proofErr w:type="spellStart"/>
             <w:r>
@@ -72,7 +72,7 @@
               <w:t>:</w:t>
             </w:r>
             <w:r>
-              <w:t xml:space="preserve"> Delectus consectetu, Perferendis labore i Sed magni id exceptu</w:t>
+              <w:t xml:space="preserve"> Voluptates id magni , Quas reprehenderit e Excepteur est ducimu</w:t>
             </w:r>
             <w:proofErr w:type="spellStart"/>
             <w:r>
@@ -113,7 +113,7 @@
               <w:t>:</w:t>
             </w:r>
             <w:r>
-              <w:t xml:space="preserve"> 1989-02-06</w:t>
+              <w:t xml:space="preserve"> 1976-04-03</w:t>
             </w:r>
             <w:proofErr w:type="spellStart"/>
             <w:r>
@@ -142,7 +142,7 @@
               <w:t>:</w:t>
             </w:r>
             <w:r>
-              <w:t xml:space="preserve"> ANG2025-1117-161836</w:t>
+              <w:t xml:space="preserve"> ANG2025-1118-135918</w:t>
             </w:r>
             <w:proofErr w:type="spellStart"/>
             <w:r>
@@ -372,7 +372,7 @@
                 <w:sz w:val="20"/>
                 <w:szCs w:val="20"/>
               </w:rPr>
-              <w:t xml:space="preserve">TODO_BWT_AID_GRAB</w:t>
+              <w:t xml:space="preserve">1226</w:t>
             </w:r>
             <w:proofErr w:type="spellStart"/>
             <w:r>
@@ -409,7 +409,7 @@
                 <w:sz w:val="20"/>
                 <w:szCs w:val="20"/>
               </w:rPr>
-              <w:t xml:space="preserve">TODO_BWT_AID_GRAB</w:t>
+              <w:t xml:space="preserve">Universal / Standard Tür</w:t>
             </w:r>
             <w:proofErr w:type="spellStart"/>
             <w:r>
@@ -446,7 +446,7 @@
                 <w:sz w:val="20"/>
                 <w:szCs w:val="20"/>
               </w:rPr>
-              <w:t xml:space="preserve">2</w:t>
+              <w:t xml:space="preserve">1</w:t>
             </w:r>
             <w:proofErr w:type="spellStart"/>
             <w:r>
@@ -564,7 +564,7 @@
                 <w:sz w:val="20"/>
                 <w:szCs w:val="20"/>
               </w:rPr>
-              <w:t xml:space="preserve">TODO_BWT_DOOR_STD</w:t>
+              <w:t xml:space="preserve">CLPESG40</w:t>
             </w:r>
             <w:proofErr w:type="spellStart"/>
             <w:r>
@@ -601,7 +601,7 @@
                 <w:sz w:val="20"/>
                 <w:szCs w:val="20"/>
               </w:rPr>
-              <w:t xml:space="preserve">TODO_BWT_DOOR_STD</w:t>
+              <w:t xml:space="preserve">Haltegriff clivia plus 32/400mm m. Ros. Edelstahl glatt poliert,VIGOUR</w:t>
             </w:r>
             <w:proofErr w:type="spellStart"/>
             <w:r>
@@ -638,7 +638,7 @@
                 <w:sz w:val="20"/>
                 <w:szCs w:val="20"/>
               </w:rPr>
-              <w:t xml:space="preserve">4</w:t>
+              <w:t xml:space="preserve">1</w:t>
             </w:r>
             <w:proofErr w:type="spellStart"/>
             <w:r>

</xml_diff>

<commit_message>
fix labels for Duschabtrennung
</commit_message>
<xml_diff>
--- a/out-Materialuebersicht.docx
+++ b/out-Materialuebersicht.docx
@@ -43,7 +43,7 @@
               <w:t>:</w:t>
             </w:r>
             <w:r>
-              <w:t xml:space="preserve"> Frau Zeus Lowery</w:t>
+              <w:t xml:space="preserve"> Frau Inga Bruce</w:t>
             </w:r>
             <w:proofErr w:type="spellStart"/>
             <w:r>
@@ -72,7 +72,7 @@
               <w:t>:</w:t>
             </w:r>
             <w:r>
-              <w:t xml:space="preserve"> Aspernatur eveniet , Quibusdam quaerat qu Vitae ratione sint e</w:t>
+              <w:t xml:space="preserve"> Excepteur accusamus , Corrupti aliquip la Eius odit qui ullam </w:t>
             </w:r>
             <w:proofErr w:type="spellStart"/>
             <w:r>
@@ -113,7 +113,7 @@
               <w:t>:</w:t>
             </w:r>
             <w:r>
-              <w:t xml:space="preserve"> 2015-06-08</w:t>
+              <w:t xml:space="preserve"> 1989-05-17</w:t>
             </w:r>
             <w:proofErr w:type="spellStart"/>
             <w:r>
@@ -142,7 +142,7 @@
               <w:t>:</w:t>
             </w:r>
             <w:r>
-              <w:t xml:space="preserve"> ANG2025-1118-163659</w:t>
+              <w:t xml:space="preserve"> ANG2025-1119-095831</w:t>
             </w:r>
             <w:proofErr w:type="spellStart"/>
             <w:r>
@@ -372,7 +372,7 @@
                 <w:sz w:val="20"/>
                 <w:szCs w:val="20"/>
               </w:rPr>
-              <w:t xml:space="preserve">1226</w:t>
+              <w:t xml:space="preserve">1111</w:t>
             </w:r>
             <w:proofErr w:type="spellStart"/>
             <w:r>
@@ -409,7 +409,7 @@
                 <w:sz w:val="20"/>
                 <w:szCs w:val="20"/>
               </w:rPr>
-              <w:t xml:space="preserve">Universal / Standard Tür</w:t>
+              <w:t xml:space="preserve">Pendeltür Hassmann</w:t>
             </w:r>
             <w:proofErr w:type="spellStart"/>
             <w:r>
@@ -446,7 +446,7 @@
                 <w:sz w:val="20"/>
                 <w:szCs w:val="20"/>
               </w:rPr>
-              <w:t xml:space="preserve">1</w:t>
+              <w:t xml:space="preserve">11</w:t>
             </w:r>
             <w:proofErr w:type="spellStart"/>
             <w:r>
@@ -564,7 +564,7 @@
                 <w:sz w:val="20"/>
                 <w:szCs w:val="20"/>
               </w:rPr>
-              <w:t xml:space="preserve">CLPESG40</w:t>
+              <w:t xml:space="preserve">2222</w:t>
             </w:r>
             <w:proofErr w:type="spellStart"/>
             <w:r>
@@ -601,7 +601,1543 @@
                 <w:sz w:val="20"/>
                 <w:szCs w:val="20"/>
               </w:rPr>
-              <w:t xml:space="preserve">Haltegriff clivia plus 32/400mm m. Ros. Edelstahl glatt poliert,VIGOUR</w:t>
+              <w:t xml:space="preserve">Gleittür Hassmann</w:t>
+            </w:r>
+            <w:proofErr w:type="spellStart"/>
+            <w:r>
+              <w:rPr>
+                <w:sz w:val="20"/>
+                <w:szCs w:val="20"/>
+              </w:rPr>
+              <w:t/>
+            </w:r>
+            <w:proofErr w:type="spellEnd"/>
+            <w:r>
+              <w:rPr>
+                <w:sz w:val="20"/>
+                <w:szCs w:val="20"/>
+              </w:rPr>
+              <w:t/>
+            </w:r>
+          </w:p>
+        </w:tc>
+        <w:tc>
+          <w:tcPr>
+            <w:tcW w:w="853" w:type="dxa"/>
+          </w:tcPr>
+          <w:p>
+            <w:pPr>
+              <w:rPr>
+                <w:sz w:val="20"/>
+                <w:szCs w:val="20"/>
+                <w:lang w:val="de-DE"/>
+              </w:rPr>
+            </w:pPr>
+            <w:r>
+              <w:rPr>
+                <w:sz w:val="20"/>
+                <w:szCs w:val="20"/>
+              </w:rPr>
+              <w:t xml:space="preserve">122</w:t>
+            </w:r>
+            <w:proofErr w:type="spellStart"/>
+            <w:r>
+              <w:rPr>
+                <w:sz w:val="20"/>
+                <w:szCs w:val="20"/>
+              </w:rPr>
+              <w:t/>
+            </w:r>
+            <w:proofErr w:type="spellEnd"/>
+            <w:r>
+              <w:rPr>
+                <w:sz w:val="20"/>
+                <w:szCs w:val="20"/>
+              </w:rPr>
+              <w:t/>
+            </w:r>
+          </w:p>
+        </w:tc>
+        <w:tc>
+          <w:tcPr>
+            <w:tcW w:w="878" w:type="dxa"/>
+          </w:tcPr>
+          <w:p>
+            <w:pPr>
+              <w:rPr>
+                <w:sz w:val="20"/>
+                <w:szCs w:val="20"/>
+                <w:lang w:val="de-DE"/>
+              </w:rPr>
+            </w:pPr>
+            <w:r>
+              <w:rPr>
+                <w:sz w:val="20"/>
+                <w:szCs w:val="20"/>
+              </w:rPr>
+              <w:t xml:space="preserve">Stck.</w:t>
+            </w:r>
+          </w:p>
+        </w:tc>
+        <w:tc>
+          <w:tcPr>
+            <w:tcW w:w="1303" w:type="dxa"/>
+          </w:tcPr>
+          <w:p>
+            <w:pPr>
+              <w:rPr>
+                <w:sz w:val="20"/>
+                <w:szCs w:val="20"/>
+                <w:lang w:val="de-DE"/>
+              </w:rPr>
+            </w:pPr>
+            <w:r>
+              <w:rPr>
+                <w:sz w:val="20"/>
+                <w:szCs w:val="20"/>
+              </w:rPr>
+              <w:t/>
+            </w:r>
+            <w:proofErr w:type="spellStart"/>
+            <w:r>
+              <w:rPr>
+                <w:sz w:val="20"/>
+                <w:szCs w:val="20"/>
+              </w:rPr>
+              <w:t/>
+            </w:r>
+            <w:proofErr w:type="spellEnd"/>
+            <w:r>
+              <w:rPr>
+                <w:sz w:val="20"/>
+                <w:szCs w:val="20"/>
+              </w:rPr>
+              <w:t/>
+            </w:r>
+          </w:p>
+        </w:tc>
+      </w:tr>
+      <w:tr>
+        <w:tc>
+          <w:tcPr>
+            <w:tcW w:w="2836" w:type="dxa"/>
+          </w:tcPr>
+          <w:p>
+            <w:pPr>
+              <w:rPr>
+                <w:sz w:val="20"/>
+                <w:szCs w:val="20"/>
+                <w:lang w:val="de-DE"/>
+              </w:rPr>
+            </w:pPr>
+            <w:r>
+              <w:rPr>
+                <w:sz w:val="20"/>
+                <w:szCs w:val="20"/>
+              </w:rPr>
+              <w:t xml:space="preserve">3</w:t>
+            </w:r>
+          </w:p>
+        </w:tc>
+        <w:tc>
+          <w:tcPr>
+            <w:tcW w:w="2041" w:type="dxa"/>
+          </w:tcPr>
+          <w:p>
+            <w:pPr>
+              <w:rPr>
+                <w:sz w:val="20"/>
+                <w:szCs w:val="20"/>
+                <w:lang w:val="de-DE"/>
+              </w:rPr>
+            </w:pPr>
+            <w:r>
+              <w:rPr>
+                <w:sz w:val="20"/>
+                <w:szCs w:val="20"/>
+              </w:rPr>
+              <w:t xml:space="preserve">AGD9060</w:t>
+            </w:r>
+            <w:proofErr w:type="spellStart"/>
+            <w:r>
+              <w:rPr>
+                <w:sz w:val="20"/>
+                <w:szCs w:val="20"/>
+              </w:rPr>
+              <w:t/>
+            </w:r>
+            <w:proofErr w:type="spellEnd"/>
+            <w:r>
+              <w:rPr>
+                <w:sz w:val="20"/>
+                <w:szCs w:val="20"/>
+              </w:rPr>
+              <w:t/>
+            </w:r>
+          </w:p>
+        </w:tc>
+        <w:tc>
+          <w:tcPr>
+            <w:tcW w:w="1440" w:type="dxa"/>
+          </w:tcPr>
+          <w:p>
+            <w:pPr>
+              <w:rPr>
+                <w:sz w:val="20"/>
+                <w:szCs w:val="20"/>
+                <w:lang w:val="de-DE"/>
+              </w:rPr>
+            </w:pPr>
+            <w:r>
+              <w:rPr>
+                <w:sz w:val="20"/>
+                <w:szCs w:val="20"/>
+              </w:rPr>
+              <w:t xml:space="preserve">Ablaufgarnitur Rohbauset m.Sifon BH60mm f.flache Duschw.m.90mm Ablauf TRINNITY</w:t>
+            </w:r>
+            <w:proofErr w:type="spellStart"/>
+            <w:r>
+              <w:rPr>
+                <w:sz w:val="20"/>
+                <w:szCs w:val="20"/>
+              </w:rPr>
+              <w:t/>
+            </w:r>
+            <w:proofErr w:type="spellEnd"/>
+            <w:r>
+              <w:rPr>
+                <w:sz w:val="20"/>
+                <w:szCs w:val="20"/>
+              </w:rPr>
+              <w:t/>
+            </w:r>
+          </w:p>
+        </w:tc>
+        <w:tc>
+          <w:tcPr>
+            <w:tcW w:w="853" w:type="dxa"/>
+          </w:tcPr>
+          <w:p>
+            <w:pPr>
+              <w:rPr>
+                <w:sz w:val="20"/>
+                <w:szCs w:val="20"/>
+                <w:lang w:val="de-DE"/>
+              </w:rPr>
+            </w:pPr>
+            <w:r>
+              <w:rPr>
+                <w:sz w:val="20"/>
+                <w:szCs w:val="20"/>
+              </w:rPr>
+              <w:t xml:space="preserve">1</w:t>
+            </w:r>
+            <w:proofErr w:type="spellStart"/>
+            <w:r>
+              <w:rPr>
+                <w:sz w:val="20"/>
+                <w:szCs w:val="20"/>
+              </w:rPr>
+              <w:t/>
+            </w:r>
+            <w:proofErr w:type="spellEnd"/>
+            <w:r>
+              <w:rPr>
+                <w:sz w:val="20"/>
+                <w:szCs w:val="20"/>
+              </w:rPr>
+              <w:t/>
+            </w:r>
+          </w:p>
+        </w:tc>
+        <w:tc>
+          <w:tcPr>
+            <w:tcW w:w="878" w:type="dxa"/>
+          </w:tcPr>
+          <w:p>
+            <w:pPr>
+              <w:rPr>
+                <w:sz w:val="20"/>
+                <w:szCs w:val="20"/>
+                <w:lang w:val="de-DE"/>
+              </w:rPr>
+            </w:pPr>
+            <w:r>
+              <w:rPr>
+                <w:sz w:val="20"/>
+                <w:szCs w:val="20"/>
+              </w:rPr>
+              <w:t xml:space="preserve">Stck.</w:t>
+            </w:r>
+          </w:p>
+        </w:tc>
+        <w:tc>
+          <w:tcPr>
+            <w:tcW w:w="1303" w:type="dxa"/>
+          </w:tcPr>
+          <w:p>
+            <w:pPr>
+              <w:rPr>
+                <w:sz w:val="20"/>
+                <w:szCs w:val="20"/>
+                <w:lang w:val="de-DE"/>
+              </w:rPr>
+            </w:pPr>
+            <w:r>
+              <w:rPr>
+                <w:sz w:val="20"/>
+                <w:szCs w:val="20"/>
+              </w:rPr>
+              <w:t/>
+            </w:r>
+            <w:proofErr w:type="spellStart"/>
+            <w:r>
+              <w:rPr>
+                <w:sz w:val="20"/>
+                <w:szCs w:val="20"/>
+              </w:rPr>
+              <w:t/>
+            </w:r>
+            <w:proofErr w:type="spellEnd"/>
+            <w:r>
+              <w:rPr>
+                <w:sz w:val="20"/>
+                <w:szCs w:val="20"/>
+              </w:rPr>
+              <w:t/>
+            </w:r>
+          </w:p>
+        </w:tc>
+      </w:tr>
+      <w:tr>
+        <w:tc>
+          <w:tcPr>
+            <w:tcW w:w="2836" w:type="dxa"/>
+          </w:tcPr>
+          <w:p>
+            <w:pPr>
+              <w:rPr>
+                <w:sz w:val="20"/>
+                <w:szCs w:val="20"/>
+                <w:lang w:val="de-DE"/>
+              </w:rPr>
+            </w:pPr>
+            <w:r>
+              <w:rPr>
+                <w:sz w:val="20"/>
+                <w:szCs w:val="20"/>
+              </w:rPr>
+              <w:t xml:space="preserve">4</w:t>
+            </w:r>
+          </w:p>
+        </w:tc>
+        <w:tc>
+          <w:tcPr>
+            <w:tcW w:w="2041" w:type="dxa"/>
+          </w:tcPr>
+          <w:p>
+            <w:pPr>
+              <w:rPr>
+                <w:sz w:val="20"/>
+                <w:szCs w:val="20"/>
+                <w:lang w:val="de-DE"/>
+              </w:rPr>
+            </w:pPr>
+            <w:r>
+              <w:rPr>
+                <w:sz w:val="20"/>
+                <w:szCs w:val="20"/>
+              </w:rPr>
+              <w:t xml:space="preserve">CARESSW</w:t>
+            </w:r>
+            <w:proofErr w:type="spellStart"/>
+            <w:r>
+              <w:rPr>
+                <w:sz w:val="20"/>
+                <w:szCs w:val="20"/>
+              </w:rPr>
+              <w:t/>
+            </w:r>
+            <w:proofErr w:type="spellEnd"/>
+            <w:r>
+              <w:rPr>
+                <w:sz w:val="20"/>
+                <w:szCs w:val="20"/>
+              </w:rPr>
+              <w:t/>
+            </w:r>
+          </w:p>
+        </w:tc>
+        <w:tc>
+          <w:tcPr>
+            <w:tcW w:w="1440" w:type="dxa"/>
+          </w:tcPr>
+          <w:p>
+            <w:pPr>
+              <w:rPr>
+                <w:sz w:val="20"/>
+                <w:szCs w:val="20"/>
+                <w:lang w:val="de-DE"/>
+              </w:rPr>
+            </w:pPr>
+            <w:r>
+              <w:rPr>
+                <w:sz w:val="20"/>
+                <w:szCs w:val="20"/>
+              </w:rPr>
+              <w:t xml:space="preserve">CARE Sanitär Silikon Weiß 310ml</w:t>
+            </w:r>
+            <w:proofErr w:type="spellStart"/>
+            <w:r>
+              <w:rPr>
+                <w:sz w:val="20"/>
+                <w:szCs w:val="20"/>
+              </w:rPr>
+              <w:t/>
+            </w:r>
+            <w:proofErr w:type="spellEnd"/>
+            <w:r>
+              <w:rPr>
+                <w:sz w:val="20"/>
+                <w:szCs w:val="20"/>
+              </w:rPr>
+              <w:t/>
+            </w:r>
+          </w:p>
+        </w:tc>
+        <w:tc>
+          <w:tcPr>
+            <w:tcW w:w="853" w:type="dxa"/>
+          </w:tcPr>
+          <w:p>
+            <w:pPr>
+              <w:rPr>
+                <w:sz w:val="20"/>
+                <w:szCs w:val="20"/>
+                <w:lang w:val="de-DE"/>
+              </w:rPr>
+            </w:pPr>
+            <w:r>
+              <w:rPr>
+                <w:sz w:val="20"/>
+                <w:szCs w:val="20"/>
+              </w:rPr>
+              <w:t xml:space="preserve">1</w:t>
+            </w:r>
+            <w:proofErr w:type="spellStart"/>
+            <w:r>
+              <w:rPr>
+                <w:sz w:val="20"/>
+                <w:szCs w:val="20"/>
+              </w:rPr>
+              <w:t/>
+            </w:r>
+            <w:proofErr w:type="spellEnd"/>
+            <w:r>
+              <w:rPr>
+                <w:sz w:val="20"/>
+                <w:szCs w:val="20"/>
+              </w:rPr>
+              <w:t/>
+            </w:r>
+          </w:p>
+        </w:tc>
+        <w:tc>
+          <w:tcPr>
+            <w:tcW w:w="878" w:type="dxa"/>
+          </w:tcPr>
+          <w:p>
+            <w:pPr>
+              <w:rPr>
+                <w:sz w:val="20"/>
+                <w:szCs w:val="20"/>
+                <w:lang w:val="de-DE"/>
+              </w:rPr>
+            </w:pPr>
+            <w:r>
+              <w:rPr>
+                <w:sz w:val="20"/>
+                <w:szCs w:val="20"/>
+              </w:rPr>
+              <w:t xml:space="preserve">Stck.</w:t>
+            </w:r>
+          </w:p>
+        </w:tc>
+        <w:tc>
+          <w:tcPr>
+            <w:tcW w:w="1303" w:type="dxa"/>
+          </w:tcPr>
+          <w:p>
+            <w:pPr>
+              <w:rPr>
+                <w:sz w:val="20"/>
+                <w:szCs w:val="20"/>
+                <w:lang w:val="de-DE"/>
+              </w:rPr>
+            </w:pPr>
+            <w:r>
+              <w:rPr>
+                <w:sz w:val="20"/>
+                <w:szCs w:val="20"/>
+              </w:rPr>
+              <w:t/>
+            </w:r>
+            <w:proofErr w:type="spellStart"/>
+            <w:r>
+              <w:rPr>
+                <w:sz w:val="20"/>
+                <w:szCs w:val="20"/>
+              </w:rPr>
+              <w:t/>
+            </w:r>
+            <w:proofErr w:type="spellEnd"/>
+            <w:r>
+              <w:rPr>
+                <w:sz w:val="20"/>
+                <w:szCs w:val="20"/>
+              </w:rPr>
+              <w:t/>
+            </w:r>
+          </w:p>
+        </w:tc>
+      </w:tr>
+      <w:tr>
+        <w:tc>
+          <w:tcPr>
+            <w:tcW w:w="2836" w:type="dxa"/>
+          </w:tcPr>
+          <w:p>
+            <w:pPr>
+              <w:rPr>
+                <w:sz w:val="20"/>
+                <w:szCs w:val="20"/>
+                <w:lang w:val="de-DE"/>
+              </w:rPr>
+            </w:pPr>
+            <w:r>
+              <w:rPr>
+                <w:sz w:val="20"/>
+                <w:szCs w:val="20"/>
+              </w:rPr>
+              <w:t xml:space="preserve">5</w:t>
+            </w:r>
+          </w:p>
+        </w:tc>
+        <w:tc>
+          <w:tcPr>
+            <w:tcW w:w="2041" w:type="dxa"/>
+          </w:tcPr>
+          <w:p>
+            <w:pPr>
+              <w:rPr>
+                <w:sz w:val="20"/>
+                <w:szCs w:val="20"/>
+                <w:lang w:val="de-DE"/>
+              </w:rPr>
+            </w:pPr>
+            <w:r>
+              <w:rPr>
+                <w:sz w:val="20"/>
+                <w:szCs w:val="20"/>
+              </w:rPr>
+              <w:t xml:space="preserve">KM02</w:t>
+            </w:r>
+            <w:proofErr w:type="spellStart"/>
+            <w:r>
+              <w:rPr>
+                <w:sz w:val="20"/>
+                <w:szCs w:val="20"/>
+              </w:rPr>
+              <w:t/>
+            </w:r>
+            <w:proofErr w:type="spellEnd"/>
+            <w:r>
+              <w:rPr>
+                <w:sz w:val="20"/>
+                <w:szCs w:val="20"/>
+              </w:rPr>
+              <w:t/>
+            </w:r>
+          </w:p>
+        </w:tc>
+        <w:tc>
+          <w:tcPr>
+            <w:tcW w:w="1440" w:type="dxa"/>
+          </w:tcPr>
+          <w:p>
+            <w:pPr>
+              <w:rPr>
+                <w:sz w:val="20"/>
+                <w:szCs w:val="20"/>
+                <w:lang w:val="de-DE"/>
+              </w:rPr>
+            </w:pPr>
+            <w:r>
+              <w:rPr>
+                <w:sz w:val="20"/>
+                <w:szCs w:val="20"/>
+              </w:rPr>
+              <w:t xml:space="preserve">Kleinmaterial</w:t>
+            </w:r>
+            <w:proofErr w:type="spellStart"/>
+            <w:r>
+              <w:rPr>
+                <w:sz w:val="20"/>
+                <w:szCs w:val="20"/>
+              </w:rPr>
+              <w:t/>
+            </w:r>
+            <w:proofErr w:type="spellEnd"/>
+            <w:r>
+              <w:rPr>
+                <w:sz w:val="20"/>
+                <w:szCs w:val="20"/>
+              </w:rPr>
+              <w:t/>
+            </w:r>
+          </w:p>
+        </w:tc>
+        <w:tc>
+          <w:tcPr>
+            <w:tcW w:w="853" w:type="dxa"/>
+          </w:tcPr>
+          <w:p>
+            <w:pPr>
+              <w:rPr>
+                <w:sz w:val="20"/>
+                <w:szCs w:val="20"/>
+                <w:lang w:val="de-DE"/>
+              </w:rPr>
+            </w:pPr>
+            <w:r>
+              <w:rPr>
+                <w:sz w:val="20"/>
+                <w:szCs w:val="20"/>
+              </w:rPr>
+              <w:t xml:space="preserve">1</w:t>
+            </w:r>
+            <w:proofErr w:type="spellStart"/>
+            <w:r>
+              <w:rPr>
+                <w:sz w:val="20"/>
+                <w:szCs w:val="20"/>
+              </w:rPr>
+              <w:t/>
+            </w:r>
+            <w:proofErr w:type="spellEnd"/>
+            <w:r>
+              <w:rPr>
+                <w:sz w:val="20"/>
+                <w:szCs w:val="20"/>
+              </w:rPr>
+              <w:t/>
+            </w:r>
+          </w:p>
+        </w:tc>
+        <w:tc>
+          <w:tcPr>
+            <w:tcW w:w="878" w:type="dxa"/>
+          </w:tcPr>
+          <w:p>
+            <w:pPr>
+              <w:rPr>
+                <w:sz w:val="20"/>
+                <w:szCs w:val="20"/>
+                <w:lang w:val="de-DE"/>
+              </w:rPr>
+            </w:pPr>
+            <w:r>
+              <w:rPr>
+                <w:sz w:val="20"/>
+                <w:szCs w:val="20"/>
+              </w:rPr>
+              <w:t xml:space="preserve">Stck.</w:t>
+            </w:r>
+          </w:p>
+        </w:tc>
+        <w:tc>
+          <w:tcPr>
+            <w:tcW w:w="1303" w:type="dxa"/>
+          </w:tcPr>
+          <w:p>
+            <w:pPr>
+              <w:rPr>
+                <w:sz w:val="20"/>
+                <w:szCs w:val="20"/>
+                <w:lang w:val="de-DE"/>
+              </w:rPr>
+            </w:pPr>
+            <w:r>
+              <w:rPr>
+                <w:sz w:val="20"/>
+                <w:szCs w:val="20"/>
+              </w:rPr>
+              <w:t/>
+            </w:r>
+            <w:proofErr w:type="spellStart"/>
+            <w:r>
+              <w:rPr>
+                <w:sz w:val="20"/>
+                <w:szCs w:val="20"/>
+              </w:rPr>
+              <w:t/>
+            </w:r>
+            <w:proofErr w:type="spellEnd"/>
+            <w:r>
+              <w:rPr>
+                <w:sz w:val="20"/>
+                <w:szCs w:val="20"/>
+              </w:rPr>
+              <w:t/>
+            </w:r>
+          </w:p>
+        </w:tc>
+      </w:tr>
+      <w:tr>
+        <w:tc>
+          <w:tcPr>
+            <w:tcW w:w="2836" w:type="dxa"/>
+          </w:tcPr>
+          <w:p>
+            <w:pPr>
+              <w:rPr>
+                <w:sz w:val="20"/>
+                <w:szCs w:val="20"/>
+                <w:lang w:val="de-DE"/>
+              </w:rPr>
+            </w:pPr>
+            <w:r>
+              <w:rPr>
+                <w:sz w:val="20"/>
+                <w:szCs w:val="20"/>
+              </w:rPr>
+              <w:t xml:space="preserve">6</w:t>
+            </w:r>
+          </w:p>
+        </w:tc>
+        <w:tc>
+          <w:tcPr>
+            <w:tcW w:w="2041" w:type="dxa"/>
+          </w:tcPr>
+          <w:p>
+            <w:pPr>
+              <w:rPr>
+                <w:sz w:val="20"/>
+                <w:szCs w:val="20"/>
+                <w:lang w:val="de-DE"/>
+              </w:rPr>
+            </w:pPr>
+            <w:r>
+              <w:rPr>
+                <w:sz w:val="20"/>
+                <w:szCs w:val="20"/>
+              </w:rPr>
+              <w:t xml:space="preserve">STELZ</w:t>
+            </w:r>
+            <w:proofErr w:type="spellStart"/>
+            <w:r>
+              <w:rPr>
+                <w:sz w:val="20"/>
+                <w:szCs w:val="20"/>
+              </w:rPr>
+              <w:t/>
+            </w:r>
+            <w:proofErr w:type="spellEnd"/>
+            <w:r>
+              <w:rPr>
+                <w:sz w:val="20"/>
+                <w:szCs w:val="20"/>
+              </w:rPr>
+              <w:t/>
+            </w:r>
+          </w:p>
+        </w:tc>
+        <w:tc>
+          <w:tcPr>
+            <w:tcW w:w="1440" w:type="dxa"/>
+          </w:tcPr>
+          <w:p>
+            <w:pPr>
+              <w:rPr>
+                <w:sz w:val="20"/>
+                <w:szCs w:val="20"/>
+                <w:lang w:val="de-DE"/>
+              </w:rPr>
+            </w:pPr>
+            <w:r>
+              <w:rPr>
+                <w:sz w:val="20"/>
+                <w:szCs w:val="20"/>
+              </w:rPr>
+              <w:t xml:space="preserve">Stelzlager höhenverstellar Set</w:t>
+            </w:r>
+            <w:proofErr w:type="spellStart"/>
+            <w:r>
+              <w:rPr>
+                <w:sz w:val="20"/>
+                <w:szCs w:val="20"/>
+              </w:rPr>
+              <w:t/>
+            </w:r>
+            <w:proofErr w:type="spellEnd"/>
+            <w:r>
+              <w:rPr>
+                <w:sz w:val="20"/>
+                <w:szCs w:val="20"/>
+              </w:rPr>
+              <w:t/>
+            </w:r>
+          </w:p>
+        </w:tc>
+        <w:tc>
+          <w:tcPr>
+            <w:tcW w:w="853" w:type="dxa"/>
+          </w:tcPr>
+          <w:p>
+            <w:pPr>
+              <w:rPr>
+                <w:sz w:val="20"/>
+                <w:szCs w:val="20"/>
+                <w:lang w:val="de-DE"/>
+              </w:rPr>
+            </w:pPr>
+            <w:r>
+              <w:rPr>
+                <w:sz w:val="20"/>
+                <w:szCs w:val="20"/>
+              </w:rPr>
+              <w:t xml:space="preserve">1</w:t>
+            </w:r>
+            <w:proofErr w:type="spellStart"/>
+            <w:r>
+              <w:rPr>
+                <w:sz w:val="20"/>
+                <w:szCs w:val="20"/>
+              </w:rPr>
+              <w:t/>
+            </w:r>
+            <w:proofErr w:type="spellEnd"/>
+            <w:r>
+              <w:rPr>
+                <w:sz w:val="20"/>
+                <w:szCs w:val="20"/>
+              </w:rPr>
+              <w:t/>
+            </w:r>
+          </w:p>
+        </w:tc>
+        <w:tc>
+          <w:tcPr>
+            <w:tcW w:w="878" w:type="dxa"/>
+          </w:tcPr>
+          <w:p>
+            <w:pPr>
+              <w:rPr>
+                <w:sz w:val="20"/>
+                <w:szCs w:val="20"/>
+                <w:lang w:val="de-DE"/>
+              </w:rPr>
+            </w:pPr>
+            <w:r>
+              <w:rPr>
+                <w:sz w:val="20"/>
+                <w:szCs w:val="20"/>
+              </w:rPr>
+              <w:t xml:space="preserve">Stck.</w:t>
+            </w:r>
+          </w:p>
+        </w:tc>
+        <w:tc>
+          <w:tcPr>
+            <w:tcW w:w="1303" w:type="dxa"/>
+          </w:tcPr>
+          <w:p>
+            <w:pPr>
+              <w:rPr>
+                <w:sz w:val="20"/>
+                <w:szCs w:val="20"/>
+                <w:lang w:val="de-DE"/>
+              </w:rPr>
+            </w:pPr>
+            <w:r>
+              <w:rPr>
+                <w:sz w:val="20"/>
+                <w:szCs w:val="20"/>
+              </w:rPr>
+              <w:t/>
+            </w:r>
+            <w:proofErr w:type="spellStart"/>
+            <w:r>
+              <w:rPr>
+                <w:sz w:val="20"/>
+                <w:szCs w:val="20"/>
+              </w:rPr>
+              <w:t/>
+            </w:r>
+            <w:proofErr w:type="spellEnd"/>
+            <w:r>
+              <w:rPr>
+                <w:sz w:val="20"/>
+                <w:szCs w:val="20"/>
+              </w:rPr>
+              <w:t/>
+            </w:r>
+          </w:p>
+        </w:tc>
+      </w:tr>
+      <w:tr>
+        <w:tc>
+          <w:tcPr>
+            <w:tcW w:w="2836" w:type="dxa"/>
+          </w:tcPr>
+          <w:p>
+            <w:pPr>
+              <w:rPr>
+                <w:sz w:val="20"/>
+                <w:szCs w:val="20"/>
+                <w:lang w:val="de-DE"/>
+              </w:rPr>
+            </w:pPr>
+            <w:r>
+              <w:rPr>
+                <w:sz w:val="20"/>
+                <w:szCs w:val="20"/>
+              </w:rPr>
+              <w:t xml:space="preserve">7</w:t>
+            </w:r>
+          </w:p>
+        </w:tc>
+        <w:tc>
+          <w:tcPr>
+            <w:tcW w:w="2041" w:type="dxa"/>
+          </w:tcPr>
+          <w:p>
+            <w:pPr>
+              <w:rPr>
+                <w:sz w:val="20"/>
+                <w:szCs w:val="20"/>
+                <w:lang w:val="de-DE"/>
+              </w:rPr>
+            </w:pPr>
+            <w:r>
+              <w:rPr>
+                <w:sz w:val="20"/>
+                <w:szCs w:val="20"/>
+              </w:rPr>
+              <w:t xml:space="preserve">TRWDB</w:t>
+            </w:r>
+            <w:proofErr w:type="spellStart"/>
+            <w:r>
+              <w:rPr>
+                <w:sz w:val="20"/>
+                <w:szCs w:val="20"/>
+              </w:rPr>
+              <w:t/>
+            </w:r>
+            <w:proofErr w:type="spellEnd"/>
+            <w:r>
+              <w:rPr>
+                <w:sz w:val="20"/>
+                <w:szCs w:val="20"/>
+              </w:rPr>
+              <w:t/>
+            </w:r>
+          </w:p>
+        </w:tc>
+        <w:tc>
+          <w:tcPr>
+            <w:tcW w:w="1440" w:type="dxa"/>
+          </w:tcPr>
+          <w:p>
+            <w:pPr>
+              <w:rPr>
+                <w:sz w:val="20"/>
+                <w:szCs w:val="20"/>
+                <w:lang w:val="de-DE"/>
+              </w:rPr>
+            </w:pPr>
+            <w:r>
+              <w:rPr>
+                <w:sz w:val="20"/>
+                <w:szCs w:val="20"/>
+              </w:rPr>
+              <w:t xml:space="preserve">TRINNITY Wannenabdichtband-Set 3,4 m Nass-/Trockenanbindung entspr. DIN 18534</w:t>
+            </w:r>
+            <w:proofErr w:type="spellStart"/>
+            <w:r>
+              <w:rPr>
+                <w:sz w:val="20"/>
+                <w:szCs w:val="20"/>
+              </w:rPr>
+              <w:t/>
+            </w:r>
+            <w:proofErr w:type="spellEnd"/>
+            <w:r>
+              <w:rPr>
+                <w:sz w:val="20"/>
+                <w:szCs w:val="20"/>
+              </w:rPr>
+              <w:t/>
+            </w:r>
+          </w:p>
+        </w:tc>
+        <w:tc>
+          <w:tcPr>
+            <w:tcW w:w="853" w:type="dxa"/>
+          </w:tcPr>
+          <w:p>
+            <w:pPr>
+              <w:rPr>
+                <w:sz w:val="20"/>
+                <w:szCs w:val="20"/>
+                <w:lang w:val="de-DE"/>
+              </w:rPr>
+            </w:pPr>
+            <w:r>
+              <w:rPr>
+                <w:sz w:val="20"/>
+                <w:szCs w:val="20"/>
+              </w:rPr>
+              <w:t xml:space="preserve">1</w:t>
+            </w:r>
+            <w:proofErr w:type="spellStart"/>
+            <w:r>
+              <w:rPr>
+                <w:sz w:val="20"/>
+                <w:szCs w:val="20"/>
+              </w:rPr>
+              <w:t/>
+            </w:r>
+            <w:proofErr w:type="spellEnd"/>
+            <w:r>
+              <w:rPr>
+                <w:sz w:val="20"/>
+                <w:szCs w:val="20"/>
+              </w:rPr>
+              <w:t/>
+            </w:r>
+          </w:p>
+        </w:tc>
+        <w:tc>
+          <w:tcPr>
+            <w:tcW w:w="878" w:type="dxa"/>
+          </w:tcPr>
+          <w:p>
+            <w:pPr>
+              <w:rPr>
+                <w:sz w:val="20"/>
+                <w:szCs w:val="20"/>
+                <w:lang w:val="de-DE"/>
+              </w:rPr>
+            </w:pPr>
+            <w:r>
+              <w:rPr>
+                <w:sz w:val="20"/>
+                <w:szCs w:val="20"/>
+              </w:rPr>
+              <w:t xml:space="preserve">Stck.</w:t>
+            </w:r>
+          </w:p>
+        </w:tc>
+        <w:tc>
+          <w:tcPr>
+            <w:tcW w:w="1303" w:type="dxa"/>
+          </w:tcPr>
+          <w:p>
+            <w:pPr>
+              <w:rPr>
+                <w:sz w:val="20"/>
+                <w:szCs w:val="20"/>
+                <w:lang w:val="de-DE"/>
+              </w:rPr>
+            </w:pPr>
+            <w:r>
+              <w:rPr>
+                <w:sz w:val="20"/>
+                <w:szCs w:val="20"/>
+              </w:rPr>
+              <w:t/>
+            </w:r>
+            <w:proofErr w:type="spellStart"/>
+            <w:r>
+              <w:rPr>
+                <w:sz w:val="20"/>
+                <w:szCs w:val="20"/>
+              </w:rPr>
+              <w:t/>
+            </w:r>
+            <w:proofErr w:type="spellEnd"/>
+            <w:r>
+              <w:rPr>
+                <w:sz w:val="20"/>
+                <w:szCs w:val="20"/>
+              </w:rPr>
+              <w:t/>
+            </w:r>
+          </w:p>
+        </w:tc>
+      </w:tr>
+      <w:tr>
+        <w:tc>
+          <w:tcPr>
+            <w:tcW w:w="2836" w:type="dxa"/>
+          </w:tcPr>
+          <w:p>
+            <w:pPr>
+              <w:rPr>
+                <w:sz w:val="20"/>
+                <w:szCs w:val="20"/>
+                <w:lang w:val="de-DE"/>
+              </w:rPr>
+            </w:pPr>
+            <w:r>
+              <w:rPr>
+                <w:sz w:val="20"/>
+                <w:szCs w:val="20"/>
+              </w:rPr>
+              <w:t xml:space="preserve">8</w:t>
+            </w:r>
+          </w:p>
+        </w:tc>
+        <w:tc>
+          <w:tcPr>
+            <w:tcW w:w="2041" w:type="dxa"/>
+          </w:tcPr>
+          <w:p>
+            <w:pPr>
+              <w:rPr>
+                <w:sz w:val="20"/>
+                <w:szCs w:val="20"/>
+                <w:lang w:val="de-DE"/>
+              </w:rPr>
+            </w:pPr>
+            <w:r>
+              <w:rPr>
+                <w:sz w:val="20"/>
+                <w:szCs w:val="20"/>
+              </w:rPr>
+              <w:t xml:space="preserve">TRWDSET5</w:t>
+            </w:r>
+            <w:proofErr w:type="spellStart"/>
+            <w:r>
+              <w:rPr>
+                <w:sz w:val="20"/>
+                <w:szCs w:val="20"/>
+              </w:rPr>
+              <w:t/>
+            </w:r>
+            <w:proofErr w:type="spellEnd"/>
+            <w:r>
+              <w:rPr>
+                <w:sz w:val="20"/>
+                <w:szCs w:val="20"/>
+              </w:rPr>
+              <w:t/>
+            </w:r>
+          </w:p>
+        </w:tc>
+        <w:tc>
+          <w:tcPr>
+            <w:tcW w:w="1440" w:type="dxa"/>
+          </w:tcPr>
+          <w:p>
+            <w:pPr>
+              <w:rPr>
+                <w:sz w:val="20"/>
+                <w:szCs w:val="20"/>
+                <w:lang w:val="de-DE"/>
+              </w:rPr>
+            </w:pPr>
+            <w:r>
+              <w:rPr>
+                <w:sz w:val="20"/>
+                <w:szCs w:val="20"/>
+              </w:rPr>
+              <w:t xml:space="preserve">TRINNITY Wandabdichtung BASIS-Set 5 qm DW bis 100 x 100 / BW bis 180 x 80 cm</w:t>
+            </w:r>
+            <w:proofErr w:type="spellStart"/>
+            <w:r>
+              <w:rPr>
+                <w:sz w:val="20"/>
+                <w:szCs w:val="20"/>
+              </w:rPr>
+              <w:t/>
+            </w:r>
+            <w:proofErr w:type="spellEnd"/>
+            <w:r>
+              <w:rPr>
+                <w:sz w:val="20"/>
+                <w:szCs w:val="20"/>
+              </w:rPr>
+              <w:t/>
+            </w:r>
+          </w:p>
+        </w:tc>
+        <w:tc>
+          <w:tcPr>
+            <w:tcW w:w="853" w:type="dxa"/>
+          </w:tcPr>
+          <w:p>
+            <w:pPr>
+              <w:rPr>
+                <w:sz w:val="20"/>
+                <w:szCs w:val="20"/>
+                <w:lang w:val="de-DE"/>
+              </w:rPr>
+            </w:pPr>
+            <w:r>
+              <w:rPr>
+                <w:sz w:val="20"/>
+                <w:szCs w:val="20"/>
+              </w:rPr>
+              <w:t xml:space="preserve">1</w:t>
+            </w:r>
+            <w:proofErr w:type="spellStart"/>
+            <w:r>
+              <w:rPr>
+                <w:sz w:val="20"/>
+                <w:szCs w:val="20"/>
+              </w:rPr>
+              <w:t/>
+            </w:r>
+            <w:proofErr w:type="spellEnd"/>
+            <w:r>
+              <w:rPr>
+                <w:sz w:val="20"/>
+                <w:szCs w:val="20"/>
+              </w:rPr>
+              <w:t/>
+            </w:r>
+          </w:p>
+        </w:tc>
+        <w:tc>
+          <w:tcPr>
+            <w:tcW w:w="878" w:type="dxa"/>
+          </w:tcPr>
+          <w:p>
+            <w:pPr>
+              <w:rPr>
+                <w:sz w:val="20"/>
+                <w:szCs w:val="20"/>
+                <w:lang w:val="de-DE"/>
+              </w:rPr>
+            </w:pPr>
+            <w:r>
+              <w:rPr>
+                <w:sz w:val="20"/>
+                <w:szCs w:val="20"/>
+              </w:rPr>
+              <w:t xml:space="preserve">Stck.</w:t>
+            </w:r>
+          </w:p>
+        </w:tc>
+        <w:tc>
+          <w:tcPr>
+            <w:tcW w:w="1303" w:type="dxa"/>
+          </w:tcPr>
+          <w:p>
+            <w:pPr>
+              <w:rPr>
+                <w:sz w:val="20"/>
+                <w:szCs w:val="20"/>
+                <w:lang w:val="de-DE"/>
+              </w:rPr>
+            </w:pPr>
+            <w:r>
+              <w:rPr>
+                <w:sz w:val="20"/>
+                <w:szCs w:val="20"/>
+              </w:rPr>
+              <w:t/>
+            </w:r>
+            <w:proofErr w:type="spellStart"/>
+            <w:r>
+              <w:rPr>
+                <w:sz w:val="20"/>
+                <w:szCs w:val="20"/>
+              </w:rPr>
+              <w:t/>
+            </w:r>
+            <w:proofErr w:type="spellEnd"/>
+            <w:r>
+              <w:rPr>
+                <w:sz w:val="20"/>
+                <w:szCs w:val="20"/>
+              </w:rPr>
+              <w:t/>
+            </w:r>
+          </w:p>
+        </w:tc>
+      </w:tr>
+      <w:tr>
+        <w:tc>
+          <w:tcPr>
+            <w:tcW w:w="2836" w:type="dxa"/>
+          </w:tcPr>
+          <w:p>
+            <w:pPr>
+              <w:rPr>
+                <w:sz w:val="20"/>
+                <w:szCs w:val="20"/>
+                <w:lang w:val="de-DE"/>
+              </w:rPr>
+            </w:pPr>
+            <w:r>
+              <w:rPr>
+                <w:sz w:val="20"/>
+                <w:szCs w:val="20"/>
+              </w:rPr>
+              <w:t xml:space="preserve">9</w:t>
+            </w:r>
+          </w:p>
+        </w:tc>
+        <w:tc>
+          <w:tcPr>
+            <w:tcW w:w="2041" w:type="dxa"/>
+          </w:tcPr>
+          <w:p>
+            <w:pPr>
+              <w:rPr>
+                <w:sz w:val="20"/>
+                <w:szCs w:val="20"/>
+                <w:lang w:val="de-DE"/>
+              </w:rPr>
+            </w:pPr>
+            <w:r>
+              <w:rPr>
+                <w:sz w:val="20"/>
+                <w:szCs w:val="20"/>
+              </w:rPr>
+              <w:t xml:space="preserve">V3A</w:t>
+            </w:r>
+            <w:proofErr w:type="spellStart"/>
+            <w:r>
+              <w:rPr>
+                <w:sz w:val="20"/>
+                <w:szCs w:val="20"/>
+              </w:rPr>
+              <w:t/>
+            </w:r>
+            <w:proofErr w:type="spellEnd"/>
+            <w:r>
+              <w:rPr>
+                <w:sz w:val="20"/>
+                <w:szCs w:val="20"/>
+              </w:rPr>
+              <w:t/>
+            </w:r>
+          </w:p>
+        </w:tc>
+        <w:tc>
+          <w:tcPr>
+            <w:tcW w:w="1440" w:type="dxa"/>
+          </w:tcPr>
+          <w:p>
+            <w:pPr>
+              <w:rPr>
+                <w:sz w:val="20"/>
+                <w:szCs w:val="20"/>
+                <w:lang w:val="de-DE"/>
+              </w:rPr>
+            </w:pPr>
+            <w:r>
+              <w:rPr>
+                <w:sz w:val="20"/>
+                <w:szCs w:val="20"/>
+              </w:rPr>
+              <w:t xml:space="preserve">Abschlussprofil 3.0 255 cm silber eloxiert VIGOUR</w:t>
+            </w:r>
+            <w:proofErr w:type="spellStart"/>
+            <w:r>
+              <w:rPr>
+                <w:sz w:val="20"/>
+                <w:szCs w:val="20"/>
+              </w:rPr>
+              <w:t/>
+            </w:r>
+            <w:proofErr w:type="spellEnd"/>
+            <w:r>
+              <w:rPr>
+                <w:sz w:val="20"/>
+                <w:szCs w:val="20"/>
+              </w:rPr>
+              <w:t/>
+            </w:r>
+          </w:p>
+        </w:tc>
+        <w:tc>
+          <w:tcPr>
+            <w:tcW w:w="853" w:type="dxa"/>
+          </w:tcPr>
+          <w:p>
+            <w:pPr>
+              <w:rPr>
+                <w:sz w:val="20"/>
+                <w:szCs w:val="20"/>
+                <w:lang w:val="de-DE"/>
+              </w:rPr>
+            </w:pPr>
+            <w:r>
+              <w:rPr>
+                <w:sz w:val="20"/>
+                <w:szCs w:val="20"/>
+              </w:rPr>
+              <w:t xml:space="preserve">1</w:t>
+            </w:r>
+            <w:proofErr w:type="spellStart"/>
+            <w:r>
+              <w:rPr>
+                <w:sz w:val="20"/>
+                <w:szCs w:val="20"/>
+              </w:rPr>
+              <w:t/>
+            </w:r>
+            <w:proofErr w:type="spellEnd"/>
+            <w:r>
+              <w:rPr>
+                <w:sz w:val="20"/>
+                <w:szCs w:val="20"/>
+              </w:rPr>
+              <w:t/>
+            </w:r>
+          </w:p>
+        </w:tc>
+        <w:tc>
+          <w:tcPr>
+            <w:tcW w:w="878" w:type="dxa"/>
+          </w:tcPr>
+          <w:p>
+            <w:pPr>
+              <w:rPr>
+                <w:sz w:val="20"/>
+                <w:szCs w:val="20"/>
+                <w:lang w:val="de-DE"/>
+              </w:rPr>
+            </w:pPr>
+            <w:r>
+              <w:rPr>
+                <w:sz w:val="20"/>
+                <w:szCs w:val="20"/>
+              </w:rPr>
+              <w:t xml:space="preserve">Stck.</w:t>
+            </w:r>
+          </w:p>
+        </w:tc>
+        <w:tc>
+          <w:tcPr>
+            <w:tcW w:w="1303" w:type="dxa"/>
+          </w:tcPr>
+          <w:p>
+            <w:pPr>
+              <w:rPr>
+                <w:sz w:val="20"/>
+                <w:szCs w:val="20"/>
+                <w:lang w:val="de-DE"/>
+              </w:rPr>
+            </w:pPr>
+            <w:r>
+              <w:rPr>
+                <w:sz w:val="20"/>
+                <w:szCs w:val="20"/>
+              </w:rPr>
+              <w:t/>
+            </w:r>
+            <w:proofErr w:type="spellStart"/>
+            <w:r>
+              <w:rPr>
+                <w:sz w:val="20"/>
+                <w:szCs w:val="20"/>
+              </w:rPr>
+              <w:t/>
+            </w:r>
+            <w:proofErr w:type="spellEnd"/>
+            <w:r>
+              <w:rPr>
+                <w:sz w:val="20"/>
+                <w:szCs w:val="20"/>
+              </w:rPr>
+              <w:t/>
+            </w:r>
+          </w:p>
+        </w:tc>
+      </w:tr>
+      <w:tr>
+        <w:tc>
+          <w:tcPr>
+            <w:tcW w:w="2836" w:type="dxa"/>
+          </w:tcPr>
+          <w:p>
+            <w:pPr>
+              <w:rPr>
+                <w:sz w:val="20"/>
+                <w:szCs w:val="20"/>
+                <w:lang w:val="de-DE"/>
+              </w:rPr>
+            </w:pPr>
+            <w:r>
+              <w:rPr>
+                <w:sz w:val="20"/>
+                <w:szCs w:val="20"/>
+              </w:rPr>
+              <w:t xml:space="preserve">10</w:t>
+            </w:r>
+          </w:p>
+        </w:tc>
+        <w:tc>
+          <w:tcPr>
+            <w:tcW w:w="2041" w:type="dxa"/>
+          </w:tcPr>
+          <w:p>
+            <w:pPr>
+              <w:rPr>
+                <w:sz w:val="20"/>
+                <w:szCs w:val="20"/>
+                <w:lang w:val="de-DE"/>
+              </w:rPr>
+            </w:pPr>
+            <w:r>
+              <w:rPr>
+                <w:sz w:val="20"/>
+                <w:szCs w:val="20"/>
+              </w:rPr>
+              <w:t xml:space="preserve">V4FK600</w:t>
+            </w:r>
+            <w:proofErr w:type="spellStart"/>
+            <w:r>
+              <w:rPr>
+                <w:sz w:val="20"/>
+                <w:szCs w:val="20"/>
+              </w:rPr>
+              <w:t/>
+            </w:r>
+            <w:proofErr w:type="spellEnd"/>
+            <w:r>
+              <w:rPr>
+                <w:sz w:val="20"/>
+                <w:szCs w:val="20"/>
+              </w:rPr>
+              <w:t/>
+            </w:r>
+          </w:p>
+        </w:tc>
+        <w:tc>
+          <w:tcPr>
+            <w:tcW w:w="1440" w:type="dxa"/>
+          </w:tcPr>
+          <w:p>
+            <w:pPr>
+              <w:rPr>
+                <w:sz w:val="20"/>
+                <w:szCs w:val="20"/>
+                <w:lang w:val="de-DE"/>
+              </w:rPr>
+            </w:pPr>
+            <w:r>
+              <w:rPr>
+                <w:sz w:val="20"/>
+                <w:szCs w:val="20"/>
+              </w:rPr>
+              <w:t xml:space="preserve">Flächenkleber 3.0/4.0/5.0 Fußboden und Wandverkleidungspaneele 600ml VIGOUR</w:t>
             </w:r>
             <w:proofErr w:type="spellStart"/>
             <w:r>

</xml_diff>

<commit_message>
new reha products wannebretter
</commit_message>
<xml_diff>
--- a/out-Materialuebersicht.docx
+++ b/out-Materialuebersicht.docx
@@ -43,7 +43,7 @@
               <w:t>:</w:t>
             </w:r>
             <w:r>
-              <w:t xml:space="preserve"> Herr Hans Michalik</w:t>
+              <w:t xml:space="preserve"> Herr Lothar Harnisch</w:t>
             </w:r>
             <w:proofErr w:type="spellStart"/>
             <w:r>
@@ -72,7 +72,7 @@
               <w:t>:</w:t>
             </w:r>
             <w:r>
-              <w:t xml:space="preserve"> Kerschensteiner Straße 6, 90471 Nürnberg</w:t>
+              <w:t xml:space="preserve"> Am Schloß 5 , 06632  Balgstadt</w:t>
             </w:r>
             <w:proofErr w:type="spellStart"/>
             <w:r>
@@ -113,7 +113,7 @@
               <w:t>:</w:t>
             </w:r>
             <w:r>
-              <w:t xml:space="preserve"> 2025-12-15</w:t>
+              <w:t xml:space="preserve"> 2026-02-12</w:t>
             </w:r>
             <w:proofErr w:type="spellStart"/>
             <w:r>
@@ -142,7 +142,7 @@
               <w:t>:</w:t>
             </w:r>
             <w:r>
-              <w:t xml:space="preserve"> ANG2026-0317-153454</w:t>
+              <w:t xml:space="preserve"> ANG2026-0318-134738</w:t>
             </w:r>
             <w:proofErr w:type="spellStart"/>
             <w:r>
@@ -564,7 +564,7 @@
                 <w:sz w:val="20"/>
                 <w:szCs w:val="20"/>
               </w:rPr>
-              <w:t xml:space="preserve">AGD9060</w:t>
+              <w:t xml:space="preserve">0601010003</w:t>
             </w:r>
             <w:proofErr w:type="spellStart"/>
             <w:r>
@@ -601,7 +601,7 @@
                 <w:sz w:val="20"/>
                 <w:szCs w:val="20"/>
               </w:rPr>
-              <w:t xml:space="preserve">Ablaufgarnitur Rohbauset m.Sifon BH60mm f.flache Duschw.m.90mm Ablauf TRINNITY</w:t>
+              <w:t xml:space="preserve">Knauf Gipskarton-Bauplatte GKBI imprägniert 2500/1250/12,5mm HRAK</w:t>
             </w:r>
             <w:proofErr w:type="spellStart"/>
             <w:r>
@@ -756,7 +756,7 @@
                 <w:sz w:val="20"/>
                 <w:szCs w:val="20"/>
               </w:rPr>
-              <w:t xml:space="preserve">CLPESG30</w:t>
+              <w:t xml:space="preserve">AGD9060</w:t>
             </w:r>
             <w:proofErr w:type="spellStart"/>
             <w:r>
@@ -793,7 +793,7 @@
                 <w:sz w:val="20"/>
                 <w:szCs w:val="20"/>
               </w:rPr>
-              <w:t xml:space="preserve">Haltegriff clivia V2 plus 300mm m. Ros. Edelstahl glatt poliert,VIGOUR</w:t>
+              <w:t xml:space="preserve">Ablaufgarnitur Rohbauset m.Sifon BH60mm f.flache Duschw.m.90mm Ablauf TRINNITY</w:t>
             </w:r>
             <w:proofErr w:type="spellStart"/>
             <w:r>
@@ -830,7 +830,7 @@
                 <w:sz w:val="20"/>
                 <w:szCs w:val="20"/>
               </w:rPr>
-              <w:t xml:space="preserve">2</w:t>
+              <w:t xml:space="preserve">1</w:t>
             </w:r>
             <w:proofErr w:type="spellStart"/>
             <w:r>
@@ -948,7 +948,7 @@
                 <w:sz w:val="20"/>
                 <w:szCs w:val="20"/>
               </w:rPr>
-              <w:t xml:space="preserve">KM02</w:t>
+              <w:t xml:space="preserve">CLPESG30</w:t>
             </w:r>
             <w:proofErr w:type="spellStart"/>
             <w:r>
@@ -985,7 +985,7 @@
                 <w:sz w:val="20"/>
                 <w:szCs w:val="20"/>
               </w:rPr>
-              <w:t xml:space="preserve">Kleinmaterial</w:t>
+              <w:t xml:space="preserve">Haltegriff clivia V2 plus 300mm m. Ros. Edelstahl glatt poliert,VIGOUR</w:t>
             </w:r>
             <w:proofErr w:type="spellStart"/>
             <w:r>
@@ -1140,7 +1140,7 @@
                 <w:sz w:val="20"/>
                 <w:szCs w:val="20"/>
               </w:rPr>
-              <w:t xml:space="preserve">PLA5282</w:t>
+              <w:t xml:space="preserve">CVIS3WCT112</w:t>
             </w:r>
             <w:proofErr w:type="spellStart"/>
             <w:r>
@@ -1177,7 +1177,7 @@
                 <w:sz w:val="20"/>
                 <w:szCs w:val="20"/>
               </w:rPr>
-              <w:t xml:space="preserve">Stelzlager Pro justierbar 64–110 mm</w:t>
+              <w:t xml:space="preserve">VIS WC-Element E3 f. Trockenbau, m. UP- Spülkasten, Fresh-Box, BH: 1120mm, CONEL</w:t>
             </w:r>
             <w:proofErr w:type="spellStart"/>
             <w:r>
@@ -1332,7 +1332,7 @@
                 <w:sz w:val="20"/>
                 <w:szCs w:val="20"/>
               </w:rPr>
-              <w:t xml:space="preserve">R_4260602</w:t>
+              <w:t xml:space="preserve">DEDS2503E</w:t>
             </w:r>
             <w:proofErr w:type="spellStart"/>
             <w:r>
@@ -1369,7 +1369,7 @@
                 <w:sz w:val="20"/>
                 <w:szCs w:val="20"/>
               </w:rPr>
-              <w:t xml:space="preserve">Ramsauer 645 Flächen Kleber weiß 1K Hybrid Klebstoff 975g/600ml Beutel</w:t>
+              <w:t xml:space="preserve">Duschsystem derby Thermostat m KB 250mm HB 3.2 3-fach edge u. Schl. verchr. VIG</w:t>
             </w:r>
             <w:proofErr w:type="spellStart"/>
             <w:r>
@@ -1406,7 +1406,7 @@
                 <w:sz w:val="20"/>
                 <w:szCs w:val="20"/>
               </w:rPr>
-              <w:t xml:space="preserve">4</w:t>
+              <w:t xml:space="preserve">1</w:t>
             </w:r>
             <w:proofErr w:type="spellStart"/>
             <w:r>
@@ -1524,7 +1524,7 @@
                 <w:sz w:val="20"/>
                 <w:szCs w:val="20"/>
               </w:rPr>
-              <w:t xml:space="preserve">SLA80</w:t>
+              <w:t xml:space="preserve">DERSIAS</w:t>
             </w:r>
             <w:proofErr w:type="spellStart"/>
             <w:r>
@@ -1561,7 +1561,7 @@
                 <w:sz w:val="20"/>
                 <w:szCs w:val="20"/>
               </w:rPr>
-              <w:t xml:space="preserve">Duschwanne Slate80x80x3cm Mineralguss weiss Nuovvo</w:t>
+              <w:t xml:space="preserve">WC-Sitz derby rund m. Edelstahlscharnier abnehmbar mit Absenkautomatik weiss VIG.</w:t>
             </w:r>
             <w:proofErr w:type="spellStart"/>
             <w:r>
@@ -1716,7 +1716,7 @@
                 <w:sz w:val="20"/>
                 <w:szCs w:val="20"/>
               </w:rPr>
-              <w:t xml:space="preserve">TRWDB</w:t>
+              <w:t xml:space="preserve">DERWWCOSVP</w:t>
             </w:r>
             <w:proofErr w:type="spellStart"/>
             <w:r>
@@ -1753,7 +1753,7 @@
                 <w:sz w:val="20"/>
                 <w:szCs w:val="20"/>
               </w:rPr>
-              <w:t xml:space="preserve">TRINNITY Wannenabdichtband-Set 3,4 m Nass-/Trockenanbindung entspr. DIN 18534</w:t>
+              <w:t xml:space="preserve">Wand-Tiefspül-WC derby rund o.Spülrand verdeckte Befest.weiss PflegePLUS VIGOUR</w:t>
             </w:r>
             <w:proofErr w:type="spellStart"/>
             <w:r>
@@ -1908,7 +1908,7 @@
                 <w:sz w:val="20"/>
                 <w:szCs w:val="20"/>
               </w:rPr>
-              <w:t xml:space="preserve">TRWDSET5</w:t>
+              <w:t xml:space="preserve">KM02</w:t>
             </w:r>
             <w:proofErr w:type="spellStart"/>
             <w:r>
@@ -1945,7 +1945,7 @@
                 <w:sz w:val="20"/>
                 <w:szCs w:val="20"/>
               </w:rPr>
-              <w:t xml:space="preserve">TRINNITY Wandabdichtung BASIS-Set 5 qm DW bis 100 x 100 / BW bis 180 x 80 cm</w:t>
+              <w:t xml:space="preserve">Kleinmaterial</w:t>
             </w:r>
             <w:proofErr w:type="spellStart"/>
             <w:r>
@@ -2100,7 +2100,7 @@
                 <w:sz w:val="20"/>
                 <w:szCs w:val="20"/>
               </w:rPr>
-              <w:t xml:space="preserve">V3A</w:t>
+              <w:t xml:space="preserve">PLA5282</w:t>
             </w:r>
             <w:proofErr w:type="spellStart"/>
             <w:r>
@@ -2137,7 +2137,7 @@
                 <w:sz w:val="20"/>
                 <w:szCs w:val="20"/>
               </w:rPr>
-              <w:t xml:space="preserve">Abschlussprofil V3 255 cm silber eloxiert VIGOUR</w:t>
+              <w:t xml:space="preserve">Stelzlager Pro justierbar 64–110 mm</w:t>
             </w:r>
             <w:proofErr w:type="spellStart"/>
             <w:r>
@@ -2174,7 +2174,7 @@
                 <w:sz w:val="20"/>
                 <w:szCs w:val="20"/>
               </w:rPr>
-              <w:t xml:space="preserve">2</w:t>
+              <w:t xml:space="preserve">1</w:t>
             </w:r>
             <w:proofErr w:type="spellStart"/>
             <w:r>
@@ -2292,7 +2292,7 @@
                 <w:sz w:val="20"/>
                 <w:szCs w:val="20"/>
               </w:rPr>
-              <w:t xml:space="preserve">V3FPS80AHL</w:t>
+              <w:t xml:space="preserve">R_4260602</w:t>
             </w:r>
             <w:proofErr w:type="spellStart"/>
             <w:r>
@@ -2329,7 +2329,7 @@
                 <w:sz w:val="20"/>
                 <w:szCs w:val="20"/>
               </w:rPr>
-              <w:t xml:space="preserve">Seitenwand f.Falt/Pendel.V3 800x2000mm sil.hochglanz ESG klar PflegePlus VIGOUR VIGOUR</w:t>
+              <w:t xml:space="preserve">Ramsauer 645 Flächen Kleber weiß 1K Hybrid Klebstoff 975g/600ml Beutel</w:t>
             </w:r>
             <w:proofErr w:type="spellStart"/>
             <w:r>
@@ -2366,7 +2366,7 @@
                 <w:sz w:val="20"/>
                 <w:szCs w:val="20"/>
               </w:rPr>
-              <w:t xml:space="preserve">1</w:t>
+              <w:t xml:space="preserve">6</w:t>
             </w:r>
             <w:proofErr w:type="spellStart"/>
             <w:r>
@@ -2484,7 +2484,7 @@
                 <w:sz w:val="20"/>
                 <w:szCs w:val="20"/>
               </w:rPr>
-              <w:t xml:space="preserve">V3P280AHL</w:t>
+              <w:t xml:space="preserve">SCHALL</w:t>
             </w:r>
             <w:proofErr w:type="spellStart"/>
             <w:r>
@@ -2521,7 +2521,7 @@
                 <w:sz w:val="20"/>
                 <w:szCs w:val="20"/>
               </w:rPr>
-              <w:t xml:space="preserve">Pendeltür 2tlg.f.Ni./SW V3 800x2000mm sil.hochglanz ESG klar PflegePlus VIGOUR</w:t>
+              <w:t xml:space="preserve">Montageset f. Wand-WC/WD-Bidet m.geringem Schallschutz TRINNITY</w:t>
             </w:r>
             <w:proofErr w:type="spellStart"/>
             <w:r>
@@ -2676,7 +2676,7 @@
                 <w:sz w:val="20"/>
                 <w:szCs w:val="20"/>
               </w:rPr>
-              <w:t xml:space="preserve">V3WVK09</w:t>
+              <w:t xml:space="preserve">SLA18080</w:t>
             </w:r>
             <w:proofErr w:type="spellStart"/>
             <w:r>
@@ -2713,7 +2713,7 @@
                 <w:sz w:val="20"/>
                 <w:szCs w:val="20"/>
               </w:rPr>
-              <w:t xml:space="preserve">Wandverkleidung V3 Alu 997x 2550mm Marmor weiß VIGOUR — Farbe: Stein grau</w:t>
+              <w:t xml:space="preserve">Duschwanne Slate 180x80x3cm Mineralguss weiss Nuovvo</w:t>
             </w:r>
             <w:proofErr w:type="spellStart"/>
             <w:r>
@@ -2750,7 +2750,7 @@
                 <w:sz w:val="20"/>
                 <w:szCs w:val="20"/>
               </w:rPr>
-              <w:t xml:space="preserve">2</w:t>
+              <w:t xml:space="preserve">1</w:t>
             </w:r>
             <w:proofErr w:type="spellStart"/>
             <w:r>
@@ -2868,7 +2868,7 @@
                 <w:sz w:val="20"/>
                 <w:szCs w:val="20"/>
               </w:rPr>
-              <w:t xml:space="preserve">V22BG903R</w:t>
+              <w:t xml:space="preserve">TECEADS</w:t>
             </w:r>
             <w:proofErr w:type="spellStart"/>
             <w:r>
@@ -2905,7 +2905,7 @@
                 <w:sz w:val="20"/>
                 <w:szCs w:val="20"/>
               </w:rPr>
-              <w:t xml:space="preserve">Brausegarnitur V2 m.Stange 90cm Schlauch u.HB 3-str. rund verchr.VIGOUR</w:t>
+              <w:t xml:space="preserve">Tece Seal System Abdichtungsset für Wanddurchführungen</w:t>
             </w:r>
             <w:proofErr w:type="spellStart"/>
             <w:r>
@@ -2942,7 +2942,7 @@
                 <w:sz w:val="20"/>
                 <w:szCs w:val="20"/>
               </w:rPr>
-              <w:t xml:space="preserve">2</w:t>
+              <w:t xml:space="preserve">1</w:t>
             </w:r>
             <w:proofErr w:type="spellStart"/>
             <w:r>
@@ -3040,6 +3040,1542 @@
                 <w:szCs w:val="20"/>
               </w:rPr>
               <w:t xml:space="preserve">15</w:t>
+            </w:r>
+          </w:p>
+        </w:tc>
+        <w:tc>
+          <w:tcPr>
+            <w:tcW w:w="2041" w:type="dxa"/>
+          </w:tcPr>
+          <w:p>
+            <w:pPr>
+              <w:rPr>
+                <w:sz w:val="20"/>
+                <w:szCs w:val="20"/>
+                <w:lang w:val="de-DE"/>
+              </w:rPr>
+            </w:pPr>
+            <w:r>
+              <w:rPr>
+                <w:sz w:val="20"/>
+                <w:szCs w:val="20"/>
+              </w:rPr>
+              <w:t xml:space="preserve">TRWDB</w:t>
+            </w:r>
+            <w:proofErr w:type="spellStart"/>
+            <w:r>
+              <w:rPr>
+                <w:sz w:val="20"/>
+                <w:szCs w:val="20"/>
+              </w:rPr>
+              <w:t/>
+            </w:r>
+            <w:proofErr w:type="spellEnd"/>
+            <w:r>
+              <w:rPr>
+                <w:sz w:val="20"/>
+                <w:szCs w:val="20"/>
+              </w:rPr>
+              <w:t/>
+            </w:r>
+          </w:p>
+        </w:tc>
+        <w:tc>
+          <w:tcPr>
+            <w:tcW w:w="1440" w:type="dxa"/>
+          </w:tcPr>
+          <w:p>
+            <w:pPr>
+              <w:rPr>
+                <w:sz w:val="20"/>
+                <w:szCs w:val="20"/>
+                <w:lang w:val="de-DE"/>
+              </w:rPr>
+            </w:pPr>
+            <w:r>
+              <w:rPr>
+                <w:sz w:val="20"/>
+                <w:szCs w:val="20"/>
+              </w:rPr>
+              <w:t xml:space="preserve">TRINNITY Wannenabdichtband-Set 3,4 m Nass-/Trockenanbindung entspr. DIN 18534</w:t>
+            </w:r>
+            <w:proofErr w:type="spellStart"/>
+            <w:r>
+              <w:rPr>
+                <w:sz w:val="20"/>
+                <w:szCs w:val="20"/>
+              </w:rPr>
+              <w:t/>
+            </w:r>
+            <w:proofErr w:type="spellEnd"/>
+            <w:r>
+              <w:rPr>
+                <w:sz w:val="20"/>
+                <w:szCs w:val="20"/>
+              </w:rPr>
+              <w:t/>
+            </w:r>
+          </w:p>
+        </w:tc>
+        <w:tc>
+          <w:tcPr>
+            <w:tcW w:w="853" w:type="dxa"/>
+          </w:tcPr>
+          <w:p>
+            <w:pPr>
+              <w:rPr>
+                <w:sz w:val="20"/>
+                <w:szCs w:val="20"/>
+                <w:lang w:val="de-DE"/>
+              </w:rPr>
+            </w:pPr>
+            <w:r>
+              <w:rPr>
+                <w:sz w:val="20"/>
+                <w:szCs w:val="20"/>
+              </w:rPr>
+              <w:t xml:space="preserve">1</w:t>
+            </w:r>
+            <w:proofErr w:type="spellStart"/>
+            <w:r>
+              <w:rPr>
+                <w:sz w:val="20"/>
+                <w:szCs w:val="20"/>
+              </w:rPr>
+              <w:t/>
+            </w:r>
+            <w:proofErr w:type="spellEnd"/>
+            <w:r>
+              <w:rPr>
+                <w:sz w:val="20"/>
+                <w:szCs w:val="20"/>
+              </w:rPr>
+              <w:t/>
+            </w:r>
+          </w:p>
+        </w:tc>
+        <w:tc>
+          <w:tcPr>
+            <w:tcW w:w="878" w:type="dxa"/>
+          </w:tcPr>
+          <w:p>
+            <w:pPr>
+              <w:rPr>
+                <w:sz w:val="20"/>
+                <w:szCs w:val="20"/>
+                <w:lang w:val="de-DE"/>
+              </w:rPr>
+            </w:pPr>
+            <w:r>
+              <w:rPr>
+                <w:sz w:val="20"/>
+                <w:szCs w:val="20"/>
+              </w:rPr>
+              <w:t xml:space="preserve">Stck.</w:t>
+            </w:r>
+          </w:p>
+        </w:tc>
+        <w:tc>
+          <w:tcPr>
+            <w:tcW w:w="1303" w:type="dxa"/>
+          </w:tcPr>
+          <w:p>
+            <w:pPr>
+              <w:rPr>
+                <w:sz w:val="20"/>
+                <w:szCs w:val="20"/>
+                <w:lang w:val="de-DE"/>
+              </w:rPr>
+            </w:pPr>
+            <w:r>
+              <w:rPr>
+                <w:sz w:val="20"/>
+                <w:szCs w:val="20"/>
+              </w:rPr>
+              <w:t/>
+            </w:r>
+            <w:proofErr w:type="spellStart"/>
+            <w:r>
+              <w:rPr>
+                <w:sz w:val="20"/>
+                <w:szCs w:val="20"/>
+              </w:rPr>
+              <w:t/>
+            </w:r>
+            <w:proofErr w:type="spellEnd"/>
+            <w:r>
+              <w:rPr>
+                <w:sz w:val="20"/>
+                <w:szCs w:val="20"/>
+              </w:rPr>
+              <w:t/>
+            </w:r>
+          </w:p>
+        </w:tc>
+      </w:tr>
+      <w:tr>
+        <w:tc>
+          <w:tcPr>
+            <w:tcW w:w="2836" w:type="dxa"/>
+          </w:tcPr>
+          <w:p>
+            <w:pPr>
+              <w:rPr>
+                <w:sz w:val="20"/>
+                <w:szCs w:val="20"/>
+                <w:lang w:val="de-DE"/>
+              </w:rPr>
+            </w:pPr>
+            <w:r>
+              <w:rPr>
+                <w:sz w:val="20"/>
+                <w:szCs w:val="20"/>
+              </w:rPr>
+              <w:t xml:space="preserve">16</w:t>
+            </w:r>
+          </w:p>
+        </w:tc>
+        <w:tc>
+          <w:tcPr>
+            <w:tcW w:w="2041" w:type="dxa"/>
+          </w:tcPr>
+          <w:p>
+            <w:pPr>
+              <w:rPr>
+                <w:sz w:val="20"/>
+                <w:szCs w:val="20"/>
+                <w:lang w:val="de-DE"/>
+              </w:rPr>
+            </w:pPr>
+            <w:r>
+              <w:rPr>
+                <w:sz w:val="20"/>
+                <w:szCs w:val="20"/>
+              </w:rPr>
+              <w:t xml:space="preserve">TRWDSET5</w:t>
+            </w:r>
+            <w:proofErr w:type="spellStart"/>
+            <w:r>
+              <w:rPr>
+                <w:sz w:val="20"/>
+                <w:szCs w:val="20"/>
+              </w:rPr>
+              <w:t/>
+            </w:r>
+            <w:proofErr w:type="spellEnd"/>
+            <w:r>
+              <w:rPr>
+                <w:sz w:val="20"/>
+                <w:szCs w:val="20"/>
+              </w:rPr>
+              <w:t/>
+            </w:r>
+          </w:p>
+        </w:tc>
+        <w:tc>
+          <w:tcPr>
+            <w:tcW w:w="1440" w:type="dxa"/>
+          </w:tcPr>
+          <w:p>
+            <w:pPr>
+              <w:rPr>
+                <w:sz w:val="20"/>
+                <w:szCs w:val="20"/>
+                <w:lang w:val="de-DE"/>
+              </w:rPr>
+            </w:pPr>
+            <w:r>
+              <w:rPr>
+                <w:sz w:val="20"/>
+                <w:szCs w:val="20"/>
+              </w:rPr>
+              <w:t xml:space="preserve">TRINNITY Wandabdichtung BASIS-Set 5 qm DW bis 100 x 100 / BW bis 180 x 80 cm</w:t>
+            </w:r>
+            <w:proofErr w:type="spellStart"/>
+            <w:r>
+              <w:rPr>
+                <w:sz w:val="20"/>
+                <w:szCs w:val="20"/>
+              </w:rPr>
+              <w:t/>
+            </w:r>
+            <w:proofErr w:type="spellEnd"/>
+            <w:r>
+              <w:rPr>
+                <w:sz w:val="20"/>
+                <w:szCs w:val="20"/>
+              </w:rPr>
+              <w:t/>
+            </w:r>
+          </w:p>
+        </w:tc>
+        <w:tc>
+          <w:tcPr>
+            <w:tcW w:w="853" w:type="dxa"/>
+          </w:tcPr>
+          <w:p>
+            <w:pPr>
+              <w:rPr>
+                <w:sz w:val="20"/>
+                <w:szCs w:val="20"/>
+                <w:lang w:val="de-DE"/>
+              </w:rPr>
+            </w:pPr>
+            <w:r>
+              <w:rPr>
+                <w:sz w:val="20"/>
+                <w:szCs w:val="20"/>
+              </w:rPr>
+              <w:t xml:space="preserve">1</w:t>
+            </w:r>
+            <w:proofErr w:type="spellStart"/>
+            <w:r>
+              <w:rPr>
+                <w:sz w:val="20"/>
+                <w:szCs w:val="20"/>
+              </w:rPr>
+              <w:t/>
+            </w:r>
+            <w:proofErr w:type="spellEnd"/>
+            <w:r>
+              <w:rPr>
+                <w:sz w:val="20"/>
+                <w:szCs w:val="20"/>
+              </w:rPr>
+              <w:t/>
+            </w:r>
+          </w:p>
+        </w:tc>
+        <w:tc>
+          <w:tcPr>
+            <w:tcW w:w="878" w:type="dxa"/>
+          </w:tcPr>
+          <w:p>
+            <w:pPr>
+              <w:rPr>
+                <w:sz w:val="20"/>
+                <w:szCs w:val="20"/>
+                <w:lang w:val="de-DE"/>
+              </w:rPr>
+            </w:pPr>
+            <w:r>
+              <w:rPr>
+                <w:sz w:val="20"/>
+                <w:szCs w:val="20"/>
+              </w:rPr>
+              <w:t xml:space="preserve">Stck.</w:t>
+            </w:r>
+          </w:p>
+        </w:tc>
+        <w:tc>
+          <w:tcPr>
+            <w:tcW w:w="1303" w:type="dxa"/>
+          </w:tcPr>
+          <w:p>
+            <w:pPr>
+              <w:rPr>
+                <w:sz w:val="20"/>
+                <w:szCs w:val="20"/>
+                <w:lang w:val="de-DE"/>
+              </w:rPr>
+            </w:pPr>
+            <w:r>
+              <w:rPr>
+                <w:sz w:val="20"/>
+                <w:szCs w:val="20"/>
+              </w:rPr>
+              <w:t/>
+            </w:r>
+            <w:proofErr w:type="spellStart"/>
+            <w:r>
+              <w:rPr>
+                <w:sz w:val="20"/>
+                <w:szCs w:val="20"/>
+              </w:rPr>
+              <w:t/>
+            </w:r>
+            <w:proofErr w:type="spellEnd"/>
+            <w:r>
+              <w:rPr>
+                <w:sz w:val="20"/>
+                <w:szCs w:val="20"/>
+              </w:rPr>
+              <w:t/>
+            </w:r>
+          </w:p>
+        </w:tc>
+      </w:tr>
+      <w:tr>
+        <w:tc>
+          <w:tcPr>
+            <w:tcW w:w="2836" w:type="dxa"/>
+          </w:tcPr>
+          <w:p>
+            <w:pPr>
+              <w:rPr>
+                <w:sz w:val="20"/>
+                <w:szCs w:val="20"/>
+                <w:lang w:val="de-DE"/>
+              </w:rPr>
+            </w:pPr>
+            <w:r>
+              <w:rPr>
+                <w:sz w:val="20"/>
+                <w:szCs w:val="20"/>
+              </w:rPr>
+              <w:t xml:space="preserve">17</w:t>
+            </w:r>
+          </w:p>
+        </w:tc>
+        <w:tc>
+          <w:tcPr>
+            <w:tcW w:w="2041" w:type="dxa"/>
+          </w:tcPr>
+          <w:p>
+            <w:pPr>
+              <w:rPr>
+                <w:sz w:val="20"/>
+                <w:szCs w:val="20"/>
+                <w:lang w:val="de-DE"/>
+              </w:rPr>
+            </w:pPr>
+            <w:r>
+              <w:rPr>
+                <w:sz w:val="20"/>
+                <w:szCs w:val="20"/>
+              </w:rPr>
+              <w:t xml:space="preserve">V1DON</w:t>
+            </w:r>
+            <w:proofErr w:type="spellStart"/>
+            <w:r>
+              <w:rPr>
+                <w:sz w:val="20"/>
+                <w:szCs w:val="20"/>
+              </w:rPr>
+              <w:t/>
+            </w:r>
+            <w:proofErr w:type="spellEnd"/>
+            <w:r>
+              <w:rPr>
+                <w:sz w:val="20"/>
+                <w:szCs w:val="20"/>
+              </w:rPr>
+              <w:t/>
+            </w:r>
+          </w:p>
+        </w:tc>
+        <w:tc>
+          <w:tcPr>
+            <w:tcW w:w="1440" w:type="dxa"/>
+          </w:tcPr>
+          <w:p>
+            <w:pPr>
+              <w:rPr>
+                <w:sz w:val="20"/>
+                <w:szCs w:val="20"/>
+                <w:lang w:val="de-DE"/>
+              </w:rPr>
+            </w:pPr>
+            <w:r>
+              <w:rPr>
+                <w:sz w:val="20"/>
+                <w:szCs w:val="20"/>
+              </w:rPr>
+              <w:t xml:space="preserve">Betätigungsplatte V1 DON weiss f.2-Mengen-Spültechnik VIGOUR</w:t>
+            </w:r>
+            <w:proofErr w:type="spellStart"/>
+            <w:r>
+              <w:rPr>
+                <w:sz w:val="20"/>
+                <w:szCs w:val="20"/>
+              </w:rPr>
+              <w:t/>
+            </w:r>
+            <w:proofErr w:type="spellEnd"/>
+            <w:r>
+              <w:rPr>
+                <w:sz w:val="20"/>
+                <w:szCs w:val="20"/>
+              </w:rPr>
+              <w:t/>
+            </w:r>
+          </w:p>
+        </w:tc>
+        <w:tc>
+          <w:tcPr>
+            <w:tcW w:w="853" w:type="dxa"/>
+          </w:tcPr>
+          <w:p>
+            <w:pPr>
+              <w:rPr>
+                <w:sz w:val="20"/>
+                <w:szCs w:val="20"/>
+                <w:lang w:val="de-DE"/>
+              </w:rPr>
+            </w:pPr>
+            <w:r>
+              <w:rPr>
+                <w:sz w:val="20"/>
+                <w:szCs w:val="20"/>
+              </w:rPr>
+              <w:t xml:space="preserve">1</w:t>
+            </w:r>
+            <w:proofErr w:type="spellStart"/>
+            <w:r>
+              <w:rPr>
+                <w:sz w:val="20"/>
+                <w:szCs w:val="20"/>
+              </w:rPr>
+              <w:t/>
+            </w:r>
+            <w:proofErr w:type="spellEnd"/>
+            <w:r>
+              <w:rPr>
+                <w:sz w:val="20"/>
+                <w:szCs w:val="20"/>
+              </w:rPr>
+              <w:t/>
+            </w:r>
+          </w:p>
+        </w:tc>
+        <w:tc>
+          <w:tcPr>
+            <w:tcW w:w="878" w:type="dxa"/>
+          </w:tcPr>
+          <w:p>
+            <w:pPr>
+              <w:rPr>
+                <w:sz w:val="20"/>
+                <w:szCs w:val="20"/>
+                <w:lang w:val="de-DE"/>
+              </w:rPr>
+            </w:pPr>
+            <w:r>
+              <w:rPr>
+                <w:sz w:val="20"/>
+                <w:szCs w:val="20"/>
+              </w:rPr>
+              <w:t xml:space="preserve">Stck.</w:t>
+            </w:r>
+          </w:p>
+        </w:tc>
+        <w:tc>
+          <w:tcPr>
+            <w:tcW w:w="1303" w:type="dxa"/>
+          </w:tcPr>
+          <w:p>
+            <w:pPr>
+              <w:rPr>
+                <w:sz w:val="20"/>
+                <w:szCs w:val="20"/>
+                <w:lang w:val="de-DE"/>
+              </w:rPr>
+            </w:pPr>
+            <w:r>
+              <w:rPr>
+                <w:sz w:val="20"/>
+                <w:szCs w:val="20"/>
+              </w:rPr>
+              <w:t/>
+            </w:r>
+            <w:proofErr w:type="spellStart"/>
+            <w:r>
+              <w:rPr>
+                <w:sz w:val="20"/>
+                <w:szCs w:val="20"/>
+              </w:rPr>
+              <w:t/>
+            </w:r>
+            <w:proofErr w:type="spellEnd"/>
+            <w:r>
+              <w:rPr>
+                <w:sz w:val="20"/>
+                <w:szCs w:val="20"/>
+              </w:rPr>
+              <w:t/>
+            </w:r>
+          </w:p>
+        </w:tc>
+      </w:tr>
+      <w:tr>
+        <w:tc>
+          <w:tcPr>
+            <w:tcW w:w="2836" w:type="dxa"/>
+          </w:tcPr>
+          <w:p>
+            <w:pPr>
+              <w:rPr>
+                <w:sz w:val="20"/>
+                <w:szCs w:val="20"/>
+                <w:lang w:val="de-DE"/>
+              </w:rPr>
+            </w:pPr>
+            <w:r>
+              <w:rPr>
+                <w:sz w:val="20"/>
+                <w:szCs w:val="20"/>
+              </w:rPr>
+              <w:t xml:space="preserve">18</w:t>
+            </w:r>
+          </w:p>
+        </w:tc>
+        <w:tc>
+          <w:tcPr>
+            <w:tcW w:w="2041" w:type="dxa"/>
+          </w:tcPr>
+          <w:p>
+            <w:pPr>
+              <w:rPr>
+                <w:sz w:val="20"/>
+                <w:szCs w:val="20"/>
+                <w:lang w:val="de-DE"/>
+              </w:rPr>
+            </w:pPr>
+            <w:r>
+              <w:rPr>
+                <w:sz w:val="20"/>
+                <w:szCs w:val="20"/>
+              </w:rPr>
+              <w:t xml:space="preserve">V3A</w:t>
+            </w:r>
+            <w:proofErr w:type="spellStart"/>
+            <w:r>
+              <w:rPr>
+                <w:sz w:val="20"/>
+                <w:szCs w:val="20"/>
+              </w:rPr>
+              <w:t/>
+            </w:r>
+            <w:proofErr w:type="spellEnd"/>
+            <w:r>
+              <w:rPr>
+                <w:sz w:val="20"/>
+                <w:szCs w:val="20"/>
+              </w:rPr>
+              <w:t/>
+            </w:r>
+          </w:p>
+        </w:tc>
+        <w:tc>
+          <w:tcPr>
+            <w:tcW w:w="1440" w:type="dxa"/>
+          </w:tcPr>
+          <w:p>
+            <w:pPr>
+              <w:rPr>
+                <w:sz w:val="20"/>
+                <w:szCs w:val="20"/>
+                <w:lang w:val="de-DE"/>
+              </w:rPr>
+            </w:pPr>
+            <w:r>
+              <w:rPr>
+                <w:sz w:val="20"/>
+                <w:szCs w:val="20"/>
+              </w:rPr>
+              <w:t xml:space="preserve">Abschlussprofil V3 255 cm silber eloxiert VIGOUR</w:t>
+            </w:r>
+            <w:proofErr w:type="spellStart"/>
+            <w:r>
+              <w:rPr>
+                <w:sz w:val="20"/>
+                <w:szCs w:val="20"/>
+              </w:rPr>
+              <w:t/>
+            </w:r>
+            <w:proofErr w:type="spellEnd"/>
+            <w:r>
+              <w:rPr>
+                <w:sz w:val="20"/>
+                <w:szCs w:val="20"/>
+              </w:rPr>
+              <w:t/>
+            </w:r>
+          </w:p>
+        </w:tc>
+        <w:tc>
+          <w:tcPr>
+            <w:tcW w:w="853" w:type="dxa"/>
+          </w:tcPr>
+          <w:p>
+            <w:pPr>
+              <w:rPr>
+                <w:sz w:val="20"/>
+                <w:szCs w:val="20"/>
+                <w:lang w:val="de-DE"/>
+              </w:rPr>
+            </w:pPr>
+            <w:r>
+              <w:rPr>
+                <w:sz w:val="20"/>
+                <w:szCs w:val="20"/>
+              </w:rPr>
+              <w:t xml:space="preserve">1</w:t>
+            </w:r>
+            <w:proofErr w:type="spellStart"/>
+            <w:r>
+              <w:rPr>
+                <w:sz w:val="20"/>
+                <w:szCs w:val="20"/>
+              </w:rPr>
+              <w:t/>
+            </w:r>
+            <w:proofErr w:type="spellEnd"/>
+            <w:r>
+              <w:rPr>
+                <w:sz w:val="20"/>
+                <w:szCs w:val="20"/>
+              </w:rPr>
+              <w:t/>
+            </w:r>
+          </w:p>
+        </w:tc>
+        <w:tc>
+          <w:tcPr>
+            <w:tcW w:w="878" w:type="dxa"/>
+          </w:tcPr>
+          <w:p>
+            <w:pPr>
+              <w:rPr>
+                <w:sz w:val="20"/>
+                <w:szCs w:val="20"/>
+                <w:lang w:val="de-DE"/>
+              </w:rPr>
+            </w:pPr>
+            <w:r>
+              <w:rPr>
+                <w:sz w:val="20"/>
+                <w:szCs w:val="20"/>
+              </w:rPr>
+              <w:t xml:space="preserve">Stck.</w:t>
+            </w:r>
+          </w:p>
+        </w:tc>
+        <w:tc>
+          <w:tcPr>
+            <w:tcW w:w="1303" w:type="dxa"/>
+          </w:tcPr>
+          <w:p>
+            <w:pPr>
+              <w:rPr>
+                <w:sz w:val="20"/>
+                <w:szCs w:val="20"/>
+                <w:lang w:val="de-DE"/>
+              </w:rPr>
+            </w:pPr>
+            <w:r>
+              <w:rPr>
+                <w:sz w:val="20"/>
+                <w:szCs w:val="20"/>
+              </w:rPr>
+              <w:t/>
+            </w:r>
+            <w:proofErr w:type="spellStart"/>
+            <w:r>
+              <w:rPr>
+                <w:sz w:val="20"/>
+                <w:szCs w:val="20"/>
+              </w:rPr>
+              <w:t/>
+            </w:r>
+            <w:proofErr w:type="spellEnd"/>
+            <w:r>
+              <w:rPr>
+                <w:sz w:val="20"/>
+                <w:szCs w:val="20"/>
+              </w:rPr>
+              <w:t/>
+            </w:r>
+          </w:p>
+        </w:tc>
+      </w:tr>
+      <w:tr>
+        <w:tc>
+          <w:tcPr>
+            <w:tcW w:w="2836" w:type="dxa"/>
+          </w:tcPr>
+          <w:p>
+            <w:pPr>
+              <w:rPr>
+                <w:sz w:val="20"/>
+                <w:szCs w:val="20"/>
+                <w:lang w:val="de-DE"/>
+              </w:rPr>
+            </w:pPr>
+            <w:r>
+              <w:rPr>
+                <w:sz w:val="20"/>
+                <w:szCs w:val="20"/>
+              </w:rPr>
+              <w:t xml:space="preserve">19</w:t>
+            </w:r>
+          </w:p>
+        </w:tc>
+        <w:tc>
+          <w:tcPr>
+            <w:tcW w:w="2041" w:type="dxa"/>
+          </w:tcPr>
+          <w:p>
+            <w:pPr>
+              <w:rPr>
+                <w:sz w:val="20"/>
+                <w:szCs w:val="20"/>
+                <w:lang w:val="de-DE"/>
+              </w:rPr>
+            </w:pPr>
+            <w:r>
+              <w:rPr>
+                <w:sz w:val="20"/>
+                <w:szCs w:val="20"/>
+              </w:rPr>
+              <w:t xml:space="preserve">V3V</w:t>
+            </w:r>
+            <w:proofErr w:type="spellStart"/>
+            <w:r>
+              <w:rPr>
+                <w:sz w:val="20"/>
+                <w:szCs w:val="20"/>
+              </w:rPr>
+              <w:t/>
+            </w:r>
+            <w:proofErr w:type="spellEnd"/>
+            <w:r>
+              <w:rPr>
+                <w:sz w:val="20"/>
+                <w:szCs w:val="20"/>
+              </w:rPr>
+              <w:t/>
+            </w:r>
+          </w:p>
+        </w:tc>
+        <w:tc>
+          <w:tcPr>
+            <w:tcW w:w="1440" w:type="dxa"/>
+          </w:tcPr>
+          <w:p>
+            <w:pPr>
+              <w:rPr>
+                <w:sz w:val="20"/>
+                <w:szCs w:val="20"/>
+                <w:lang w:val="de-DE"/>
+              </w:rPr>
+            </w:pPr>
+            <w:r>
+              <w:rPr>
+                <w:sz w:val="20"/>
+                <w:szCs w:val="20"/>
+              </w:rPr>
+              <w:t xml:space="preserve">Verbindungsprofil V3 255 cm silber eloxiert VIGOUR</w:t>
+            </w:r>
+            <w:proofErr w:type="spellStart"/>
+            <w:r>
+              <w:rPr>
+                <w:sz w:val="20"/>
+                <w:szCs w:val="20"/>
+              </w:rPr>
+              <w:t/>
+            </w:r>
+            <w:proofErr w:type="spellEnd"/>
+            <w:r>
+              <w:rPr>
+                <w:sz w:val="20"/>
+                <w:szCs w:val="20"/>
+              </w:rPr>
+              <w:t/>
+            </w:r>
+          </w:p>
+        </w:tc>
+        <w:tc>
+          <w:tcPr>
+            <w:tcW w:w="853" w:type="dxa"/>
+          </w:tcPr>
+          <w:p>
+            <w:pPr>
+              <w:rPr>
+                <w:sz w:val="20"/>
+                <w:szCs w:val="20"/>
+                <w:lang w:val="de-DE"/>
+              </w:rPr>
+            </w:pPr>
+            <w:r>
+              <w:rPr>
+                <w:sz w:val="20"/>
+                <w:szCs w:val="20"/>
+              </w:rPr>
+              <w:t xml:space="preserve">1</w:t>
+            </w:r>
+            <w:proofErr w:type="spellStart"/>
+            <w:r>
+              <w:rPr>
+                <w:sz w:val="20"/>
+                <w:szCs w:val="20"/>
+              </w:rPr>
+              <w:t/>
+            </w:r>
+            <w:proofErr w:type="spellEnd"/>
+            <w:r>
+              <w:rPr>
+                <w:sz w:val="20"/>
+                <w:szCs w:val="20"/>
+              </w:rPr>
+              <w:t/>
+            </w:r>
+          </w:p>
+        </w:tc>
+        <w:tc>
+          <w:tcPr>
+            <w:tcW w:w="878" w:type="dxa"/>
+          </w:tcPr>
+          <w:p>
+            <w:pPr>
+              <w:rPr>
+                <w:sz w:val="20"/>
+                <w:szCs w:val="20"/>
+                <w:lang w:val="de-DE"/>
+              </w:rPr>
+            </w:pPr>
+            <w:r>
+              <w:rPr>
+                <w:sz w:val="20"/>
+                <w:szCs w:val="20"/>
+              </w:rPr>
+              <w:t xml:space="preserve">Stck.</w:t>
+            </w:r>
+          </w:p>
+        </w:tc>
+        <w:tc>
+          <w:tcPr>
+            <w:tcW w:w="1303" w:type="dxa"/>
+          </w:tcPr>
+          <w:p>
+            <w:pPr>
+              <w:rPr>
+                <w:sz w:val="20"/>
+                <w:szCs w:val="20"/>
+                <w:lang w:val="de-DE"/>
+              </w:rPr>
+            </w:pPr>
+            <w:r>
+              <w:rPr>
+                <w:sz w:val="20"/>
+                <w:szCs w:val="20"/>
+              </w:rPr>
+              <w:t/>
+            </w:r>
+            <w:proofErr w:type="spellStart"/>
+            <w:r>
+              <w:rPr>
+                <w:sz w:val="20"/>
+                <w:szCs w:val="20"/>
+              </w:rPr>
+              <w:t/>
+            </w:r>
+            <w:proofErr w:type="spellEnd"/>
+            <w:r>
+              <w:rPr>
+                <w:sz w:val="20"/>
+                <w:szCs w:val="20"/>
+              </w:rPr>
+              <w:t/>
+            </w:r>
+          </w:p>
+        </w:tc>
+      </w:tr>
+      <w:tr>
+        <w:tc>
+          <w:tcPr>
+            <w:tcW w:w="2836" w:type="dxa"/>
+          </w:tcPr>
+          <w:p>
+            <w:pPr>
+              <w:rPr>
+                <w:sz w:val="20"/>
+                <w:szCs w:val="20"/>
+                <w:lang w:val="de-DE"/>
+              </w:rPr>
+            </w:pPr>
+            <w:r>
+              <w:rPr>
+                <w:sz w:val="20"/>
+                <w:szCs w:val="20"/>
+              </w:rPr>
+              <w:t xml:space="preserve">20</w:t>
+            </w:r>
+          </w:p>
+        </w:tc>
+        <w:tc>
+          <w:tcPr>
+            <w:tcW w:w="2041" w:type="dxa"/>
+          </w:tcPr>
+          <w:p>
+            <w:pPr>
+              <w:rPr>
+                <w:sz w:val="20"/>
+                <w:szCs w:val="20"/>
+                <w:lang w:val="de-DE"/>
+              </w:rPr>
+            </w:pPr>
+            <w:r>
+              <w:rPr>
+                <w:sz w:val="20"/>
+                <w:szCs w:val="20"/>
+              </w:rPr>
+              <w:t xml:space="preserve">V3WV09</w:t>
+            </w:r>
+            <w:proofErr w:type="spellStart"/>
+            <w:r>
+              <w:rPr>
+                <w:sz w:val="20"/>
+                <w:szCs w:val="20"/>
+              </w:rPr>
+              <w:t/>
+            </w:r>
+            <w:proofErr w:type="spellEnd"/>
+            <w:r>
+              <w:rPr>
+                <w:sz w:val="20"/>
+                <w:szCs w:val="20"/>
+              </w:rPr>
+              <w:t/>
+            </w:r>
+          </w:p>
+        </w:tc>
+        <w:tc>
+          <w:tcPr>
+            <w:tcW w:w="1440" w:type="dxa"/>
+          </w:tcPr>
+          <w:p>
+            <w:pPr>
+              <w:rPr>
+                <w:sz w:val="20"/>
+                <w:szCs w:val="20"/>
+                <w:lang w:val="de-DE"/>
+              </w:rPr>
+            </w:pPr>
+            <w:r>
+              <w:rPr>
+                <w:sz w:val="20"/>
+                <w:szCs w:val="20"/>
+              </w:rPr>
+              <w:t xml:space="preserve">Wandverkleidung V3 Alu 1497x 2550mm Marmor weiß VIGOUR — Farbe: Struktur weiß</w:t>
+            </w:r>
+            <w:proofErr w:type="spellStart"/>
+            <w:r>
+              <w:rPr>
+                <w:sz w:val="20"/>
+                <w:szCs w:val="20"/>
+              </w:rPr>
+              <w:t/>
+            </w:r>
+            <w:proofErr w:type="spellEnd"/>
+            <w:r>
+              <w:rPr>
+                <w:sz w:val="20"/>
+                <w:szCs w:val="20"/>
+              </w:rPr>
+              <w:t/>
+            </w:r>
+          </w:p>
+        </w:tc>
+        <w:tc>
+          <w:tcPr>
+            <w:tcW w:w="853" w:type="dxa"/>
+          </w:tcPr>
+          <w:p>
+            <w:pPr>
+              <w:rPr>
+                <w:sz w:val="20"/>
+                <w:szCs w:val="20"/>
+                <w:lang w:val="de-DE"/>
+              </w:rPr>
+            </w:pPr>
+            <w:r>
+              <w:rPr>
+                <w:sz w:val="20"/>
+                <w:szCs w:val="20"/>
+              </w:rPr>
+              <w:t xml:space="preserve">1</w:t>
+            </w:r>
+            <w:proofErr w:type="spellStart"/>
+            <w:r>
+              <w:rPr>
+                <w:sz w:val="20"/>
+                <w:szCs w:val="20"/>
+              </w:rPr>
+              <w:t/>
+            </w:r>
+            <w:proofErr w:type="spellEnd"/>
+            <w:r>
+              <w:rPr>
+                <w:sz w:val="20"/>
+                <w:szCs w:val="20"/>
+              </w:rPr>
+              <w:t/>
+            </w:r>
+          </w:p>
+        </w:tc>
+        <w:tc>
+          <w:tcPr>
+            <w:tcW w:w="878" w:type="dxa"/>
+          </w:tcPr>
+          <w:p>
+            <w:pPr>
+              <w:rPr>
+                <w:sz w:val="20"/>
+                <w:szCs w:val="20"/>
+                <w:lang w:val="de-DE"/>
+              </w:rPr>
+            </w:pPr>
+            <w:r>
+              <w:rPr>
+                <w:sz w:val="20"/>
+                <w:szCs w:val="20"/>
+              </w:rPr>
+              <w:t xml:space="preserve">Stck.</w:t>
+            </w:r>
+          </w:p>
+        </w:tc>
+        <w:tc>
+          <w:tcPr>
+            <w:tcW w:w="1303" w:type="dxa"/>
+          </w:tcPr>
+          <w:p>
+            <w:pPr>
+              <w:rPr>
+                <w:sz w:val="20"/>
+                <w:szCs w:val="20"/>
+                <w:lang w:val="de-DE"/>
+              </w:rPr>
+            </w:pPr>
+            <w:r>
+              <w:rPr>
+                <w:sz w:val="20"/>
+                <w:szCs w:val="20"/>
+              </w:rPr>
+              <w:t/>
+            </w:r>
+            <w:proofErr w:type="spellStart"/>
+            <w:r>
+              <w:rPr>
+                <w:sz w:val="20"/>
+                <w:szCs w:val="20"/>
+              </w:rPr>
+              <w:t/>
+            </w:r>
+            <w:proofErr w:type="spellEnd"/>
+            <w:r>
+              <w:rPr>
+                <w:sz w:val="20"/>
+                <w:szCs w:val="20"/>
+              </w:rPr>
+              <w:t/>
+            </w:r>
+          </w:p>
+        </w:tc>
+      </w:tr>
+      <w:tr>
+        <w:tc>
+          <w:tcPr>
+            <w:tcW w:w="2836" w:type="dxa"/>
+          </w:tcPr>
+          <w:p>
+            <w:pPr>
+              <w:rPr>
+                <w:sz w:val="20"/>
+                <w:szCs w:val="20"/>
+                <w:lang w:val="de-DE"/>
+              </w:rPr>
+            </w:pPr>
+            <w:r>
+              <w:rPr>
+                <w:sz w:val="20"/>
+                <w:szCs w:val="20"/>
+              </w:rPr>
+              <w:t xml:space="preserve">21</w:t>
+            </w:r>
+          </w:p>
+        </w:tc>
+        <w:tc>
+          <w:tcPr>
+            <w:tcW w:w="2041" w:type="dxa"/>
+          </w:tcPr>
+          <w:p>
+            <w:pPr>
+              <w:rPr>
+                <w:sz w:val="20"/>
+                <w:szCs w:val="20"/>
+                <w:lang w:val="de-DE"/>
+              </w:rPr>
+            </w:pPr>
+            <w:r>
+              <w:rPr>
+                <w:sz w:val="20"/>
+                <w:szCs w:val="20"/>
+              </w:rPr>
+              <w:t xml:space="preserve">V3WVK09</w:t>
+            </w:r>
+            <w:proofErr w:type="spellStart"/>
+            <w:r>
+              <w:rPr>
+                <w:sz w:val="20"/>
+                <w:szCs w:val="20"/>
+              </w:rPr>
+              <w:t/>
+            </w:r>
+            <w:proofErr w:type="spellEnd"/>
+            <w:r>
+              <w:rPr>
+                <w:sz w:val="20"/>
+                <w:szCs w:val="20"/>
+              </w:rPr>
+              <w:t/>
+            </w:r>
+          </w:p>
+        </w:tc>
+        <w:tc>
+          <w:tcPr>
+            <w:tcW w:w="1440" w:type="dxa"/>
+          </w:tcPr>
+          <w:p>
+            <w:pPr>
+              <w:rPr>
+                <w:sz w:val="20"/>
+                <w:szCs w:val="20"/>
+                <w:lang w:val="de-DE"/>
+              </w:rPr>
+            </w:pPr>
+            <w:r>
+              <w:rPr>
+                <w:sz w:val="20"/>
+                <w:szCs w:val="20"/>
+              </w:rPr>
+              <w:t xml:space="preserve">Wandverkleidung V3 Alu 997x 2550mm Marmor weiß VIGOUR — Farbe: Schiefer grau</w:t>
+            </w:r>
+            <w:proofErr w:type="spellStart"/>
+            <w:r>
+              <w:rPr>
+                <w:sz w:val="20"/>
+                <w:szCs w:val="20"/>
+              </w:rPr>
+              <w:t/>
+            </w:r>
+            <w:proofErr w:type="spellEnd"/>
+            <w:r>
+              <w:rPr>
+                <w:sz w:val="20"/>
+                <w:szCs w:val="20"/>
+              </w:rPr>
+              <w:t/>
+            </w:r>
+          </w:p>
+        </w:tc>
+        <w:tc>
+          <w:tcPr>
+            <w:tcW w:w="853" w:type="dxa"/>
+          </w:tcPr>
+          <w:p>
+            <w:pPr>
+              <w:rPr>
+                <w:sz w:val="20"/>
+                <w:szCs w:val="20"/>
+                <w:lang w:val="de-DE"/>
+              </w:rPr>
+            </w:pPr>
+            <w:r>
+              <w:rPr>
+                <w:sz w:val="20"/>
+                <w:szCs w:val="20"/>
+              </w:rPr>
+              <w:t xml:space="preserve">2</w:t>
+            </w:r>
+            <w:proofErr w:type="spellStart"/>
+            <w:r>
+              <w:rPr>
+                <w:sz w:val="20"/>
+                <w:szCs w:val="20"/>
+              </w:rPr>
+              <w:t/>
+            </w:r>
+            <w:proofErr w:type="spellEnd"/>
+            <w:r>
+              <w:rPr>
+                <w:sz w:val="20"/>
+                <w:szCs w:val="20"/>
+              </w:rPr>
+              <w:t/>
+            </w:r>
+          </w:p>
+        </w:tc>
+        <w:tc>
+          <w:tcPr>
+            <w:tcW w:w="878" w:type="dxa"/>
+          </w:tcPr>
+          <w:p>
+            <w:pPr>
+              <w:rPr>
+                <w:sz w:val="20"/>
+                <w:szCs w:val="20"/>
+                <w:lang w:val="de-DE"/>
+              </w:rPr>
+            </w:pPr>
+            <w:r>
+              <w:rPr>
+                <w:sz w:val="20"/>
+                <w:szCs w:val="20"/>
+              </w:rPr>
+              <w:t xml:space="preserve">Stck.</w:t>
+            </w:r>
+          </w:p>
+        </w:tc>
+        <w:tc>
+          <w:tcPr>
+            <w:tcW w:w="1303" w:type="dxa"/>
+          </w:tcPr>
+          <w:p>
+            <w:pPr>
+              <w:rPr>
+                <w:sz w:val="20"/>
+                <w:szCs w:val="20"/>
+                <w:lang w:val="de-DE"/>
+              </w:rPr>
+            </w:pPr>
+            <w:r>
+              <w:rPr>
+                <w:sz w:val="20"/>
+                <w:szCs w:val="20"/>
+              </w:rPr>
+              <w:t/>
+            </w:r>
+            <w:proofErr w:type="spellStart"/>
+            <w:r>
+              <w:rPr>
+                <w:sz w:val="20"/>
+                <w:szCs w:val="20"/>
+              </w:rPr>
+              <w:t/>
+            </w:r>
+            <w:proofErr w:type="spellEnd"/>
+            <w:r>
+              <w:rPr>
+                <w:sz w:val="20"/>
+                <w:szCs w:val="20"/>
+              </w:rPr>
+              <w:t/>
+            </w:r>
+          </w:p>
+        </w:tc>
+      </w:tr>
+      <w:tr>
+        <w:tc>
+          <w:tcPr>
+            <w:tcW w:w="2836" w:type="dxa"/>
+          </w:tcPr>
+          <w:p>
+            <w:pPr>
+              <w:rPr>
+                <w:sz w:val="20"/>
+                <w:szCs w:val="20"/>
+                <w:lang w:val="de-DE"/>
+              </w:rPr>
+            </w:pPr>
+            <w:r>
+              <w:rPr>
+                <w:sz w:val="20"/>
+                <w:szCs w:val="20"/>
+              </w:rPr>
+              <w:t xml:space="preserve">22</w:t>
+            </w:r>
+          </w:p>
+        </w:tc>
+        <w:tc>
+          <w:tcPr>
+            <w:tcW w:w="2041" w:type="dxa"/>
+          </w:tcPr>
+          <w:p>
+            <w:pPr>
+              <w:rPr>
+                <w:sz w:val="20"/>
+                <w:szCs w:val="20"/>
+                <w:lang w:val="de-DE"/>
+              </w:rPr>
+            </w:pPr>
+            <w:r>
+              <w:rPr>
+                <w:sz w:val="20"/>
+                <w:szCs w:val="20"/>
+              </w:rPr>
+              <w:t xml:space="preserve">V5WG120LCHL</w:t>
+            </w:r>
+            <w:proofErr w:type="spellStart"/>
+            <w:r>
+              <w:rPr>
+                <w:sz w:val="20"/>
+                <w:szCs w:val="20"/>
+              </w:rPr>
+              <w:t/>
+            </w:r>
+            <w:proofErr w:type="spellEnd"/>
+            <w:r>
+              <w:rPr>
+                <w:sz w:val="20"/>
+                <w:szCs w:val="20"/>
+              </w:rPr>
+              <w:t/>
+            </w:r>
+          </w:p>
+        </w:tc>
+        <w:tc>
+          <w:tcPr>
+            <w:tcW w:w="1440" w:type="dxa"/>
+          </w:tcPr>
+          <w:p>
+            <w:pPr>
+              <w:rPr>
+                <w:sz w:val="20"/>
+                <w:szCs w:val="20"/>
+                <w:lang w:val="de-DE"/>
+              </w:rPr>
+            </w:pPr>
+            <w:r>
+              <w:rPr>
+                <w:sz w:val="20"/>
+                <w:szCs w:val="20"/>
+              </w:rPr>
+              <w:t xml:space="preserve">Gleittür Walk In V5 links 1200x2000mm sil.hochg.ESG klar PflegeCare ACS VIGOUR</w:t>
+            </w:r>
+            <w:proofErr w:type="spellStart"/>
+            <w:r>
+              <w:rPr>
+                <w:sz w:val="20"/>
+                <w:szCs w:val="20"/>
+              </w:rPr>
+              <w:t/>
+            </w:r>
+            <w:proofErr w:type="spellEnd"/>
+            <w:r>
+              <w:rPr>
+                <w:sz w:val="20"/>
+                <w:szCs w:val="20"/>
+              </w:rPr>
+              <w:t/>
+            </w:r>
+          </w:p>
+        </w:tc>
+        <w:tc>
+          <w:tcPr>
+            <w:tcW w:w="853" w:type="dxa"/>
+          </w:tcPr>
+          <w:p>
+            <w:pPr>
+              <w:rPr>
+                <w:sz w:val="20"/>
+                <w:szCs w:val="20"/>
+                <w:lang w:val="de-DE"/>
+              </w:rPr>
+            </w:pPr>
+            <w:r>
+              <w:rPr>
+                <w:sz w:val="20"/>
+                <w:szCs w:val="20"/>
+              </w:rPr>
+              <w:t xml:space="preserve">1</w:t>
+            </w:r>
+            <w:proofErr w:type="spellStart"/>
+            <w:r>
+              <w:rPr>
+                <w:sz w:val="20"/>
+                <w:szCs w:val="20"/>
+              </w:rPr>
+              <w:t/>
+            </w:r>
+            <w:proofErr w:type="spellEnd"/>
+            <w:r>
+              <w:rPr>
+                <w:sz w:val="20"/>
+                <w:szCs w:val="20"/>
+              </w:rPr>
+              <w:t/>
+            </w:r>
+          </w:p>
+        </w:tc>
+        <w:tc>
+          <w:tcPr>
+            <w:tcW w:w="878" w:type="dxa"/>
+          </w:tcPr>
+          <w:p>
+            <w:pPr>
+              <w:rPr>
+                <w:sz w:val="20"/>
+                <w:szCs w:val="20"/>
+                <w:lang w:val="de-DE"/>
+              </w:rPr>
+            </w:pPr>
+            <w:r>
+              <w:rPr>
+                <w:sz w:val="20"/>
+                <w:szCs w:val="20"/>
+              </w:rPr>
+              <w:t xml:space="preserve">Stck.</w:t>
+            </w:r>
+          </w:p>
+        </w:tc>
+        <w:tc>
+          <w:tcPr>
+            <w:tcW w:w="1303" w:type="dxa"/>
+          </w:tcPr>
+          <w:p>
+            <w:pPr>
+              <w:rPr>
+                <w:sz w:val="20"/>
+                <w:szCs w:val="20"/>
+                <w:lang w:val="de-DE"/>
+              </w:rPr>
+            </w:pPr>
+            <w:r>
+              <w:rPr>
+                <w:sz w:val="20"/>
+                <w:szCs w:val="20"/>
+              </w:rPr>
+              <w:t/>
+            </w:r>
+            <w:proofErr w:type="spellStart"/>
+            <w:r>
+              <w:rPr>
+                <w:sz w:val="20"/>
+                <w:szCs w:val="20"/>
+              </w:rPr>
+              <w:t/>
+            </w:r>
+            <w:proofErr w:type="spellEnd"/>
+            <w:r>
+              <w:rPr>
+                <w:sz w:val="20"/>
+                <w:szCs w:val="20"/>
+              </w:rPr>
+              <w:t/>
+            </w:r>
+          </w:p>
+        </w:tc>
+      </w:tr>
+      <w:tr>
+        <w:tc>
+          <w:tcPr>
+            <w:tcW w:w="2836" w:type="dxa"/>
+          </w:tcPr>
+          <w:p>
+            <w:pPr>
+              <w:rPr>
+                <w:sz w:val="20"/>
+                <w:szCs w:val="20"/>
+                <w:lang w:val="de-DE"/>
+              </w:rPr>
+            </w:pPr>
+            <w:r>
+              <w:rPr>
+                <w:sz w:val="20"/>
+                <w:szCs w:val="20"/>
+              </w:rPr>
+              <w:t xml:space="preserve">23</w:t>
             </w:r>
           </w:p>
         </w:tc>

</xml_diff>

<commit_message>
update Plattenlager Pro justierbar
</commit_message>
<xml_diff>
--- a/out-Materialuebersicht.docx
+++ b/out-Materialuebersicht.docx
@@ -43,7 +43,7 @@
               <w:t>:</w:t>
             </w:r>
             <w:r>
-              <w:t xml:space="preserve"> Frau Abra Owens</w:t>
+              <w:t xml:space="preserve"> Herr Josef Förstel</w:t>
             </w:r>
             <w:proofErr w:type="spellStart"/>
             <w:r>
@@ -72,7 +72,7 @@
               <w:t>:</w:t>
             </w:r>
             <w:r>
-              <w:t xml:space="preserve"> Autem pariatur Volu, Laboris quam libero  Aliquid et sit rati</w:t>
+              <w:t xml:space="preserve"> Windäcke 28, 95505 Immenreuth</w:t>
             </w:r>
             <w:proofErr w:type="spellStart"/>
             <w:r>
@@ -113,7 +113,7 @@
               <w:t>:</w:t>
             </w:r>
             <w:r>
-              <w:t xml:space="preserve"> 1986-11-10</w:t>
+              <w:t xml:space="preserve"> 2026-06-09</w:t>
             </w:r>
             <w:proofErr w:type="spellStart"/>
             <w:r>
@@ -142,7 +142,7 @@
               <w:t>:</w:t>
             </w:r>
             <w:r>
-              <w:t xml:space="preserve"> ANG2026-0519-120125</w:t>
+              <w:t xml:space="preserve"> ANG2026-0610-101233</w:t>
             </w:r>
             <w:proofErr w:type="spellStart"/>
             <w:r>
@@ -372,7 +372,7 @@
                 <w:sz w:val="20"/>
                 <w:szCs w:val="20"/>
               </w:rPr>
-              <w:t xml:space="preserve">BRS-912</w:t>
+              <w:t xml:space="preserve">2000302</w:t>
             </w:r>
             <w:proofErr w:type="spellStart"/>
             <w:r>
@@ -409,7 +409,7 @@
                 <w:sz w:val="20"/>
                 <w:szCs w:val="20"/>
               </w:rPr>
-              <w:t xml:space="preserve">Juwel Tuchlift Premium</w:t>
+              <w:t xml:space="preserve">Ramsauer 450 Sanitär 1K Silicon Dichtstoff 310ml Kartusche weiß</w:t>
             </w:r>
             <w:proofErr w:type="spellStart"/>
             <w:r>
@@ -446,6 +446,198 @@
                 <w:sz w:val="20"/>
                 <w:szCs w:val="20"/>
               </w:rPr>
+              <w:t xml:space="preserve">4</w:t>
+            </w:r>
+            <w:proofErr w:type="spellStart"/>
+            <w:r>
+              <w:rPr>
+                <w:sz w:val="20"/>
+                <w:szCs w:val="20"/>
+              </w:rPr>
+              <w:t/>
+            </w:r>
+            <w:proofErr w:type="spellEnd"/>
+            <w:r>
+              <w:rPr>
+                <w:sz w:val="20"/>
+                <w:szCs w:val="20"/>
+              </w:rPr>
+              <w:t/>
+            </w:r>
+          </w:p>
+        </w:tc>
+        <w:tc>
+          <w:tcPr>
+            <w:tcW w:w="878" w:type="dxa"/>
+          </w:tcPr>
+          <w:p>
+            <w:pPr>
+              <w:rPr>
+                <w:sz w:val="20"/>
+                <w:szCs w:val="20"/>
+                <w:lang w:val="de-DE"/>
+              </w:rPr>
+            </w:pPr>
+            <w:r>
+              <w:rPr>
+                <w:sz w:val="20"/>
+                <w:szCs w:val="20"/>
+              </w:rPr>
+              <w:t xml:space="preserve">Stck.</w:t>
+            </w:r>
+          </w:p>
+        </w:tc>
+        <w:tc>
+          <w:tcPr>
+            <w:tcW w:w="1303" w:type="dxa"/>
+          </w:tcPr>
+          <w:p>
+            <w:pPr>
+              <w:rPr>
+                <w:sz w:val="20"/>
+                <w:szCs w:val="20"/>
+                <w:lang w:val="de-DE"/>
+              </w:rPr>
+            </w:pPr>
+            <w:r>
+              <w:rPr>
+                <w:sz w:val="20"/>
+                <w:szCs w:val="20"/>
+              </w:rPr>
+              <w:t/>
+            </w:r>
+            <w:proofErr w:type="spellStart"/>
+            <w:r>
+              <w:rPr>
+                <w:sz w:val="20"/>
+                <w:szCs w:val="20"/>
+              </w:rPr>
+              <w:t/>
+            </w:r>
+            <w:proofErr w:type="spellEnd"/>
+            <w:r>
+              <w:rPr>
+                <w:sz w:val="20"/>
+                <w:szCs w:val="20"/>
+              </w:rPr>
+              <w:t/>
+            </w:r>
+          </w:p>
+        </w:tc>
+      </w:tr>
+      <w:tr>
+        <w:tc>
+          <w:tcPr>
+            <w:tcW w:w="2836" w:type="dxa"/>
+          </w:tcPr>
+          <w:p>
+            <w:pPr>
+              <w:rPr>
+                <w:sz w:val="20"/>
+                <w:szCs w:val="20"/>
+                <w:lang w:val="de-DE"/>
+              </w:rPr>
+            </w:pPr>
+            <w:r>
+              <w:rPr>
+                <w:sz w:val="20"/>
+                <w:szCs w:val="20"/>
+              </w:rPr>
+              <w:t xml:space="preserve">2</w:t>
+            </w:r>
+          </w:p>
+        </w:tc>
+        <w:tc>
+          <w:tcPr>
+            <w:tcW w:w="2041" w:type="dxa"/>
+          </w:tcPr>
+          <w:p>
+            <w:pPr>
+              <w:rPr>
+                <w:sz w:val="20"/>
+                <w:szCs w:val="20"/>
+                <w:lang w:val="de-DE"/>
+              </w:rPr>
+            </w:pPr>
+            <w:r>
+              <w:rPr>
+                <w:sz w:val="20"/>
+                <w:szCs w:val="20"/>
+              </w:rPr>
+              <w:t xml:space="preserve">0601010003</w:t>
+            </w:r>
+            <w:proofErr w:type="spellStart"/>
+            <w:r>
+              <w:rPr>
+                <w:sz w:val="20"/>
+                <w:szCs w:val="20"/>
+              </w:rPr>
+              <w:t/>
+            </w:r>
+            <w:proofErr w:type="spellEnd"/>
+            <w:r>
+              <w:rPr>
+                <w:sz w:val="20"/>
+                <w:szCs w:val="20"/>
+              </w:rPr>
+              <w:t/>
+            </w:r>
+          </w:p>
+        </w:tc>
+        <w:tc>
+          <w:tcPr>
+            <w:tcW w:w="1440" w:type="dxa"/>
+          </w:tcPr>
+          <w:p>
+            <w:pPr>
+              <w:rPr>
+                <w:sz w:val="20"/>
+                <w:szCs w:val="20"/>
+                <w:lang w:val="de-DE"/>
+              </w:rPr>
+            </w:pPr>
+            <w:r>
+              <w:rPr>
+                <w:sz w:val="20"/>
+                <w:szCs w:val="20"/>
+              </w:rPr>
+              <w:t xml:space="preserve">Knauf Gipskarton-Bauplatte GKBI imprägniert 2500/1250/12,5mm HRAK</w:t>
+            </w:r>
+            <w:proofErr w:type="spellStart"/>
+            <w:r>
+              <w:rPr>
+                <w:sz w:val="20"/>
+                <w:szCs w:val="20"/>
+              </w:rPr>
+              <w:t/>
+            </w:r>
+            <w:proofErr w:type="spellEnd"/>
+            <w:r>
+              <w:rPr>
+                <w:sz w:val="20"/>
+                <w:szCs w:val="20"/>
+              </w:rPr>
+              <w:t/>
+            </w:r>
+          </w:p>
+        </w:tc>
+        <w:tc>
+          <w:tcPr>
+            <w:tcW w:w="853" w:type="dxa"/>
+          </w:tcPr>
+          <w:p>
+            <w:pPr>
+              <w:rPr>
+                <w:sz w:val="20"/>
+                <w:szCs w:val="20"/>
+                <w:lang w:val="de-DE"/>
+              </w:rPr>
+            </w:pPr>
+            <w:r>
+              <w:rPr>
+                <w:sz w:val="20"/>
+                <w:szCs w:val="20"/>
+              </w:rPr>
               <w:t xml:space="preserve">1</w:t>
             </w:r>
             <w:proofErr w:type="spellStart"/>
@@ -505,6 +697,4230 @@
                 <w:szCs w:val="20"/>
               </w:rPr>
               <w:t/>
+            </w:r>
+            <w:proofErr w:type="spellStart"/>
+            <w:r>
+              <w:rPr>
+                <w:sz w:val="20"/>
+                <w:szCs w:val="20"/>
+              </w:rPr>
+              <w:t/>
+            </w:r>
+            <w:proofErr w:type="spellEnd"/>
+            <w:r>
+              <w:rPr>
+                <w:sz w:val="20"/>
+                <w:szCs w:val="20"/>
+              </w:rPr>
+              <w:t/>
+            </w:r>
+          </w:p>
+        </w:tc>
+      </w:tr>
+      <w:tr>
+        <w:tc>
+          <w:tcPr>
+            <w:tcW w:w="2836" w:type="dxa"/>
+          </w:tcPr>
+          <w:p>
+            <w:pPr>
+              <w:rPr>
+                <w:sz w:val="20"/>
+                <w:szCs w:val="20"/>
+                <w:lang w:val="de-DE"/>
+              </w:rPr>
+            </w:pPr>
+            <w:r>
+              <w:rPr>
+                <w:sz w:val="20"/>
+                <w:szCs w:val="20"/>
+              </w:rPr>
+              <w:t xml:space="preserve">3</w:t>
+            </w:r>
+          </w:p>
+        </w:tc>
+        <w:tc>
+          <w:tcPr>
+            <w:tcW w:w="2041" w:type="dxa"/>
+          </w:tcPr>
+          <w:p>
+            <w:pPr>
+              <w:rPr>
+                <w:sz w:val="20"/>
+                <w:szCs w:val="20"/>
+                <w:lang w:val="de-DE"/>
+              </w:rPr>
+            </w:pPr>
+            <w:r>
+              <w:rPr>
+                <w:sz w:val="20"/>
+                <w:szCs w:val="20"/>
+              </w:rPr>
+              <w:t xml:space="preserve">AGD9060</w:t>
+            </w:r>
+            <w:proofErr w:type="spellStart"/>
+            <w:r>
+              <w:rPr>
+                <w:sz w:val="20"/>
+                <w:szCs w:val="20"/>
+              </w:rPr>
+              <w:t/>
+            </w:r>
+            <w:proofErr w:type="spellEnd"/>
+            <w:r>
+              <w:rPr>
+                <w:sz w:val="20"/>
+                <w:szCs w:val="20"/>
+              </w:rPr>
+              <w:t/>
+            </w:r>
+          </w:p>
+        </w:tc>
+        <w:tc>
+          <w:tcPr>
+            <w:tcW w:w="1440" w:type="dxa"/>
+          </w:tcPr>
+          <w:p>
+            <w:pPr>
+              <w:rPr>
+                <w:sz w:val="20"/>
+                <w:szCs w:val="20"/>
+                <w:lang w:val="de-DE"/>
+              </w:rPr>
+            </w:pPr>
+            <w:r>
+              <w:rPr>
+                <w:sz w:val="20"/>
+                <w:szCs w:val="20"/>
+              </w:rPr>
+              <w:t xml:space="preserve">Ablaufgarnitur Rohbauset m.Sifon BH60mm f.flache Duschw.m.90mm Ablauf TRINNITY</w:t>
+            </w:r>
+            <w:proofErr w:type="spellStart"/>
+            <w:r>
+              <w:rPr>
+                <w:sz w:val="20"/>
+                <w:szCs w:val="20"/>
+              </w:rPr>
+              <w:t/>
+            </w:r>
+            <w:proofErr w:type="spellEnd"/>
+            <w:r>
+              <w:rPr>
+                <w:sz w:val="20"/>
+                <w:szCs w:val="20"/>
+              </w:rPr>
+              <w:t/>
+            </w:r>
+          </w:p>
+        </w:tc>
+        <w:tc>
+          <w:tcPr>
+            <w:tcW w:w="853" w:type="dxa"/>
+          </w:tcPr>
+          <w:p>
+            <w:pPr>
+              <w:rPr>
+                <w:sz w:val="20"/>
+                <w:szCs w:val="20"/>
+                <w:lang w:val="de-DE"/>
+              </w:rPr>
+            </w:pPr>
+            <w:r>
+              <w:rPr>
+                <w:sz w:val="20"/>
+                <w:szCs w:val="20"/>
+              </w:rPr>
+              <w:t xml:space="preserve">1</w:t>
+            </w:r>
+            <w:proofErr w:type="spellStart"/>
+            <w:r>
+              <w:rPr>
+                <w:sz w:val="20"/>
+                <w:szCs w:val="20"/>
+              </w:rPr>
+              <w:t/>
+            </w:r>
+            <w:proofErr w:type="spellEnd"/>
+            <w:r>
+              <w:rPr>
+                <w:sz w:val="20"/>
+                <w:szCs w:val="20"/>
+              </w:rPr>
+              <w:t/>
+            </w:r>
+          </w:p>
+        </w:tc>
+        <w:tc>
+          <w:tcPr>
+            <w:tcW w:w="878" w:type="dxa"/>
+          </w:tcPr>
+          <w:p>
+            <w:pPr>
+              <w:rPr>
+                <w:sz w:val="20"/>
+                <w:szCs w:val="20"/>
+                <w:lang w:val="de-DE"/>
+              </w:rPr>
+            </w:pPr>
+            <w:r>
+              <w:rPr>
+                <w:sz w:val="20"/>
+                <w:szCs w:val="20"/>
+              </w:rPr>
+              <w:t xml:space="preserve">Stck.</w:t>
+            </w:r>
+          </w:p>
+        </w:tc>
+        <w:tc>
+          <w:tcPr>
+            <w:tcW w:w="1303" w:type="dxa"/>
+          </w:tcPr>
+          <w:p>
+            <w:pPr>
+              <w:rPr>
+                <w:sz w:val="20"/>
+                <w:szCs w:val="20"/>
+                <w:lang w:val="de-DE"/>
+              </w:rPr>
+            </w:pPr>
+            <w:r>
+              <w:rPr>
+                <w:sz w:val="20"/>
+                <w:szCs w:val="20"/>
+              </w:rPr>
+              <w:t/>
+            </w:r>
+            <w:proofErr w:type="spellStart"/>
+            <w:r>
+              <w:rPr>
+                <w:sz w:val="20"/>
+                <w:szCs w:val="20"/>
+              </w:rPr>
+              <w:t/>
+            </w:r>
+            <w:proofErr w:type="spellEnd"/>
+            <w:r>
+              <w:rPr>
+                <w:sz w:val="20"/>
+                <w:szCs w:val="20"/>
+              </w:rPr>
+              <w:t/>
+            </w:r>
+          </w:p>
+        </w:tc>
+      </w:tr>
+      <w:tr>
+        <w:tc>
+          <w:tcPr>
+            <w:tcW w:w="2836" w:type="dxa"/>
+          </w:tcPr>
+          <w:p>
+            <w:pPr>
+              <w:rPr>
+                <w:sz w:val="20"/>
+                <w:szCs w:val="20"/>
+                <w:lang w:val="de-DE"/>
+              </w:rPr>
+            </w:pPr>
+            <w:r>
+              <w:rPr>
+                <w:sz w:val="20"/>
+                <w:szCs w:val="20"/>
+              </w:rPr>
+              <w:t xml:space="preserve">4</w:t>
+            </w:r>
+          </w:p>
+        </w:tc>
+        <w:tc>
+          <w:tcPr>
+            <w:tcW w:w="2041" w:type="dxa"/>
+          </w:tcPr>
+          <w:p>
+            <w:pPr>
+              <w:rPr>
+                <w:sz w:val="20"/>
+                <w:szCs w:val="20"/>
+                <w:lang w:val="de-DE"/>
+              </w:rPr>
+            </w:pPr>
+            <w:r>
+              <w:rPr>
+                <w:sz w:val="20"/>
+                <w:szCs w:val="20"/>
+              </w:rPr>
+              <w:t xml:space="preserve">CLPESG60</w:t>
+            </w:r>
+            <w:proofErr w:type="spellStart"/>
+            <w:r>
+              <w:rPr>
+                <w:sz w:val="20"/>
+                <w:szCs w:val="20"/>
+              </w:rPr>
+              <w:t/>
+            </w:r>
+            <w:proofErr w:type="spellEnd"/>
+            <w:r>
+              <w:rPr>
+                <w:sz w:val="20"/>
+                <w:szCs w:val="20"/>
+              </w:rPr>
+              <w:t/>
+            </w:r>
+          </w:p>
+        </w:tc>
+        <w:tc>
+          <w:tcPr>
+            <w:tcW w:w="1440" w:type="dxa"/>
+          </w:tcPr>
+          <w:p>
+            <w:pPr>
+              <w:rPr>
+                <w:sz w:val="20"/>
+                <w:szCs w:val="20"/>
+                <w:lang w:val="de-DE"/>
+              </w:rPr>
+            </w:pPr>
+            <w:r>
+              <w:rPr>
+                <w:sz w:val="20"/>
+                <w:szCs w:val="20"/>
+              </w:rPr>
+              <w:t xml:space="preserve">Haltegriff clivia V2 plus 600mm m. Ros. Edelstahl glatt poliert,VIGOUR</w:t>
+            </w:r>
+            <w:proofErr w:type="spellStart"/>
+            <w:r>
+              <w:rPr>
+                <w:sz w:val="20"/>
+                <w:szCs w:val="20"/>
+              </w:rPr>
+              <w:t/>
+            </w:r>
+            <w:proofErr w:type="spellEnd"/>
+            <w:r>
+              <w:rPr>
+                <w:sz w:val="20"/>
+                <w:szCs w:val="20"/>
+              </w:rPr>
+              <w:t/>
+            </w:r>
+          </w:p>
+        </w:tc>
+        <w:tc>
+          <w:tcPr>
+            <w:tcW w:w="853" w:type="dxa"/>
+          </w:tcPr>
+          <w:p>
+            <w:pPr>
+              <w:rPr>
+                <w:sz w:val="20"/>
+                <w:szCs w:val="20"/>
+                <w:lang w:val="de-DE"/>
+              </w:rPr>
+            </w:pPr>
+            <w:r>
+              <w:rPr>
+                <w:sz w:val="20"/>
+                <w:szCs w:val="20"/>
+              </w:rPr>
+              <w:t xml:space="preserve">1</w:t>
+            </w:r>
+            <w:proofErr w:type="spellStart"/>
+            <w:r>
+              <w:rPr>
+                <w:sz w:val="20"/>
+                <w:szCs w:val="20"/>
+              </w:rPr>
+              <w:t/>
+            </w:r>
+            <w:proofErr w:type="spellEnd"/>
+            <w:r>
+              <w:rPr>
+                <w:sz w:val="20"/>
+                <w:szCs w:val="20"/>
+              </w:rPr>
+              <w:t/>
+            </w:r>
+          </w:p>
+        </w:tc>
+        <w:tc>
+          <w:tcPr>
+            <w:tcW w:w="878" w:type="dxa"/>
+          </w:tcPr>
+          <w:p>
+            <w:pPr>
+              <w:rPr>
+                <w:sz w:val="20"/>
+                <w:szCs w:val="20"/>
+                <w:lang w:val="de-DE"/>
+              </w:rPr>
+            </w:pPr>
+            <w:r>
+              <w:rPr>
+                <w:sz w:val="20"/>
+                <w:szCs w:val="20"/>
+              </w:rPr>
+              <w:t xml:space="preserve">Stck.</w:t>
+            </w:r>
+          </w:p>
+        </w:tc>
+        <w:tc>
+          <w:tcPr>
+            <w:tcW w:w="1303" w:type="dxa"/>
+          </w:tcPr>
+          <w:p>
+            <w:pPr>
+              <w:rPr>
+                <w:sz w:val="20"/>
+                <w:szCs w:val="20"/>
+                <w:lang w:val="de-DE"/>
+              </w:rPr>
+            </w:pPr>
+            <w:r>
+              <w:rPr>
+                <w:sz w:val="20"/>
+                <w:szCs w:val="20"/>
+              </w:rPr>
+              <w:t/>
+            </w:r>
+            <w:proofErr w:type="spellStart"/>
+            <w:r>
+              <w:rPr>
+                <w:sz w:val="20"/>
+                <w:szCs w:val="20"/>
+              </w:rPr>
+              <w:t/>
+            </w:r>
+            <w:proofErr w:type="spellEnd"/>
+            <w:r>
+              <w:rPr>
+                <w:sz w:val="20"/>
+                <w:szCs w:val="20"/>
+              </w:rPr>
+              <w:t/>
+            </w:r>
+          </w:p>
+        </w:tc>
+      </w:tr>
+      <w:tr>
+        <w:tc>
+          <w:tcPr>
+            <w:tcW w:w="2836" w:type="dxa"/>
+          </w:tcPr>
+          <w:p>
+            <w:pPr>
+              <w:rPr>
+                <w:sz w:val="20"/>
+                <w:szCs w:val="20"/>
+                <w:lang w:val="de-DE"/>
+              </w:rPr>
+            </w:pPr>
+            <w:r>
+              <w:rPr>
+                <w:sz w:val="20"/>
+                <w:szCs w:val="20"/>
+              </w:rPr>
+              <w:t xml:space="preserve">5</w:t>
+            </w:r>
+          </w:p>
+        </w:tc>
+        <w:tc>
+          <w:tcPr>
+            <w:tcW w:w="2041" w:type="dxa"/>
+          </w:tcPr>
+          <w:p>
+            <w:pPr>
+              <w:rPr>
+                <w:sz w:val="20"/>
+                <w:szCs w:val="20"/>
+                <w:lang w:val="de-DE"/>
+              </w:rPr>
+            </w:pPr>
+            <w:r>
+              <w:rPr>
+                <w:sz w:val="20"/>
+                <w:szCs w:val="20"/>
+              </w:rPr>
+              <w:t xml:space="preserve">CLPWWCOS5</w:t>
+            </w:r>
+            <w:proofErr w:type="spellStart"/>
+            <w:r>
+              <w:rPr>
+                <w:sz w:val="20"/>
+                <w:szCs w:val="20"/>
+              </w:rPr>
+              <w:t/>
+            </w:r>
+            <w:proofErr w:type="spellEnd"/>
+            <w:r>
+              <w:rPr>
+                <w:sz w:val="20"/>
+                <w:szCs w:val="20"/>
+              </w:rPr>
+              <w:t/>
+            </w:r>
+          </w:p>
+        </w:tc>
+        <w:tc>
+          <w:tcPr>
+            <w:tcW w:w="1440" w:type="dxa"/>
+          </w:tcPr>
+          <w:p>
+            <w:pPr>
+              <w:rPr>
+                <w:sz w:val="20"/>
+                <w:szCs w:val="20"/>
+                <w:lang w:val="de-DE"/>
+              </w:rPr>
+            </w:pPr>
+            <w:r>
+              <w:rPr>
+                <w:sz w:val="20"/>
+                <w:szCs w:val="20"/>
+              </w:rPr>
+              <w:t xml:space="preserve">Wand-Tiefspül-WC clivia V2 plus +5cm ohne Spülrand 54 cm weiss VIGOUR</w:t>
+            </w:r>
+            <w:proofErr w:type="spellStart"/>
+            <w:r>
+              <w:rPr>
+                <w:sz w:val="20"/>
+                <w:szCs w:val="20"/>
+              </w:rPr>
+              <w:t/>
+            </w:r>
+            <w:proofErr w:type="spellEnd"/>
+            <w:r>
+              <w:rPr>
+                <w:sz w:val="20"/>
+                <w:szCs w:val="20"/>
+              </w:rPr>
+              <w:t/>
+            </w:r>
+          </w:p>
+        </w:tc>
+        <w:tc>
+          <w:tcPr>
+            <w:tcW w:w="853" w:type="dxa"/>
+          </w:tcPr>
+          <w:p>
+            <w:pPr>
+              <w:rPr>
+                <w:sz w:val="20"/>
+                <w:szCs w:val="20"/>
+                <w:lang w:val="de-DE"/>
+              </w:rPr>
+            </w:pPr>
+            <w:r>
+              <w:rPr>
+                <w:sz w:val="20"/>
+                <w:szCs w:val="20"/>
+              </w:rPr>
+              <w:t xml:space="preserve">1</w:t>
+            </w:r>
+            <w:proofErr w:type="spellStart"/>
+            <w:r>
+              <w:rPr>
+                <w:sz w:val="20"/>
+                <w:szCs w:val="20"/>
+              </w:rPr>
+              <w:t/>
+            </w:r>
+            <w:proofErr w:type="spellEnd"/>
+            <w:r>
+              <w:rPr>
+                <w:sz w:val="20"/>
+                <w:szCs w:val="20"/>
+              </w:rPr>
+              <w:t/>
+            </w:r>
+          </w:p>
+        </w:tc>
+        <w:tc>
+          <w:tcPr>
+            <w:tcW w:w="878" w:type="dxa"/>
+          </w:tcPr>
+          <w:p>
+            <w:pPr>
+              <w:rPr>
+                <w:sz w:val="20"/>
+                <w:szCs w:val="20"/>
+                <w:lang w:val="de-DE"/>
+              </w:rPr>
+            </w:pPr>
+            <w:r>
+              <w:rPr>
+                <w:sz w:val="20"/>
+                <w:szCs w:val="20"/>
+              </w:rPr>
+              <w:t xml:space="preserve">Stck.</w:t>
+            </w:r>
+          </w:p>
+        </w:tc>
+        <w:tc>
+          <w:tcPr>
+            <w:tcW w:w="1303" w:type="dxa"/>
+          </w:tcPr>
+          <w:p>
+            <w:pPr>
+              <w:rPr>
+                <w:sz w:val="20"/>
+                <w:szCs w:val="20"/>
+                <w:lang w:val="de-DE"/>
+              </w:rPr>
+            </w:pPr>
+            <w:r>
+              <w:rPr>
+                <w:sz w:val="20"/>
+                <w:szCs w:val="20"/>
+              </w:rPr>
+              <w:t/>
+            </w:r>
+            <w:proofErr w:type="spellStart"/>
+            <w:r>
+              <w:rPr>
+                <w:sz w:val="20"/>
+                <w:szCs w:val="20"/>
+              </w:rPr>
+              <w:t/>
+            </w:r>
+            <w:proofErr w:type="spellEnd"/>
+            <w:r>
+              <w:rPr>
+                <w:sz w:val="20"/>
+                <w:szCs w:val="20"/>
+              </w:rPr>
+              <w:t/>
+            </w:r>
+          </w:p>
+        </w:tc>
+      </w:tr>
+      <w:tr>
+        <w:tc>
+          <w:tcPr>
+            <w:tcW w:w="2836" w:type="dxa"/>
+          </w:tcPr>
+          <w:p>
+            <w:pPr>
+              <w:rPr>
+                <w:sz w:val="20"/>
+                <w:szCs w:val="20"/>
+                <w:lang w:val="de-DE"/>
+              </w:rPr>
+            </w:pPr>
+            <w:r>
+              <w:rPr>
+                <w:sz w:val="20"/>
+                <w:szCs w:val="20"/>
+              </w:rPr>
+              <w:t xml:space="preserve">6</w:t>
+            </w:r>
+          </w:p>
+        </w:tc>
+        <w:tc>
+          <w:tcPr>
+            <w:tcW w:w="2041" w:type="dxa"/>
+          </w:tcPr>
+          <w:p>
+            <w:pPr>
+              <w:rPr>
+                <w:sz w:val="20"/>
+                <w:szCs w:val="20"/>
+                <w:lang w:val="de-DE"/>
+              </w:rPr>
+            </w:pPr>
+            <w:r>
+              <w:rPr>
+                <w:sz w:val="20"/>
+                <w:szCs w:val="20"/>
+              </w:rPr>
+              <w:t xml:space="preserve">CLSIAS</w:t>
+            </w:r>
+            <w:proofErr w:type="spellStart"/>
+            <w:r>
+              <w:rPr>
+                <w:sz w:val="20"/>
+                <w:szCs w:val="20"/>
+              </w:rPr>
+              <w:t/>
+            </w:r>
+            <w:proofErr w:type="spellEnd"/>
+            <w:r>
+              <w:rPr>
+                <w:sz w:val="20"/>
+                <w:szCs w:val="20"/>
+              </w:rPr>
+              <w:t/>
+            </w:r>
+          </w:p>
+        </w:tc>
+        <w:tc>
+          <w:tcPr>
+            <w:tcW w:w="1440" w:type="dxa"/>
+          </w:tcPr>
+          <w:p>
+            <w:pPr>
+              <w:rPr>
+                <w:sz w:val="20"/>
+                <w:szCs w:val="20"/>
+                <w:lang w:val="de-DE"/>
+              </w:rPr>
+            </w:pPr>
+            <w:r>
+              <w:rPr>
+                <w:sz w:val="20"/>
+                <w:szCs w:val="20"/>
+              </w:rPr>
+              <w:t xml:space="preserve">WC-Sitz V2 clivia Edelstahl Scharnier abnehmbar m.Absenkaut. weiss VIGOUR</w:t>
+            </w:r>
+            <w:proofErr w:type="spellStart"/>
+            <w:r>
+              <w:rPr>
+                <w:sz w:val="20"/>
+                <w:szCs w:val="20"/>
+              </w:rPr>
+              <w:t/>
+            </w:r>
+            <w:proofErr w:type="spellEnd"/>
+            <w:r>
+              <w:rPr>
+                <w:sz w:val="20"/>
+                <w:szCs w:val="20"/>
+              </w:rPr>
+              <w:t/>
+            </w:r>
+          </w:p>
+        </w:tc>
+        <w:tc>
+          <w:tcPr>
+            <w:tcW w:w="853" w:type="dxa"/>
+          </w:tcPr>
+          <w:p>
+            <w:pPr>
+              <w:rPr>
+                <w:sz w:val="20"/>
+                <w:szCs w:val="20"/>
+                <w:lang w:val="de-DE"/>
+              </w:rPr>
+            </w:pPr>
+            <w:r>
+              <w:rPr>
+                <w:sz w:val="20"/>
+                <w:szCs w:val="20"/>
+              </w:rPr>
+              <w:t xml:space="preserve">1</w:t>
+            </w:r>
+            <w:proofErr w:type="spellStart"/>
+            <w:r>
+              <w:rPr>
+                <w:sz w:val="20"/>
+                <w:szCs w:val="20"/>
+              </w:rPr>
+              <w:t/>
+            </w:r>
+            <w:proofErr w:type="spellEnd"/>
+            <w:r>
+              <w:rPr>
+                <w:sz w:val="20"/>
+                <w:szCs w:val="20"/>
+              </w:rPr>
+              <w:t/>
+            </w:r>
+          </w:p>
+        </w:tc>
+        <w:tc>
+          <w:tcPr>
+            <w:tcW w:w="878" w:type="dxa"/>
+          </w:tcPr>
+          <w:p>
+            <w:pPr>
+              <w:rPr>
+                <w:sz w:val="20"/>
+                <w:szCs w:val="20"/>
+                <w:lang w:val="de-DE"/>
+              </w:rPr>
+            </w:pPr>
+            <w:r>
+              <w:rPr>
+                <w:sz w:val="20"/>
+                <w:szCs w:val="20"/>
+              </w:rPr>
+              <w:t xml:space="preserve">Stck.</w:t>
+            </w:r>
+          </w:p>
+        </w:tc>
+        <w:tc>
+          <w:tcPr>
+            <w:tcW w:w="1303" w:type="dxa"/>
+          </w:tcPr>
+          <w:p>
+            <w:pPr>
+              <w:rPr>
+                <w:sz w:val="20"/>
+                <w:szCs w:val="20"/>
+                <w:lang w:val="de-DE"/>
+              </w:rPr>
+            </w:pPr>
+            <w:r>
+              <w:rPr>
+                <w:sz w:val="20"/>
+                <w:szCs w:val="20"/>
+              </w:rPr>
+              <w:t/>
+            </w:r>
+            <w:proofErr w:type="spellStart"/>
+            <w:r>
+              <w:rPr>
+                <w:sz w:val="20"/>
+                <w:szCs w:val="20"/>
+              </w:rPr>
+              <w:t/>
+            </w:r>
+            <w:proofErr w:type="spellEnd"/>
+            <w:r>
+              <w:rPr>
+                <w:sz w:val="20"/>
+                <w:szCs w:val="20"/>
+              </w:rPr>
+              <w:t/>
+            </w:r>
+          </w:p>
+        </w:tc>
+      </w:tr>
+      <w:tr>
+        <w:tc>
+          <w:tcPr>
+            <w:tcW w:w="2836" w:type="dxa"/>
+          </w:tcPr>
+          <w:p>
+            <w:pPr>
+              <w:rPr>
+                <w:sz w:val="20"/>
+                <w:szCs w:val="20"/>
+                <w:lang w:val="de-DE"/>
+              </w:rPr>
+            </w:pPr>
+            <w:r>
+              <w:rPr>
+                <w:sz w:val="20"/>
+                <w:szCs w:val="20"/>
+              </w:rPr>
+              <w:t xml:space="preserve">7</w:t>
+            </w:r>
+          </w:p>
+        </w:tc>
+        <w:tc>
+          <w:tcPr>
+            <w:tcW w:w="2041" w:type="dxa"/>
+          </w:tcPr>
+          <w:p>
+            <w:pPr>
+              <w:rPr>
+                <w:sz w:val="20"/>
+                <w:szCs w:val="20"/>
+                <w:lang w:val="de-DE"/>
+              </w:rPr>
+            </w:pPr>
+            <w:r>
+              <w:rPr>
+                <w:sz w:val="20"/>
+                <w:szCs w:val="20"/>
+              </w:rPr>
+              <w:t xml:space="preserve">CVIS3WCT112</w:t>
+            </w:r>
+            <w:proofErr w:type="spellStart"/>
+            <w:r>
+              <w:rPr>
+                <w:sz w:val="20"/>
+                <w:szCs w:val="20"/>
+              </w:rPr>
+              <w:t/>
+            </w:r>
+            <w:proofErr w:type="spellEnd"/>
+            <w:r>
+              <w:rPr>
+                <w:sz w:val="20"/>
+                <w:szCs w:val="20"/>
+              </w:rPr>
+              <w:t/>
+            </w:r>
+          </w:p>
+        </w:tc>
+        <w:tc>
+          <w:tcPr>
+            <w:tcW w:w="1440" w:type="dxa"/>
+          </w:tcPr>
+          <w:p>
+            <w:pPr>
+              <w:rPr>
+                <w:sz w:val="20"/>
+                <w:szCs w:val="20"/>
+                <w:lang w:val="de-DE"/>
+              </w:rPr>
+            </w:pPr>
+            <w:r>
+              <w:rPr>
+                <w:sz w:val="20"/>
+                <w:szCs w:val="20"/>
+              </w:rPr>
+              <w:t xml:space="preserve">VIS WC-Element E3 f. Trockenbau, m. UP- Spülkasten, Fresh-Box, BH: 1120mm, CONEL</w:t>
+            </w:r>
+            <w:proofErr w:type="spellStart"/>
+            <w:r>
+              <w:rPr>
+                <w:sz w:val="20"/>
+                <w:szCs w:val="20"/>
+              </w:rPr>
+              <w:t/>
+            </w:r>
+            <w:proofErr w:type="spellEnd"/>
+            <w:r>
+              <w:rPr>
+                <w:sz w:val="20"/>
+                <w:szCs w:val="20"/>
+              </w:rPr>
+              <w:t/>
+            </w:r>
+          </w:p>
+        </w:tc>
+        <w:tc>
+          <w:tcPr>
+            <w:tcW w:w="853" w:type="dxa"/>
+          </w:tcPr>
+          <w:p>
+            <w:pPr>
+              <w:rPr>
+                <w:sz w:val="20"/>
+                <w:szCs w:val="20"/>
+                <w:lang w:val="de-DE"/>
+              </w:rPr>
+            </w:pPr>
+            <w:r>
+              <w:rPr>
+                <w:sz w:val="20"/>
+                <w:szCs w:val="20"/>
+              </w:rPr>
+              <w:t xml:space="preserve">1</w:t>
+            </w:r>
+            <w:proofErr w:type="spellStart"/>
+            <w:r>
+              <w:rPr>
+                <w:sz w:val="20"/>
+                <w:szCs w:val="20"/>
+              </w:rPr>
+              <w:t/>
+            </w:r>
+            <w:proofErr w:type="spellEnd"/>
+            <w:r>
+              <w:rPr>
+                <w:sz w:val="20"/>
+                <w:szCs w:val="20"/>
+              </w:rPr>
+              <w:t/>
+            </w:r>
+          </w:p>
+        </w:tc>
+        <w:tc>
+          <w:tcPr>
+            <w:tcW w:w="878" w:type="dxa"/>
+          </w:tcPr>
+          <w:p>
+            <w:pPr>
+              <w:rPr>
+                <w:sz w:val="20"/>
+                <w:szCs w:val="20"/>
+                <w:lang w:val="de-DE"/>
+              </w:rPr>
+            </w:pPr>
+            <w:r>
+              <w:rPr>
+                <w:sz w:val="20"/>
+                <w:szCs w:val="20"/>
+              </w:rPr>
+              <w:t xml:space="preserve">Stck.</w:t>
+            </w:r>
+          </w:p>
+        </w:tc>
+        <w:tc>
+          <w:tcPr>
+            <w:tcW w:w="1303" w:type="dxa"/>
+          </w:tcPr>
+          <w:p>
+            <w:pPr>
+              <w:rPr>
+                <w:sz w:val="20"/>
+                <w:szCs w:val="20"/>
+                <w:lang w:val="de-DE"/>
+              </w:rPr>
+            </w:pPr>
+            <w:r>
+              <w:rPr>
+                <w:sz w:val="20"/>
+                <w:szCs w:val="20"/>
+              </w:rPr>
+              <w:t/>
+            </w:r>
+            <w:proofErr w:type="spellStart"/>
+            <w:r>
+              <w:rPr>
+                <w:sz w:val="20"/>
+                <w:szCs w:val="20"/>
+              </w:rPr>
+              <w:t/>
+            </w:r>
+            <w:proofErr w:type="spellEnd"/>
+            <w:r>
+              <w:rPr>
+                <w:sz w:val="20"/>
+                <w:szCs w:val="20"/>
+              </w:rPr>
+              <w:t/>
+            </w:r>
+          </w:p>
+        </w:tc>
+      </w:tr>
+      <w:tr>
+        <w:tc>
+          <w:tcPr>
+            <w:tcW w:w="2836" w:type="dxa"/>
+          </w:tcPr>
+          <w:p>
+            <w:pPr>
+              <w:rPr>
+                <w:sz w:val="20"/>
+                <w:szCs w:val="20"/>
+                <w:lang w:val="de-DE"/>
+              </w:rPr>
+            </w:pPr>
+            <w:r>
+              <w:rPr>
+                <w:sz w:val="20"/>
+                <w:szCs w:val="20"/>
+              </w:rPr>
+              <w:t xml:space="preserve">8</w:t>
+            </w:r>
+          </w:p>
+        </w:tc>
+        <w:tc>
+          <w:tcPr>
+            <w:tcW w:w="2041" w:type="dxa"/>
+          </w:tcPr>
+          <w:p>
+            <w:pPr>
+              <w:rPr>
+                <w:sz w:val="20"/>
+                <w:szCs w:val="20"/>
+                <w:lang w:val="de-DE"/>
+              </w:rPr>
+            </w:pPr>
+            <w:r>
+              <w:rPr>
+                <w:sz w:val="20"/>
+                <w:szCs w:val="20"/>
+              </w:rPr>
+              <w:t xml:space="preserve">DEDS2503E</w:t>
+            </w:r>
+            <w:proofErr w:type="spellStart"/>
+            <w:r>
+              <w:rPr>
+                <w:sz w:val="20"/>
+                <w:szCs w:val="20"/>
+              </w:rPr>
+              <w:t/>
+            </w:r>
+            <w:proofErr w:type="spellEnd"/>
+            <w:r>
+              <w:rPr>
+                <w:sz w:val="20"/>
+                <w:szCs w:val="20"/>
+              </w:rPr>
+              <w:t/>
+            </w:r>
+          </w:p>
+        </w:tc>
+        <w:tc>
+          <w:tcPr>
+            <w:tcW w:w="1440" w:type="dxa"/>
+          </w:tcPr>
+          <w:p>
+            <w:pPr>
+              <w:rPr>
+                <w:sz w:val="20"/>
+                <w:szCs w:val="20"/>
+                <w:lang w:val="de-DE"/>
+              </w:rPr>
+            </w:pPr>
+            <w:r>
+              <w:rPr>
+                <w:sz w:val="20"/>
+                <w:szCs w:val="20"/>
+              </w:rPr>
+              <w:t xml:space="preserve">Duschsystem derby Thermostat m KB 250mm HB 3.2 3-fach edge u. Schl. verchr. VIG</w:t>
+            </w:r>
+            <w:proofErr w:type="spellStart"/>
+            <w:r>
+              <w:rPr>
+                <w:sz w:val="20"/>
+                <w:szCs w:val="20"/>
+              </w:rPr>
+              <w:t/>
+            </w:r>
+            <w:proofErr w:type="spellEnd"/>
+            <w:r>
+              <w:rPr>
+                <w:sz w:val="20"/>
+                <w:szCs w:val="20"/>
+              </w:rPr>
+              <w:t/>
+            </w:r>
+          </w:p>
+        </w:tc>
+        <w:tc>
+          <w:tcPr>
+            <w:tcW w:w="853" w:type="dxa"/>
+          </w:tcPr>
+          <w:p>
+            <w:pPr>
+              <w:rPr>
+                <w:sz w:val="20"/>
+                <w:szCs w:val="20"/>
+                <w:lang w:val="de-DE"/>
+              </w:rPr>
+            </w:pPr>
+            <w:r>
+              <w:rPr>
+                <w:sz w:val="20"/>
+                <w:szCs w:val="20"/>
+              </w:rPr>
+              <w:t xml:space="preserve">1</w:t>
+            </w:r>
+            <w:proofErr w:type="spellStart"/>
+            <w:r>
+              <w:rPr>
+                <w:sz w:val="20"/>
+                <w:szCs w:val="20"/>
+              </w:rPr>
+              <w:t/>
+            </w:r>
+            <w:proofErr w:type="spellEnd"/>
+            <w:r>
+              <w:rPr>
+                <w:sz w:val="20"/>
+                <w:szCs w:val="20"/>
+              </w:rPr>
+              <w:t/>
+            </w:r>
+          </w:p>
+        </w:tc>
+        <w:tc>
+          <w:tcPr>
+            <w:tcW w:w="878" w:type="dxa"/>
+          </w:tcPr>
+          <w:p>
+            <w:pPr>
+              <w:rPr>
+                <w:sz w:val="20"/>
+                <w:szCs w:val="20"/>
+                <w:lang w:val="de-DE"/>
+              </w:rPr>
+            </w:pPr>
+            <w:r>
+              <w:rPr>
+                <w:sz w:val="20"/>
+                <w:szCs w:val="20"/>
+              </w:rPr>
+              <w:t xml:space="preserve">Stck.</w:t>
+            </w:r>
+          </w:p>
+        </w:tc>
+        <w:tc>
+          <w:tcPr>
+            <w:tcW w:w="1303" w:type="dxa"/>
+          </w:tcPr>
+          <w:p>
+            <w:pPr>
+              <w:rPr>
+                <w:sz w:val="20"/>
+                <w:szCs w:val="20"/>
+                <w:lang w:val="de-DE"/>
+              </w:rPr>
+            </w:pPr>
+            <w:r>
+              <w:rPr>
+                <w:sz w:val="20"/>
+                <w:szCs w:val="20"/>
+              </w:rPr>
+              <w:t/>
+            </w:r>
+            <w:proofErr w:type="spellStart"/>
+            <w:r>
+              <w:rPr>
+                <w:sz w:val="20"/>
+                <w:szCs w:val="20"/>
+              </w:rPr>
+              <w:t/>
+            </w:r>
+            <w:proofErr w:type="spellEnd"/>
+            <w:r>
+              <w:rPr>
+                <w:sz w:val="20"/>
+                <w:szCs w:val="20"/>
+              </w:rPr>
+              <w:t/>
+            </w:r>
+          </w:p>
+        </w:tc>
+      </w:tr>
+      <w:tr>
+        <w:tc>
+          <w:tcPr>
+            <w:tcW w:w="2836" w:type="dxa"/>
+          </w:tcPr>
+          <w:p>
+            <w:pPr>
+              <w:rPr>
+                <w:sz w:val="20"/>
+                <w:szCs w:val="20"/>
+                <w:lang w:val="de-DE"/>
+              </w:rPr>
+            </w:pPr>
+            <w:r>
+              <w:rPr>
+                <w:sz w:val="20"/>
+                <w:szCs w:val="20"/>
+              </w:rPr>
+              <w:t xml:space="preserve">9</w:t>
+            </w:r>
+          </w:p>
+        </w:tc>
+        <w:tc>
+          <w:tcPr>
+            <w:tcW w:w="2041" w:type="dxa"/>
+          </w:tcPr>
+          <w:p>
+            <w:pPr>
+              <w:rPr>
+                <w:sz w:val="20"/>
+                <w:szCs w:val="20"/>
+                <w:lang w:val="de-DE"/>
+              </w:rPr>
+            </w:pPr>
+            <w:r>
+              <w:rPr>
+                <w:sz w:val="20"/>
+                <w:szCs w:val="20"/>
+              </w:rPr>
+              <w:t xml:space="preserve">DWAHODU0601</w:t>
+            </w:r>
+            <w:proofErr w:type="spellStart"/>
+            <w:r>
+              <w:rPr>
+                <w:sz w:val="20"/>
+                <w:szCs w:val="20"/>
+              </w:rPr>
+              <w:t/>
+            </w:r>
+            <w:proofErr w:type="spellEnd"/>
+            <w:r>
+              <w:rPr>
+                <w:sz w:val="20"/>
+                <w:szCs w:val="20"/>
+              </w:rPr>
+              <w:t/>
+            </w:r>
+          </w:p>
+        </w:tc>
+        <w:tc>
+          <w:tcPr>
+            <w:tcW w:w="1440" w:type="dxa"/>
+          </w:tcPr>
+          <w:p>
+            <w:pPr>
+              <w:rPr>
+                <w:sz w:val="20"/>
+                <w:szCs w:val="20"/>
+                <w:lang w:val="de-DE"/>
+              </w:rPr>
+            </w:pPr>
+            <w:r>
+              <w:rPr>
+                <w:sz w:val="20"/>
+                <w:szCs w:val="20"/>
+              </w:rPr>
+              <w:t xml:space="preserve">Duschwanne 1400x1400x30 mm HO DW Muna S mit Antirutsch, Material Solique, Weiß</w:t>
+            </w:r>
+            <w:proofErr w:type="spellStart"/>
+            <w:r>
+              <w:rPr>
+                <w:sz w:val="20"/>
+                <w:szCs w:val="20"/>
+              </w:rPr>
+              <w:t/>
+            </w:r>
+            <w:proofErr w:type="spellEnd"/>
+            <w:r>
+              <w:rPr>
+                <w:sz w:val="20"/>
+                <w:szCs w:val="20"/>
+              </w:rPr>
+              <w:t/>
+            </w:r>
+          </w:p>
+        </w:tc>
+        <w:tc>
+          <w:tcPr>
+            <w:tcW w:w="853" w:type="dxa"/>
+          </w:tcPr>
+          <w:p>
+            <w:pPr>
+              <w:rPr>
+                <w:sz w:val="20"/>
+                <w:szCs w:val="20"/>
+                <w:lang w:val="de-DE"/>
+              </w:rPr>
+            </w:pPr>
+            <w:r>
+              <w:rPr>
+                <w:sz w:val="20"/>
+                <w:szCs w:val="20"/>
+              </w:rPr>
+              <w:t xml:space="preserve">1</w:t>
+            </w:r>
+            <w:proofErr w:type="spellStart"/>
+            <w:r>
+              <w:rPr>
+                <w:sz w:val="20"/>
+                <w:szCs w:val="20"/>
+              </w:rPr>
+              <w:t/>
+            </w:r>
+            <w:proofErr w:type="spellEnd"/>
+            <w:r>
+              <w:rPr>
+                <w:sz w:val="20"/>
+                <w:szCs w:val="20"/>
+              </w:rPr>
+              <w:t/>
+            </w:r>
+          </w:p>
+        </w:tc>
+        <w:tc>
+          <w:tcPr>
+            <w:tcW w:w="878" w:type="dxa"/>
+          </w:tcPr>
+          <w:p>
+            <w:pPr>
+              <w:rPr>
+                <w:sz w:val="20"/>
+                <w:szCs w:val="20"/>
+                <w:lang w:val="de-DE"/>
+              </w:rPr>
+            </w:pPr>
+            <w:r>
+              <w:rPr>
+                <w:sz w:val="20"/>
+                <w:szCs w:val="20"/>
+              </w:rPr>
+              <w:t xml:space="preserve">Stck.</w:t>
+            </w:r>
+          </w:p>
+        </w:tc>
+        <w:tc>
+          <w:tcPr>
+            <w:tcW w:w="1303" w:type="dxa"/>
+          </w:tcPr>
+          <w:p>
+            <w:pPr>
+              <w:rPr>
+                <w:sz w:val="20"/>
+                <w:szCs w:val="20"/>
+                <w:lang w:val="de-DE"/>
+              </w:rPr>
+            </w:pPr>
+            <w:r>
+              <w:rPr>
+                <w:sz w:val="20"/>
+                <w:szCs w:val="20"/>
+              </w:rPr>
+              <w:t/>
+            </w:r>
+            <w:proofErr w:type="spellStart"/>
+            <w:r>
+              <w:rPr>
+                <w:sz w:val="20"/>
+                <w:szCs w:val="20"/>
+              </w:rPr>
+              <w:t/>
+            </w:r>
+            <w:proofErr w:type="spellEnd"/>
+            <w:r>
+              <w:rPr>
+                <w:sz w:val="20"/>
+                <w:szCs w:val="20"/>
+              </w:rPr>
+              <w:t/>
+            </w:r>
+          </w:p>
+        </w:tc>
+      </w:tr>
+      <w:tr>
+        <w:tc>
+          <w:tcPr>
+            <w:tcW w:w="2836" w:type="dxa"/>
+          </w:tcPr>
+          <w:p>
+            <w:pPr>
+              <w:rPr>
+                <w:sz w:val="20"/>
+                <w:szCs w:val="20"/>
+                <w:lang w:val="de-DE"/>
+              </w:rPr>
+            </w:pPr>
+            <w:r>
+              <w:rPr>
+                <w:sz w:val="20"/>
+                <w:szCs w:val="20"/>
+              </w:rPr>
+              <w:t xml:space="preserve">10</w:t>
+            </w:r>
+          </w:p>
+        </w:tc>
+        <w:tc>
+          <w:tcPr>
+            <w:tcW w:w="2041" w:type="dxa"/>
+          </w:tcPr>
+          <w:p>
+            <w:pPr>
+              <w:rPr>
+                <w:sz w:val="20"/>
+                <w:szCs w:val="20"/>
+                <w:lang w:val="de-DE"/>
+              </w:rPr>
+            </w:pPr>
+            <w:r>
+              <w:rPr>
+                <w:sz w:val="20"/>
+                <w:szCs w:val="20"/>
+              </w:rPr>
+              <w:t xml:space="preserve">KM02</w:t>
+            </w:r>
+            <w:proofErr w:type="spellStart"/>
+            <w:r>
+              <w:rPr>
+                <w:sz w:val="20"/>
+                <w:szCs w:val="20"/>
+              </w:rPr>
+              <w:t/>
+            </w:r>
+            <w:proofErr w:type="spellEnd"/>
+            <w:r>
+              <w:rPr>
+                <w:sz w:val="20"/>
+                <w:szCs w:val="20"/>
+              </w:rPr>
+              <w:t/>
+            </w:r>
+          </w:p>
+        </w:tc>
+        <w:tc>
+          <w:tcPr>
+            <w:tcW w:w="1440" w:type="dxa"/>
+          </w:tcPr>
+          <w:p>
+            <w:pPr>
+              <w:rPr>
+                <w:sz w:val="20"/>
+                <w:szCs w:val="20"/>
+                <w:lang w:val="de-DE"/>
+              </w:rPr>
+            </w:pPr>
+            <w:r>
+              <w:rPr>
+                <w:sz w:val="20"/>
+                <w:szCs w:val="20"/>
+              </w:rPr>
+              <w:t xml:space="preserve">Kleinmaterial</w:t>
+            </w:r>
+            <w:proofErr w:type="spellStart"/>
+            <w:r>
+              <w:rPr>
+                <w:sz w:val="20"/>
+                <w:szCs w:val="20"/>
+              </w:rPr>
+              <w:t/>
+            </w:r>
+            <w:proofErr w:type="spellEnd"/>
+            <w:r>
+              <w:rPr>
+                <w:sz w:val="20"/>
+                <w:szCs w:val="20"/>
+              </w:rPr>
+              <w:t/>
+            </w:r>
+          </w:p>
+        </w:tc>
+        <w:tc>
+          <w:tcPr>
+            <w:tcW w:w="853" w:type="dxa"/>
+          </w:tcPr>
+          <w:p>
+            <w:pPr>
+              <w:rPr>
+                <w:sz w:val="20"/>
+                <w:szCs w:val="20"/>
+                <w:lang w:val="de-DE"/>
+              </w:rPr>
+            </w:pPr>
+            <w:r>
+              <w:rPr>
+                <w:sz w:val="20"/>
+                <w:szCs w:val="20"/>
+              </w:rPr>
+              <w:t xml:space="preserve">1</w:t>
+            </w:r>
+            <w:proofErr w:type="spellStart"/>
+            <w:r>
+              <w:rPr>
+                <w:sz w:val="20"/>
+                <w:szCs w:val="20"/>
+              </w:rPr>
+              <w:t/>
+            </w:r>
+            <w:proofErr w:type="spellEnd"/>
+            <w:r>
+              <w:rPr>
+                <w:sz w:val="20"/>
+                <w:szCs w:val="20"/>
+              </w:rPr>
+              <w:t/>
+            </w:r>
+          </w:p>
+        </w:tc>
+        <w:tc>
+          <w:tcPr>
+            <w:tcW w:w="878" w:type="dxa"/>
+          </w:tcPr>
+          <w:p>
+            <w:pPr>
+              <w:rPr>
+                <w:sz w:val="20"/>
+                <w:szCs w:val="20"/>
+                <w:lang w:val="de-DE"/>
+              </w:rPr>
+            </w:pPr>
+            <w:r>
+              <w:rPr>
+                <w:sz w:val="20"/>
+                <w:szCs w:val="20"/>
+              </w:rPr>
+              <w:t xml:space="preserve">Stck.</w:t>
+            </w:r>
+          </w:p>
+        </w:tc>
+        <w:tc>
+          <w:tcPr>
+            <w:tcW w:w="1303" w:type="dxa"/>
+          </w:tcPr>
+          <w:p>
+            <w:pPr>
+              <w:rPr>
+                <w:sz w:val="20"/>
+                <w:szCs w:val="20"/>
+                <w:lang w:val="de-DE"/>
+              </w:rPr>
+            </w:pPr>
+            <w:r>
+              <w:rPr>
+                <w:sz w:val="20"/>
+                <w:szCs w:val="20"/>
+              </w:rPr>
+              <w:t/>
+            </w:r>
+            <w:proofErr w:type="spellStart"/>
+            <w:r>
+              <w:rPr>
+                <w:sz w:val="20"/>
+                <w:szCs w:val="20"/>
+              </w:rPr>
+              <w:t/>
+            </w:r>
+            <w:proofErr w:type="spellEnd"/>
+            <w:r>
+              <w:rPr>
+                <w:sz w:val="20"/>
+                <w:szCs w:val="20"/>
+              </w:rPr>
+              <w:t/>
+            </w:r>
+          </w:p>
+        </w:tc>
+      </w:tr>
+      <w:tr>
+        <w:tc>
+          <w:tcPr>
+            <w:tcW w:w="2836" w:type="dxa"/>
+          </w:tcPr>
+          <w:p>
+            <w:pPr>
+              <w:rPr>
+                <w:sz w:val="20"/>
+                <w:szCs w:val="20"/>
+                <w:lang w:val="de-DE"/>
+              </w:rPr>
+            </w:pPr>
+            <w:r>
+              <w:rPr>
+                <w:sz w:val="20"/>
+                <w:szCs w:val="20"/>
+              </w:rPr>
+              <w:t xml:space="preserve">11</w:t>
+            </w:r>
+          </w:p>
+        </w:tc>
+        <w:tc>
+          <w:tcPr>
+            <w:tcW w:w="2041" w:type="dxa"/>
+          </w:tcPr>
+          <w:p>
+            <w:pPr>
+              <w:rPr>
+                <w:sz w:val="20"/>
+                <w:szCs w:val="20"/>
+                <w:lang w:val="de-DE"/>
+              </w:rPr>
+            </w:pPr>
+            <w:r>
+              <w:rPr>
+                <w:sz w:val="20"/>
+                <w:szCs w:val="20"/>
+              </w:rPr>
+              <w:t xml:space="preserve">PLA5282</w:t>
+            </w:r>
+            <w:proofErr w:type="spellStart"/>
+            <w:r>
+              <w:rPr>
+                <w:sz w:val="20"/>
+                <w:szCs w:val="20"/>
+              </w:rPr>
+              <w:t/>
+            </w:r>
+            <w:proofErr w:type="spellEnd"/>
+            <w:r>
+              <w:rPr>
+                <w:sz w:val="20"/>
+                <w:szCs w:val="20"/>
+              </w:rPr>
+              <w:t/>
+            </w:r>
+          </w:p>
+        </w:tc>
+        <w:tc>
+          <w:tcPr>
+            <w:tcW w:w="1440" w:type="dxa"/>
+          </w:tcPr>
+          <w:p>
+            <w:pPr>
+              <w:rPr>
+                <w:sz w:val="20"/>
+                <w:szCs w:val="20"/>
+                <w:lang w:val="de-DE"/>
+              </w:rPr>
+            </w:pPr>
+            <w:r>
+              <w:rPr>
+                <w:sz w:val="20"/>
+                <w:szCs w:val="20"/>
+              </w:rPr>
+              <w:t xml:space="preserve">Stelzlager Pro justierbar 64–110 mm</w:t>
+            </w:r>
+            <w:proofErr w:type="spellStart"/>
+            <w:r>
+              <w:rPr>
+                <w:sz w:val="20"/>
+                <w:szCs w:val="20"/>
+              </w:rPr>
+              <w:t/>
+            </w:r>
+            <w:proofErr w:type="spellEnd"/>
+            <w:r>
+              <w:rPr>
+                <w:sz w:val="20"/>
+                <w:szCs w:val="20"/>
+              </w:rPr>
+              <w:t/>
+            </w:r>
+          </w:p>
+        </w:tc>
+        <w:tc>
+          <w:tcPr>
+            <w:tcW w:w="853" w:type="dxa"/>
+          </w:tcPr>
+          <w:p>
+            <w:pPr>
+              <w:rPr>
+                <w:sz w:val="20"/>
+                <w:szCs w:val="20"/>
+                <w:lang w:val="de-DE"/>
+              </w:rPr>
+            </w:pPr>
+            <w:r>
+              <w:rPr>
+                <w:sz w:val="20"/>
+                <w:szCs w:val="20"/>
+              </w:rPr>
+              <w:t xml:space="preserve">1</w:t>
+            </w:r>
+            <w:proofErr w:type="spellStart"/>
+            <w:r>
+              <w:rPr>
+                <w:sz w:val="20"/>
+                <w:szCs w:val="20"/>
+              </w:rPr>
+              <w:t/>
+            </w:r>
+            <w:proofErr w:type="spellEnd"/>
+            <w:r>
+              <w:rPr>
+                <w:sz w:val="20"/>
+                <w:szCs w:val="20"/>
+              </w:rPr>
+              <w:t/>
+            </w:r>
+          </w:p>
+        </w:tc>
+        <w:tc>
+          <w:tcPr>
+            <w:tcW w:w="878" w:type="dxa"/>
+          </w:tcPr>
+          <w:p>
+            <w:pPr>
+              <w:rPr>
+                <w:sz w:val="20"/>
+                <w:szCs w:val="20"/>
+                <w:lang w:val="de-DE"/>
+              </w:rPr>
+            </w:pPr>
+            <w:r>
+              <w:rPr>
+                <w:sz w:val="20"/>
+                <w:szCs w:val="20"/>
+              </w:rPr>
+              <w:t xml:space="preserve">Stck.</w:t>
+            </w:r>
+          </w:p>
+        </w:tc>
+        <w:tc>
+          <w:tcPr>
+            <w:tcW w:w="1303" w:type="dxa"/>
+          </w:tcPr>
+          <w:p>
+            <w:pPr>
+              <w:rPr>
+                <w:sz w:val="20"/>
+                <w:szCs w:val="20"/>
+                <w:lang w:val="de-DE"/>
+              </w:rPr>
+            </w:pPr>
+            <w:r>
+              <w:rPr>
+                <w:sz w:val="20"/>
+                <w:szCs w:val="20"/>
+              </w:rPr>
+              <w:t/>
+            </w:r>
+            <w:proofErr w:type="spellStart"/>
+            <w:r>
+              <w:rPr>
+                <w:sz w:val="20"/>
+                <w:szCs w:val="20"/>
+              </w:rPr>
+              <w:t/>
+            </w:r>
+            <w:proofErr w:type="spellEnd"/>
+            <w:r>
+              <w:rPr>
+                <w:sz w:val="20"/>
+                <w:szCs w:val="20"/>
+              </w:rPr>
+              <w:t/>
+            </w:r>
+          </w:p>
+        </w:tc>
+      </w:tr>
+      <w:tr>
+        <w:tc>
+          <w:tcPr>
+            <w:tcW w:w="2836" w:type="dxa"/>
+          </w:tcPr>
+          <w:p>
+            <w:pPr>
+              <w:rPr>
+                <w:sz w:val="20"/>
+                <w:szCs w:val="20"/>
+                <w:lang w:val="de-DE"/>
+              </w:rPr>
+            </w:pPr>
+            <w:r>
+              <w:rPr>
+                <w:sz w:val="20"/>
+                <w:szCs w:val="20"/>
+              </w:rPr>
+              <w:t xml:space="preserve">12</w:t>
+            </w:r>
+          </w:p>
+        </w:tc>
+        <w:tc>
+          <w:tcPr>
+            <w:tcW w:w="2041" w:type="dxa"/>
+          </w:tcPr>
+          <w:p>
+            <w:pPr>
+              <w:rPr>
+                <w:sz w:val="20"/>
+                <w:szCs w:val="20"/>
+                <w:lang w:val="de-DE"/>
+              </w:rPr>
+            </w:pPr>
+            <w:r>
+              <w:rPr>
+                <w:sz w:val="20"/>
+                <w:szCs w:val="20"/>
+              </w:rPr>
+              <w:t xml:space="preserve">R_4260602</w:t>
+            </w:r>
+            <w:proofErr w:type="spellStart"/>
+            <w:r>
+              <w:rPr>
+                <w:sz w:val="20"/>
+                <w:szCs w:val="20"/>
+              </w:rPr>
+              <w:t/>
+            </w:r>
+            <w:proofErr w:type="spellEnd"/>
+            <w:r>
+              <w:rPr>
+                <w:sz w:val="20"/>
+                <w:szCs w:val="20"/>
+              </w:rPr>
+              <w:t/>
+            </w:r>
+          </w:p>
+        </w:tc>
+        <w:tc>
+          <w:tcPr>
+            <w:tcW w:w="1440" w:type="dxa"/>
+          </w:tcPr>
+          <w:p>
+            <w:pPr>
+              <w:rPr>
+                <w:sz w:val="20"/>
+                <w:szCs w:val="20"/>
+                <w:lang w:val="de-DE"/>
+              </w:rPr>
+            </w:pPr>
+            <w:r>
+              <w:rPr>
+                <w:sz w:val="20"/>
+                <w:szCs w:val="20"/>
+              </w:rPr>
+              <w:t xml:space="preserve">Ramsauer 645 Flächen Kleber weiß 1K Hybrid Klebstoff 975g/600ml Beutel</w:t>
+            </w:r>
+            <w:proofErr w:type="spellStart"/>
+            <w:r>
+              <w:rPr>
+                <w:sz w:val="20"/>
+                <w:szCs w:val="20"/>
+              </w:rPr>
+              <w:t/>
+            </w:r>
+            <w:proofErr w:type="spellEnd"/>
+            <w:r>
+              <w:rPr>
+                <w:sz w:val="20"/>
+                <w:szCs w:val="20"/>
+              </w:rPr>
+              <w:t/>
+            </w:r>
+          </w:p>
+        </w:tc>
+        <w:tc>
+          <w:tcPr>
+            <w:tcW w:w="853" w:type="dxa"/>
+          </w:tcPr>
+          <w:p>
+            <w:pPr>
+              <w:rPr>
+                <w:sz w:val="20"/>
+                <w:szCs w:val="20"/>
+                <w:lang w:val="de-DE"/>
+              </w:rPr>
+            </w:pPr>
+            <w:r>
+              <w:rPr>
+                <w:sz w:val="20"/>
+                <w:szCs w:val="20"/>
+              </w:rPr>
+              <w:t xml:space="preserve">8</w:t>
+            </w:r>
+            <w:proofErr w:type="spellStart"/>
+            <w:r>
+              <w:rPr>
+                <w:sz w:val="20"/>
+                <w:szCs w:val="20"/>
+              </w:rPr>
+              <w:t/>
+            </w:r>
+            <w:proofErr w:type="spellEnd"/>
+            <w:r>
+              <w:rPr>
+                <w:sz w:val="20"/>
+                <w:szCs w:val="20"/>
+              </w:rPr>
+              <w:t/>
+            </w:r>
+          </w:p>
+        </w:tc>
+        <w:tc>
+          <w:tcPr>
+            <w:tcW w:w="878" w:type="dxa"/>
+          </w:tcPr>
+          <w:p>
+            <w:pPr>
+              <w:rPr>
+                <w:sz w:val="20"/>
+                <w:szCs w:val="20"/>
+                <w:lang w:val="de-DE"/>
+              </w:rPr>
+            </w:pPr>
+            <w:r>
+              <w:rPr>
+                <w:sz w:val="20"/>
+                <w:szCs w:val="20"/>
+              </w:rPr>
+              <w:t xml:space="preserve">Stck.</w:t>
+            </w:r>
+          </w:p>
+        </w:tc>
+        <w:tc>
+          <w:tcPr>
+            <w:tcW w:w="1303" w:type="dxa"/>
+          </w:tcPr>
+          <w:p>
+            <w:pPr>
+              <w:rPr>
+                <w:sz w:val="20"/>
+                <w:szCs w:val="20"/>
+                <w:lang w:val="de-DE"/>
+              </w:rPr>
+            </w:pPr>
+            <w:r>
+              <w:rPr>
+                <w:sz w:val="20"/>
+                <w:szCs w:val="20"/>
+              </w:rPr>
+              <w:t/>
+            </w:r>
+            <w:proofErr w:type="spellStart"/>
+            <w:r>
+              <w:rPr>
+                <w:sz w:val="20"/>
+                <w:szCs w:val="20"/>
+              </w:rPr>
+              <w:t/>
+            </w:r>
+            <w:proofErr w:type="spellEnd"/>
+            <w:r>
+              <w:rPr>
+                <w:sz w:val="20"/>
+                <w:szCs w:val="20"/>
+              </w:rPr>
+              <w:t/>
+            </w:r>
+          </w:p>
+        </w:tc>
+      </w:tr>
+      <w:tr>
+        <w:tc>
+          <w:tcPr>
+            <w:tcW w:w="2836" w:type="dxa"/>
+          </w:tcPr>
+          <w:p>
+            <w:pPr>
+              <w:rPr>
+                <w:sz w:val="20"/>
+                <w:szCs w:val="20"/>
+                <w:lang w:val="de-DE"/>
+              </w:rPr>
+            </w:pPr>
+            <w:r>
+              <w:rPr>
+                <w:sz w:val="20"/>
+                <w:szCs w:val="20"/>
+              </w:rPr>
+              <w:t xml:space="preserve">13</w:t>
+            </w:r>
+          </w:p>
+        </w:tc>
+        <w:tc>
+          <w:tcPr>
+            <w:tcW w:w="2041" w:type="dxa"/>
+          </w:tcPr>
+          <w:p>
+            <w:pPr>
+              <w:rPr>
+                <w:sz w:val="20"/>
+                <w:szCs w:val="20"/>
+                <w:lang w:val="de-DE"/>
+              </w:rPr>
+            </w:pPr>
+            <w:r>
+              <w:rPr>
+                <w:sz w:val="20"/>
+                <w:szCs w:val="20"/>
+              </w:rPr>
+              <w:t xml:space="preserve">RGB</w:t>
+            </w:r>
+            <w:proofErr w:type="spellStart"/>
+            <w:r>
+              <w:rPr>
+                <w:sz w:val="20"/>
+                <w:szCs w:val="20"/>
+              </w:rPr>
+              <w:t/>
+            </w:r>
+            <w:proofErr w:type="spellEnd"/>
+            <w:r>
+              <w:rPr>
+                <w:sz w:val="20"/>
+                <w:szCs w:val="20"/>
+              </w:rPr>
+              <w:t/>
+            </w:r>
+          </w:p>
+        </w:tc>
+        <w:tc>
+          <w:tcPr>
+            <w:tcW w:w="1440" w:type="dxa"/>
+          </w:tcPr>
+          <w:p>
+            <w:pPr>
+              <w:rPr>
+                <w:sz w:val="20"/>
+                <w:szCs w:val="20"/>
+                <w:lang w:val="de-DE"/>
+              </w:rPr>
+            </w:pPr>
+            <w:r>
+              <w:rPr>
+                <w:sz w:val="20"/>
+                <w:szCs w:val="20"/>
+              </w:rPr>
+              <w:t xml:space="preserve">Trockenbaumaterial für Dreieck-Kasten für WC</w:t>
+            </w:r>
+            <w:proofErr w:type="spellStart"/>
+            <w:r>
+              <w:rPr>
+                <w:sz w:val="20"/>
+                <w:szCs w:val="20"/>
+              </w:rPr>
+              <w:t/>
+            </w:r>
+            <w:proofErr w:type="spellEnd"/>
+            <w:r>
+              <w:rPr>
+                <w:sz w:val="20"/>
+                <w:szCs w:val="20"/>
+              </w:rPr>
+              <w:t/>
+            </w:r>
+          </w:p>
+        </w:tc>
+        <w:tc>
+          <w:tcPr>
+            <w:tcW w:w="853" w:type="dxa"/>
+          </w:tcPr>
+          <w:p>
+            <w:pPr>
+              <w:rPr>
+                <w:sz w:val="20"/>
+                <w:szCs w:val="20"/>
+                <w:lang w:val="de-DE"/>
+              </w:rPr>
+            </w:pPr>
+            <w:r>
+              <w:rPr>
+                <w:sz w:val="20"/>
+                <w:szCs w:val="20"/>
+              </w:rPr>
+              <w:t xml:space="preserve">1</w:t>
+            </w:r>
+            <w:proofErr w:type="spellStart"/>
+            <w:r>
+              <w:rPr>
+                <w:sz w:val="20"/>
+                <w:szCs w:val="20"/>
+              </w:rPr>
+              <w:t/>
+            </w:r>
+            <w:proofErr w:type="spellEnd"/>
+            <w:r>
+              <w:rPr>
+                <w:sz w:val="20"/>
+                <w:szCs w:val="20"/>
+              </w:rPr>
+              <w:t/>
+            </w:r>
+          </w:p>
+        </w:tc>
+        <w:tc>
+          <w:tcPr>
+            <w:tcW w:w="878" w:type="dxa"/>
+          </w:tcPr>
+          <w:p>
+            <w:pPr>
+              <w:rPr>
+                <w:sz w:val="20"/>
+                <w:szCs w:val="20"/>
+                <w:lang w:val="de-DE"/>
+              </w:rPr>
+            </w:pPr>
+            <w:r>
+              <w:rPr>
+                <w:sz w:val="20"/>
+                <w:szCs w:val="20"/>
+              </w:rPr>
+              <w:t xml:space="preserve">Stck.</w:t>
+            </w:r>
+          </w:p>
+        </w:tc>
+        <w:tc>
+          <w:tcPr>
+            <w:tcW w:w="1303" w:type="dxa"/>
+          </w:tcPr>
+          <w:p>
+            <w:pPr>
+              <w:rPr>
+                <w:sz w:val="20"/>
+                <w:szCs w:val="20"/>
+                <w:lang w:val="de-DE"/>
+              </w:rPr>
+            </w:pPr>
+            <w:r>
+              <w:rPr>
+                <w:sz w:val="20"/>
+                <w:szCs w:val="20"/>
+              </w:rPr>
+              <w:t/>
+            </w:r>
+            <w:proofErr w:type="spellStart"/>
+            <w:r>
+              <w:rPr>
+                <w:sz w:val="20"/>
+                <w:szCs w:val="20"/>
+              </w:rPr>
+              <w:t/>
+            </w:r>
+            <w:proofErr w:type="spellEnd"/>
+            <w:r>
+              <w:rPr>
+                <w:sz w:val="20"/>
+                <w:szCs w:val="20"/>
+              </w:rPr>
+              <w:t/>
+            </w:r>
+          </w:p>
+        </w:tc>
+      </w:tr>
+      <w:tr>
+        <w:tc>
+          <w:tcPr>
+            <w:tcW w:w="2836" w:type="dxa"/>
+          </w:tcPr>
+          <w:p>
+            <w:pPr>
+              <w:rPr>
+                <w:sz w:val="20"/>
+                <w:szCs w:val="20"/>
+                <w:lang w:val="de-DE"/>
+              </w:rPr>
+            </w:pPr>
+            <w:r>
+              <w:rPr>
+                <w:sz w:val="20"/>
+                <w:szCs w:val="20"/>
+              </w:rPr>
+              <w:t xml:space="preserve">14</w:t>
+            </w:r>
+          </w:p>
+        </w:tc>
+        <w:tc>
+          <w:tcPr>
+            <w:tcW w:w="2041" w:type="dxa"/>
+          </w:tcPr>
+          <w:p>
+            <w:pPr>
+              <w:rPr>
+                <w:sz w:val="20"/>
+                <w:szCs w:val="20"/>
+                <w:lang w:val="de-DE"/>
+              </w:rPr>
+            </w:pPr>
+            <w:r>
+              <w:rPr>
+                <w:sz w:val="20"/>
+                <w:szCs w:val="20"/>
+              </w:rPr>
+              <w:t xml:space="preserve">SCHALL</w:t>
+            </w:r>
+            <w:proofErr w:type="spellStart"/>
+            <w:r>
+              <w:rPr>
+                <w:sz w:val="20"/>
+                <w:szCs w:val="20"/>
+              </w:rPr>
+              <w:t/>
+            </w:r>
+            <w:proofErr w:type="spellEnd"/>
+            <w:r>
+              <w:rPr>
+                <w:sz w:val="20"/>
+                <w:szCs w:val="20"/>
+              </w:rPr>
+              <w:t/>
+            </w:r>
+          </w:p>
+        </w:tc>
+        <w:tc>
+          <w:tcPr>
+            <w:tcW w:w="1440" w:type="dxa"/>
+          </w:tcPr>
+          <w:p>
+            <w:pPr>
+              <w:rPr>
+                <w:sz w:val="20"/>
+                <w:szCs w:val="20"/>
+                <w:lang w:val="de-DE"/>
+              </w:rPr>
+            </w:pPr>
+            <w:r>
+              <w:rPr>
+                <w:sz w:val="20"/>
+                <w:szCs w:val="20"/>
+              </w:rPr>
+              <w:t xml:space="preserve">Montageset f. Wand-WC/WD-Bidet m.geringem Schallschutz TRINNITY</w:t>
+            </w:r>
+            <w:proofErr w:type="spellStart"/>
+            <w:r>
+              <w:rPr>
+                <w:sz w:val="20"/>
+                <w:szCs w:val="20"/>
+              </w:rPr>
+              <w:t/>
+            </w:r>
+            <w:proofErr w:type="spellEnd"/>
+            <w:r>
+              <w:rPr>
+                <w:sz w:val="20"/>
+                <w:szCs w:val="20"/>
+              </w:rPr>
+              <w:t/>
+            </w:r>
+          </w:p>
+        </w:tc>
+        <w:tc>
+          <w:tcPr>
+            <w:tcW w:w="853" w:type="dxa"/>
+          </w:tcPr>
+          <w:p>
+            <w:pPr>
+              <w:rPr>
+                <w:sz w:val="20"/>
+                <w:szCs w:val="20"/>
+                <w:lang w:val="de-DE"/>
+              </w:rPr>
+            </w:pPr>
+            <w:r>
+              <w:rPr>
+                <w:sz w:val="20"/>
+                <w:szCs w:val="20"/>
+              </w:rPr>
+              <w:t xml:space="preserve">1</w:t>
+            </w:r>
+            <w:proofErr w:type="spellStart"/>
+            <w:r>
+              <w:rPr>
+                <w:sz w:val="20"/>
+                <w:szCs w:val="20"/>
+              </w:rPr>
+              <w:t/>
+            </w:r>
+            <w:proofErr w:type="spellEnd"/>
+            <w:r>
+              <w:rPr>
+                <w:sz w:val="20"/>
+                <w:szCs w:val="20"/>
+              </w:rPr>
+              <w:t/>
+            </w:r>
+          </w:p>
+        </w:tc>
+        <w:tc>
+          <w:tcPr>
+            <w:tcW w:w="878" w:type="dxa"/>
+          </w:tcPr>
+          <w:p>
+            <w:pPr>
+              <w:rPr>
+                <w:sz w:val="20"/>
+                <w:szCs w:val="20"/>
+                <w:lang w:val="de-DE"/>
+              </w:rPr>
+            </w:pPr>
+            <w:r>
+              <w:rPr>
+                <w:sz w:val="20"/>
+                <w:szCs w:val="20"/>
+              </w:rPr>
+              <w:t xml:space="preserve">Stck.</w:t>
+            </w:r>
+          </w:p>
+        </w:tc>
+        <w:tc>
+          <w:tcPr>
+            <w:tcW w:w="1303" w:type="dxa"/>
+          </w:tcPr>
+          <w:p>
+            <w:pPr>
+              <w:rPr>
+                <w:sz w:val="20"/>
+                <w:szCs w:val="20"/>
+                <w:lang w:val="de-DE"/>
+              </w:rPr>
+            </w:pPr>
+            <w:r>
+              <w:rPr>
+                <w:sz w:val="20"/>
+                <w:szCs w:val="20"/>
+              </w:rPr>
+              <w:t/>
+            </w:r>
+            <w:proofErr w:type="spellStart"/>
+            <w:r>
+              <w:rPr>
+                <w:sz w:val="20"/>
+                <w:szCs w:val="20"/>
+              </w:rPr>
+              <w:t/>
+            </w:r>
+            <w:proofErr w:type="spellEnd"/>
+            <w:r>
+              <w:rPr>
+                <w:sz w:val="20"/>
+                <w:szCs w:val="20"/>
+              </w:rPr>
+              <w:t/>
+            </w:r>
+          </w:p>
+        </w:tc>
+      </w:tr>
+      <w:tr>
+        <w:tc>
+          <w:tcPr>
+            <w:tcW w:w="2836" w:type="dxa"/>
+          </w:tcPr>
+          <w:p>
+            <w:pPr>
+              <w:rPr>
+                <w:sz w:val="20"/>
+                <w:szCs w:val="20"/>
+                <w:lang w:val="de-DE"/>
+              </w:rPr>
+            </w:pPr>
+            <w:r>
+              <w:rPr>
+                <w:sz w:val="20"/>
+                <w:szCs w:val="20"/>
+              </w:rPr>
+              <w:t xml:space="preserve">15</w:t>
+            </w:r>
+          </w:p>
+        </w:tc>
+        <w:tc>
+          <w:tcPr>
+            <w:tcW w:w="2041" w:type="dxa"/>
+          </w:tcPr>
+          <w:p>
+            <w:pPr>
+              <w:rPr>
+                <w:sz w:val="20"/>
+                <w:szCs w:val="20"/>
+                <w:lang w:val="de-DE"/>
+              </w:rPr>
+            </w:pPr>
+            <w:r>
+              <w:rPr>
+                <w:sz w:val="20"/>
+                <w:szCs w:val="20"/>
+              </w:rPr>
+              <w:t xml:space="preserve">TECEADS</w:t>
+            </w:r>
+            <w:proofErr w:type="spellStart"/>
+            <w:r>
+              <w:rPr>
+                <w:sz w:val="20"/>
+                <w:szCs w:val="20"/>
+              </w:rPr>
+              <w:t/>
+            </w:r>
+            <w:proofErr w:type="spellEnd"/>
+            <w:r>
+              <w:rPr>
+                <w:sz w:val="20"/>
+                <w:szCs w:val="20"/>
+              </w:rPr>
+              <w:t/>
+            </w:r>
+          </w:p>
+        </w:tc>
+        <w:tc>
+          <w:tcPr>
+            <w:tcW w:w="1440" w:type="dxa"/>
+          </w:tcPr>
+          <w:p>
+            <w:pPr>
+              <w:rPr>
+                <w:sz w:val="20"/>
+                <w:szCs w:val="20"/>
+                <w:lang w:val="de-DE"/>
+              </w:rPr>
+            </w:pPr>
+            <w:r>
+              <w:rPr>
+                <w:sz w:val="20"/>
+                <w:szCs w:val="20"/>
+              </w:rPr>
+              <w:t xml:space="preserve">Tece Seal System Abdichtungsset für Wanddurchführungen</w:t>
+            </w:r>
+            <w:proofErr w:type="spellStart"/>
+            <w:r>
+              <w:rPr>
+                <w:sz w:val="20"/>
+                <w:szCs w:val="20"/>
+              </w:rPr>
+              <w:t/>
+            </w:r>
+            <w:proofErr w:type="spellEnd"/>
+            <w:r>
+              <w:rPr>
+                <w:sz w:val="20"/>
+                <w:szCs w:val="20"/>
+              </w:rPr>
+              <w:t/>
+            </w:r>
+          </w:p>
+        </w:tc>
+        <w:tc>
+          <w:tcPr>
+            <w:tcW w:w="853" w:type="dxa"/>
+          </w:tcPr>
+          <w:p>
+            <w:pPr>
+              <w:rPr>
+                <w:sz w:val="20"/>
+                <w:szCs w:val="20"/>
+                <w:lang w:val="de-DE"/>
+              </w:rPr>
+            </w:pPr>
+            <w:r>
+              <w:rPr>
+                <w:sz w:val="20"/>
+                <w:szCs w:val="20"/>
+              </w:rPr>
+              <w:t xml:space="preserve">1</w:t>
+            </w:r>
+            <w:proofErr w:type="spellStart"/>
+            <w:r>
+              <w:rPr>
+                <w:sz w:val="20"/>
+                <w:szCs w:val="20"/>
+              </w:rPr>
+              <w:t/>
+            </w:r>
+            <w:proofErr w:type="spellEnd"/>
+            <w:r>
+              <w:rPr>
+                <w:sz w:val="20"/>
+                <w:szCs w:val="20"/>
+              </w:rPr>
+              <w:t/>
+            </w:r>
+          </w:p>
+        </w:tc>
+        <w:tc>
+          <w:tcPr>
+            <w:tcW w:w="878" w:type="dxa"/>
+          </w:tcPr>
+          <w:p>
+            <w:pPr>
+              <w:rPr>
+                <w:sz w:val="20"/>
+                <w:szCs w:val="20"/>
+                <w:lang w:val="de-DE"/>
+              </w:rPr>
+            </w:pPr>
+            <w:r>
+              <w:rPr>
+                <w:sz w:val="20"/>
+                <w:szCs w:val="20"/>
+              </w:rPr>
+              <w:t xml:space="preserve">Stck.</w:t>
+            </w:r>
+          </w:p>
+        </w:tc>
+        <w:tc>
+          <w:tcPr>
+            <w:tcW w:w="1303" w:type="dxa"/>
+          </w:tcPr>
+          <w:p>
+            <w:pPr>
+              <w:rPr>
+                <w:sz w:val="20"/>
+                <w:szCs w:val="20"/>
+                <w:lang w:val="de-DE"/>
+              </w:rPr>
+            </w:pPr>
+            <w:r>
+              <w:rPr>
+                <w:sz w:val="20"/>
+                <w:szCs w:val="20"/>
+              </w:rPr>
+              <w:t/>
+            </w:r>
+            <w:proofErr w:type="spellStart"/>
+            <w:r>
+              <w:rPr>
+                <w:sz w:val="20"/>
+                <w:szCs w:val="20"/>
+              </w:rPr>
+              <w:t/>
+            </w:r>
+            <w:proofErr w:type="spellEnd"/>
+            <w:r>
+              <w:rPr>
+                <w:sz w:val="20"/>
+                <w:szCs w:val="20"/>
+              </w:rPr>
+              <w:t/>
+            </w:r>
+          </w:p>
+        </w:tc>
+      </w:tr>
+      <w:tr>
+        <w:tc>
+          <w:tcPr>
+            <w:tcW w:w="2836" w:type="dxa"/>
+          </w:tcPr>
+          <w:p>
+            <w:pPr>
+              <w:rPr>
+                <w:sz w:val="20"/>
+                <w:szCs w:val="20"/>
+                <w:lang w:val="de-DE"/>
+              </w:rPr>
+            </w:pPr>
+            <w:r>
+              <w:rPr>
+                <w:sz w:val="20"/>
+                <w:szCs w:val="20"/>
+              </w:rPr>
+              <w:t xml:space="preserve">16</w:t>
+            </w:r>
+          </w:p>
+        </w:tc>
+        <w:tc>
+          <w:tcPr>
+            <w:tcW w:w="2041" w:type="dxa"/>
+          </w:tcPr>
+          <w:p>
+            <w:pPr>
+              <w:rPr>
+                <w:sz w:val="20"/>
+                <w:szCs w:val="20"/>
+                <w:lang w:val="de-DE"/>
+              </w:rPr>
+            </w:pPr>
+            <w:r>
+              <w:rPr>
+                <w:sz w:val="20"/>
+                <w:szCs w:val="20"/>
+              </w:rPr>
+              <w:t xml:space="preserve">TRWDB</w:t>
+            </w:r>
+            <w:proofErr w:type="spellStart"/>
+            <w:r>
+              <w:rPr>
+                <w:sz w:val="20"/>
+                <w:szCs w:val="20"/>
+              </w:rPr>
+              <w:t/>
+            </w:r>
+            <w:proofErr w:type="spellEnd"/>
+            <w:r>
+              <w:rPr>
+                <w:sz w:val="20"/>
+                <w:szCs w:val="20"/>
+              </w:rPr>
+              <w:t/>
+            </w:r>
+          </w:p>
+        </w:tc>
+        <w:tc>
+          <w:tcPr>
+            <w:tcW w:w="1440" w:type="dxa"/>
+          </w:tcPr>
+          <w:p>
+            <w:pPr>
+              <w:rPr>
+                <w:sz w:val="20"/>
+                <w:szCs w:val="20"/>
+                <w:lang w:val="de-DE"/>
+              </w:rPr>
+            </w:pPr>
+            <w:r>
+              <w:rPr>
+                <w:sz w:val="20"/>
+                <w:szCs w:val="20"/>
+              </w:rPr>
+              <w:t xml:space="preserve">TRINNITY Wannenabdichtband-Set 3,4 m Nass-/Trockenanbindung entspr. DIN 18534</w:t>
+            </w:r>
+            <w:proofErr w:type="spellStart"/>
+            <w:r>
+              <w:rPr>
+                <w:sz w:val="20"/>
+                <w:szCs w:val="20"/>
+              </w:rPr>
+              <w:t/>
+            </w:r>
+            <w:proofErr w:type="spellEnd"/>
+            <w:r>
+              <w:rPr>
+                <w:sz w:val="20"/>
+                <w:szCs w:val="20"/>
+              </w:rPr>
+              <w:t/>
+            </w:r>
+          </w:p>
+        </w:tc>
+        <w:tc>
+          <w:tcPr>
+            <w:tcW w:w="853" w:type="dxa"/>
+          </w:tcPr>
+          <w:p>
+            <w:pPr>
+              <w:rPr>
+                <w:sz w:val="20"/>
+                <w:szCs w:val="20"/>
+                <w:lang w:val="de-DE"/>
+              </w:rPr>
+            </w:pPr>
+            <w:r>
+              <w:rPr>
+                <w:sz w:val="20"/>
+                <w:szCs w:val="20"/>
+              </w:rPr>
+              <w:t xml:space="preserve">1</w:t>
+            </w:r>
+            <w:proofErr w:type="spellStart"/>
+            <w:r>
+              <w:rPr>
+                <w:sz w:val="20"/>
+                <w:szCs w:val="20"/>
+              </w:rPr>
+              <w:t/>
+            </w:r>
+            <w:proofErr w:type="spellEnd"/>
+            <w:r>
+              <w:rPr>
+                <w:sz w:val="20"/>
+                <w:szCs w:val="20"/>
+              </w:rPr>
+              <w:t/>
+            </w:r>
+          </w:p>
+        </w:tc>
+        <w:tc>
+          <w:tcPr>
+            <w:tcW w:w="878" w:type="dxa"/>
+          </w:tcPr>
+          <w:p>
+            <w:pPr>
+              <w:rPr>
+                <w:sz w:val="20"/>
+                <w:szCs w:val="20"/>
+                <w:lang w:val="de-DE"/>
+              </w:rPr>
+            </w:pPr>
+            <w:r>
+              <w:rPr>
+                <w:sz w:val="20"/>
+                <w:szCs w:val="20"/>
+              </w:rPr>
+              <w:t xml:space="preserve">Stck.</w:t>
+            </w:r>
+          </w:p>
+        </w:tc>
+        <w:tc>
+          <w:tcPr>
+            <w:tcW w:w="1303" w:type="dxa"/>
+          </w:tcPr>
+          <w:p>
+            <w:pPr>
+              <w:rPr>
+                <w:sz w:val="20"/>
+                <w:szCs w:val="20"/>
+                <w:lang w:val="de-DE"/>
+              </w:rPr>
+            </w:pPr>
+            <w:r>
+              <w:rPr>
+                <w:sz w:val="20"/>
+                <w:szCs w:val="20"/>
+              </w:rPr>
+              <w:t/>
+            </w:r>
+            <w:proofErr w:type="spellStart"/>
+            <w:r>
+              <w:rPr>
+                <w:sz w:val="20"/>
+                <w:szCs w:val="20"/>
+              </w:rPr>
+              <w:t/>
+            </w:r>
+            <w:proofErr w:type="spellEnd"/>
+            <w:r>
+              <w:rPr>
+                <w:sz w:val="20"/>
+                <w:szCs w:val="20"/>
+              </w:rPr>
+              <w:t/>
+            </w:r>
+          </w:p>
+        </w:tc>
+      </w:tr>
+      <w:tr>
+        <w:tc>
+          <w:tcPr>
+            <w:tcW w:w="2836" w:type="dxa"/>
+          </w:tcPr>
+          <w:p>
+            <w:pPr>
+              <w:rPr>
+                <w:sz w:val="20"/>
+                <w:szCs w:val="20"/>
+                <w:lang w:val="de-DE"/>
+              </w:rPr>
+            </w:pPr>
+            <w:r>
+              <w:rPr>
+                <w:sz w:val="20"/>
+                <w:szCs w:val="20"/>
+              </w:rPr>
+              <w:t xml:space="preserve">17</w:t>
+            </w:r>
+          </w:p>
+        </w:tc>
+        <w:tc>
+          <w:tcPr>
+            <w:tcW w:w="2041" w:type="dxa"/>
+          </w:tcPr>
+          <w:p>
+            <w:pPr>
+              <w:rPr>
+                <w:sz w:val="20"/>
+                <w:szCs w:val="20"/>
+                <w:lang w:val="de-DE"/>
+              </w:rPr>
+            </w:pPr>
+            <w:r>
+              <w:rPr>
+                <w:sz w:val="20"/>
+                <w:szCs w:val="20"/>
+              </w:rPr>
+              <w:t xml:space="preserve">TRWDSET5</w:t>
+            </w:r>
+            <w:proofErr w:type="spellStart"/>
+            <w:r>
+              <w:rPr>
+                <w:sz w:val="20"/>
+                <w:szCs w:val="20"/>
+              </w:rPr>
+              <w:t/>
+            </w:r>
+            <w:proofErr w:type="spellEnd"/>
+            <w:r>
+              <w:rPr>
+                <w:sz w:val="20"/>
+                <w:szCs w:val="20"/>
+              </w:rPr>
+              <w:t/>
+            </w:r>
+          </w:p>
+        </w:tc>
+        <w:tc>
+          <w:tcPr>
+            <w:tcW w:w="1440" w:type="dxa"/>
+          </w:tcPr>
+          <w:p>
+            <w:pPr>
+              <w:rPr>
+                <w:sz w:val="20"/>
+                <w:szCs w:val="20"/>
+                <w:lang w:val="de-DE"/>
+              </w:rPr>
+            </w:pPr>
+            <w:r>
+              <w:rPr>
+                <w:sz w:val="20"/>
+                <w:szCs w:val="20"/>
+              </w:rPr>
+              <w:t xml:space="preserve">TRINNITY Wandabdichtung BASIS-Set 5 qm DW bis 100 x 100 / BW bis 180 x 80 cm</w:t>
+            </w:r>
+            <w:proofErr w:type="spellStart"/>
+            <w:r>
+              <w:rPr>
+                <w:sz w:val="20"/>
+                <w:szCs w:val="20"/>
+              </w:rPr>
+              <w:t/>
+            </w:r>
+            <w:proofErr w:type="spellEnd"/>
+            <w:r>
+              <w:rPr>
+                <w:sz w:val="20"/>
+                <w:szCs w:val="20"/>
+              </w:rPr>
+              <w:t/>
+            </w:r>
+          </w:p>
+        </w:tc>
+        <w:tc>
+          <w:tcPr>
+            <w:tcW w:w="853" w:type="dxa"/>
+          </w:tcPr>
+          <w:p>
+            <w:pPr>
+              <w:rPr>
+                <w:sz w:val="20"/>
+                <w:szCs w:val="20"/>
+                <w:lang w:val="de-DE"/>
+              </w:rPr>
+            </w:pPr>
+            <w:r>
+              <w:rPr>
+                <w:sz w:val="20"/>
+                <w:szCs w:val="20"/>
+              </w:rPr>
+              <w:t xml:space="preserve">1</w:t>
+            </w:r>
+            <w:proofErr w:type="spellStart"/>
+            <w:r>
+              <w:rPr>
+                <w:sz w:val="20"/>
+                <w:szCs w:val="20"/>
+              </w:rPr>
+              <w:t/>
+            </w:r>
+            <w:proofErr w:type="spellEnd"/>
+            <w:r>
+              <w:rPr>
+                <w:sz w:val="20"/>
+                <w:szCs w:val="20"/>
+              </w:rPr>
+              <w:t/>
+            </w:r>
+          </w:p>
+        </w:tc>
+        <w:tc>
+          <w:tcPr>
+            <w:tcW w:w="878" w:type="dxa"/>
+          </w:tcPr>
+          <w:p>
+            <w:pPr>
+              <w:rPr>
+                <w:sz w:val="20"/>
+                <w:szCs w:val="20"/>
+                <w:lang w:val="de-DE"/>
+              </w:rPr>
+            </w:pPr>
+            <w:r>
+              <w:rPr>
+                <w:sz w:val="20"/>
+                <w:szCs w:val="20"/>
+              </w:rPr>
+              <w:t xml:space="preserve">Stck.</w:t>
+            </w:r>
+          </w:p>
+        </w:tc>
+        <w:tc>
+          <w:tcPr>
+            <w:tcW w:w="1303" w:type="dxa"/>
+          </w:tcPr>
+          <w:p>
+            <w:pPr>
+              <w:rPr>
+                <w:sz w:val="20"/>
+                <w:szCs w:val="20"/>
+                <w:lang w:val="de-DE"/>
+              </w:rPr>
+            </w:pPr>
+            <w:r>
+              <w:rPr>
+                <w:sz w:val="20"/>
+                <w:szCs w:val="20"/>
+              </w:rPr>
+              <w:t/>
+            </w:r>
+            <w:proofErr w:type="spellStart"/>
+            <w:r>
+              <w:rPr>
+                <w:sz w:val="20"/>
+                <w:szCs w:val="20"/>
+              </w:rPr>
+              <w:t/>
+            </w:r>
+            <w:proofErr w:type="spellEnd"/>
+            <w:r>
+              <w:rPr>
+                <w:sz w:val="20"/>
+                <w:szCs w:val="20"/>
+              </w:rPr>
+              <w:t/>
+            </w:r>
+          </w:p>
+        </w:tc>
+      </w:tr>
+      <w:tr>
+        <w:tc>
+          <w:tcPr>
+            <w:tcW w:w="2836" w:type="dxa"/>
+          </w:tcPr>
+          <w:p>
+            <w:pPr>
+              <w:rPr>
+                <w:sz w:val="20"/>
+                <w:szCs w:val="20"/>
+                <w:lang w:val="de-DE"/>
+              </w:rPr>
+            </w:pPr>
+            <w:r>
+              <w:rPr>
+                <w:sz w:val="20"/>
+                <w:szCs w:val="20"/>
+              </w:rPr>
+              <w:t xml:space="preserve">18</w:t>
+            </w:r>
+          </w:p>
+        </w:tc>
+        <w:tc>
+          <w:tcPr>
+            <w:tcW w:w="2041" w:type="dxa"/>
+          </w:tcPr>
+          <w:p>
+            <w:pPr>
+              <w:rPr>
+                <w:sz w:val="20"/>
+                <w:szCs w:val="20"/>
+                <w:lang w:val="de-DE"/>
+              </w:rPr>
+            </w:pPr>
+            <w:r>
+              <w:rPr>
+                <w:sz w:val="20"/>
+                <w:szCs w:val="20"/>
+              </w:rPr>
+              <w:t xml:space="preserve">V1DON</w:t>
+            </w:r>
+            <w:proofErr w:type="spellStart"/>
+            <w:r>
+              <w:rPr>
+                <w:sz w:val="20"/>
+                <w:szCs w:val="20"/>
+              </w:rPr>
+              <w:t/>
+            </w:r>
+            <w:proofErr w:type="spellEnd"/>
+            <w:r>
+              <w:rPr>
+                <w:sz w:val="20"/>
+                <w:szCs w:val="20"/>
+              </w:rPr>
+              <w:t/>
+            </w:r>
+          </w:p>
+        </w:tc>
+        <w:tc>
+          <w:tcPr>
+            <w:tcW w:w="1440" w:type="dxa"/>
+          </w:tcPr>
+          <w:p>
+            <w:pPr>
+              <w:rPr>
+                <w:sz w:val="20"/>
+                <w:szCs w:val="20"/>
+                <w:lang w:val="de-DE"/>
+              </w:rPr>
+            </w:pPr>
+            <w:r>
+              <w:rPr>
+                <w:sz w:val="20"/>
+                <w:szCs w:val="20"/>
+              </w:rPr>
+              <w:t xml:space="preserve">Betätigungsplatte V1 DON weiss f.2-Mengen-Spültechnik VIGOUR</w:t>
+            </w:r>
+            <w:proofErr w:type="spellStart"/>
+            <w:r>
+              <w:rPr>
+                <w:sz w:val="20"/>
+                <w:szCs w:val="20"/>
+              </w:rPr>
+              <w:t/>
+            </w:r>
+            <w:proofErr w:type="spellEnd"/>
+            <w:r>
+              <w:rPr>
+                <w:sz w:val="20"/>
+                <w:szCs w:val="20"/>
+              </w:rPr>
+              <w:t/>
+            </w:r>
+          </w:p>
+        </w:tc>
+        <w:tc>
+          <w:tcPr>
+            <w:tcW w:w="853" w:type="dxa"/>
+          </w:tcPr>
+          <w:p>
+            <w:pPr>
+              <w:rPr>
+                <w:sz w:val="20"/>
+                <w:szCs w:val="20"/>
+                <w:lang w:val="de-DE"/>
+              </w:rPr>
+            </w:pPr>
+            <w:r>
+              <w:rPr>
+                <w:sz w:val="20"/>
+                <w:szCs w:val="20"/>
+              </w:rPr>
+              <w:t xml:space="preserve">1</w:t>
+            </w:r>
+            <w:proofErr w:type="spellStart"/>
+            <w:r>
+              <w:rPr>
+                <w:sz w:val="20"/>
+                <w:szCs w:val="20"/>
+              </w:rPr>
+              <w:t/>
+            </w:r>
+            <w:proofErr w:type="spellEnd"/>
+            <w:r>
+              <w:rPr>
+                <w:sz w:val="20"/>
+                <w:szCs w:val="20"/>
+              </w:rPr>
+              <w:t/>
+            </w:r>
+          </w:p>
+        </w:tc>
+        <w:tc>
+          <w:tcPr>
+            <w:tcW w:w="878" w:type="dxa"/>
+          </w:tcPr>
+          <w:p>
+            <w:pPr>
+              <w:rPr>
+                <w:sz w:val="20"/>
+                <w:szCs w:val="20"/>
+                <w:lang w:val="de-DE"/>
+              </w:rPr>
+            </w:pPr>
+            <w:r>
+              <w:rPr>
+                <w:sz w:val="20"/>
+                <w:szCs w:val="20"/>
+              </w:rPr>
+              <w:t xml:space="preserve">Stck.</w:t>
+            </w:r>
+          </w:p>
+        </w:tc>
+        <w:tc>
+          <w:tcPr>
+            <w:tcW w:w="1303" w:type="dxa"/>
+          </w:tcPr>
+          <w:p>
+            <w:pPr>
+              <w:rPr>
+                <w:sz w:val="20"/>
+                <w:szCs w:val="20"/>
+                <w:lang w:val="de-DE"/>
+              </w:rPr>
+            </w:pPr>
+            <w:r>
+              <w:rPr>
+                <w:sz w:val="20"/>
+                <w:szCs w:val="20"/>
+              </w:rPr>
+              <w:t/>
+            </w:r>
+            <w:proofErr w:type="spellStart"/>
+            <w:r>
+              <w:rPr>
+                <w:sz w:val="20"/>
+                <w:szCs w:val="20"/>
+              </w:rPr>
+              <w:t/>
+            </w:r>
+            <w:proofErr w:type="spellEnd"/>
+            <w:r>
+              <w:rPr>
+                <w:sz w:val="20"/>
+                <w:szCs w:val="20"/>
+              </w:rPr>
+              <w:t/>
+            </w:r>
+          </w:p>
+        </w:tc>
+      </w:tr>
+      <w:tr>
+        <w:tc>
+          <w:tcPr>
+            <w:tcW w:w="2836" w:type="dxa"/>
+          </w:tcPr>
+          <w:p>
+            <w:pPr>
+              <w:rPr>
+                <w:sz w:val="20"/>
+                <w:szCs w:val="20"/>
+                <w:lang w:val="de-DE"/>
+              </w:rPr>
+            </w:pPr>
+            <w:r>
+              <w:rPr>
+                <w:sz w:val="20"/>
+                <w:szCs w:val="20"/>
+              </w:rPr>
+              <w:t xml:space="preserve">19</w:t>
+            </w:r>
+          </w:p>
+        </w:tc>
+        <w:tc>
+          <w:tcPr>
+            <w:tcW w:w="2041" w:type="dxa"/>
+          </w:tcPr>
+          <w:p>
+            <w:pPr>
+              <w:rPr>
+                <w:sz w:val="20"/>
+                <w:szCs w:val="20"/>
+                <w:lang w:val="de-DE"/>
+              </w:rPr>
+            </w:pPr>
+            <w:r>
+              <w:rPr>
+                <w:sz w:val="20"/>
+                <w:szCs w:val="20"/>
+              </w:rPr>
+              <w:t xml:space="preserve">V2WS8120</w:t>
+            </w:r>
+            <w:proofErr w:type="spellStart"/>
+            <w:r>
+              <w:rPr>
+                <w:sz w:val="20"/>
+                <w:szCs w:val="20"/>
+              </w:rPr>
+              <w:t/>
+            </w:r>
+            <w:proofErr w:type="spellEnd"/>
+            <w:r>
+              <w:rPr>
+                <w:sz w:val="20"/>
+                <w:szCs w:val="20"/>
+              </w:rPr>
+              <w:t/>
+            </w:r>
+          </w:p>
+        </w:tc>
+        <w:tc>
+          <w:tcPr>
+            <w:tcW w:w="1440" w:type="dxa"/>
+          </w:tcPr>
+          <w:p>
+            <w:pPr>
+              <w:rPr>
+                <w:sz w:val="20"/>
+                <w:szCs w:val="20"/>
+                <w:lang w:val="de-DE"/>
+              </w:rPr>
+            </w:pPr>
+            <w:r>
+              <w:rPr>
+                <w:sz w:val="20"/>
+                <w:szCs w:val="20"/>
+              </w:rPr>
+              <w:t xml:space="preserve">Seitenwand V2 freistehend 8mm 1200x2000 silber matt ESG klar VIGOUR</w:t>
+            </w:r>
+            <w:proofErr w:type="spellStart"/>
+            <w:r>
+              <w:rPr>
+                <w:sz w:val="20"/>
+                <w:szCs w:val="20"/>
+              </w:rPr>
+              <w:t/>
+            </w:r>
+            <w:proofErr w:type="spellEnd"/>
+            <w:r>
+              <w:rPr>
+                <w:sz w:val="20"/>
+                <w:szCs w:val="20"/>
+              </w:rPr>
+              <w:t/>
+            </w:r>
+          </w:p>
+        </w:tc>
+        <w:tc>
+          <w:tcPr>
+            <w:tcW w:w="853" w:type="dxa"/>
+          </w:tcPr>
+          <w:p>
+            <w:pPr>
+              <w:rPr>
+                <w:sz w:val="20"/>
+                <w:szCs w:val="20"/>
+                <w:lang w:val="de-DE"/>
+              </w:rPr>
+            </w:pPr>
+            <w:r>
+              <w:rPr>
+                <w:sz w:val="20"/>
+                <w:szCs w:val="20"/>
+              </w:rPr>
+              <w:t xml:space="preserve">1</w:t>
+            </w:r>
+            <w:proofErr w:type="spellStart"/>
+            <w:r>
+              <w:rPr>
+                <w:sz w:val="20"/>
+                <w:szCs w:val="20"/>
+              </w:rPr>
+              <w:t/>
+            </w:r>
+            <w:proofErr w:type="spellEnd"/>
+            <w:r>
+              <w:rPr>
+                <w:sz w:val="20"/>
+                <w:szCs w:val="20"/>
+              </w:rPr>
+              <w:t/>
+            </w:r>
+          </w:p>
+        </w:tc>
+        <w:tc>
+          <w:tcPr>
+            <w:tcW w:w="878" w:type="dxa"/>
+          </w:tcPr>
+          <w:p>
+            <w:pPr>
+              <w:rPr>
+                <w:sz w:val="20"/>
+                <w:szCs w:val="20"/>
+                <w:lang w:val="de-DE"/>
+              </w:rPr>
+            </w:pPr>
+            <w:r>
+              <w:rPr>
+                <w:sz w:val="20"/>
+                <w:szCs w:val="20"/>
+              </w:rPr>
+              <w:t xml:space="preserve">Stck.</w:t>
+            </w:r>
+          </w:p>
+        </w:tc>
+        <w:tc>
+          <w:tcPr>
+            <w:tcW w:w="1303" w:type="dxa"/>
+          </w:tcPr>
+          <w:p>
+            <w:pPr>
+              <w:rPr>
+                <w:sz w:val="20"/>
+                <w:szCs w:val="20"/>
+                <w:lang w:val="de-DE"/>
+              </w:rPr>
+            </w:pPr>
+            <w:r>
+              <w:rPr>
+                <w:sz w:val="20"/>
+                <w:szCs w:val="20"/>
+              </w:rPr>
+              <w:t/>
+            </w:r>
+            <w:proofErr w:type="spellStart"/>
+            <w:r>
+              <w:rPr>
+                <w:sz w:val="20"/>
+                <w:szCs w:val="20"/>
+              </w:rPr>
+              <w:t/>
+            </w:r>
+            <w:proofErr w:type="spellEnd"/>
+            <w:r>
+              <w:rPr>
+                <w:sz w:val="20"/>
+                <w:szCs w:val="20"/>
+              </w:rPr>
+              <w:t/>
+            </w:r>
+          </w:p>
+        </w:tc>
+      </w:tr>
+      <w:tr>
+        <w:tc>
+          <w:tcPr>
+            <w:tcW w:w="2836" w:type="dxa"/>
+          </w:tcPr>
+          <w:p>
+            <w:pPr>
+              <w:rPr>
+                <w:sz w:val="20"/>
+                <w:szCs w:val="20"/>
+                <w:lang w:val="de-DE"/>
+              </w:rPr>
+            </w:pPr>
+            <w:r>
+              <w:rPr>
+                <w:sz w:val="20"/>
+                <w:szCs w:val="20"/>
+              </w:rPr>
+              <w:t xml:space="preserve">20</w:t>
+            </w:r>
+          </w:p>
+        </w:tc>
+        <w:tc>
+          <w:tcPr>
+            <w:tcW w:w="2041" w:type="dxa"/>
+          </w:tcPr>
+          <w:p>
+            <w:pPr>
+              <w:rPr>
+                <w:sz w:val="20"/>
+                <w:szCs w:val="20"/>
+                <w:lang w:val="de-DE"/>
+              </w:rPr>
+            </w:pPr>
+            <w:r>
+              <w:rPr>
+                <w:sz w:val="20"/>
+                <w:szCs w:val="20"/>
+              </w:rPr>
+              <w:t xml:space="preserve">V3A</w:t>
+            </w:r>
+            <w:proofErr w:type="spellStart"/>
+            <w:r>
+              <w:rPr>
+                <w:sz w:val="20"/>
+                <w:szCs w:val="20"/>
+              </w:rPr>
+              <w:t/>
+            </w:r>
+            <w:proofErr w:type="spellEnd"/>
+            <w:r>
+              <w:rPr>
+                <w:sz w:val="20"/>
+                <w:szCs w:val="20"/>
+              </w:rPr>
+              <w:t/>
+            </w:r>
+          </w:p>
+        </w:tc>
+        <w:tc>
+          <w:tcPr>
+            <w:tcW w:w="1440" w:type="dxa"/>
+          </w:tcPr>
+          <w:p>
+            <w:pPr>
+              <w:rPr>
+                <w:sz w:val="20"/>
+                <w:szCs w:val="20"/>
+                <w:lang w:val="de-DE"/>
+              </w:rPr>
+            </w:pPr>
+            <w:r>
+              <w:rPr>
+                <w:sz w:val="20"/>
+                <w:szCs w:val="20"/>
+              </w:rPr>
+              <w:t xml:space="preserve">Abschlussprofil V3 255 cm silber eloxiert VIGOUR</w:t>
+            </w:r>
+            <w:proofErr w:type="spellStart"/>
+            <w:r>
+              <w:rPr>
+                <w:sz w:val="20"/>
+                <w:szCs w:val="20"/>
+              </w:rPr>
+              <w:t/>
+            </w:r>
+            <w:proofErr w:type="spellEnd"/>
+            <w:r>
+              <w:rPr>
+                <w:sz w:val="20"/>
+                <w:szCs w:val="20"/>
+              </w:rPr>
+              <w:t/>
+            </w:r>
+          </w:p>
+        </w:tc>
+        <w:tc>
+          <w:tcPr>
+            <w:tcW w:w="853" w:type="dxa"/>
+          </w:tcPr>
+          <w:p>
+            <w:pPr>
+              <w:rPr>
+                <w:sz w:val="20"/>
+                <w:szCs w:val="20"/>
+                <w:lang w:val="de-DE"/>
+              </w:rPr>
+            </w:pPr>
+            <w:r>
+              <w:rPr>
+                <w:sz w:val="20"/>
+                <w:szCs w:val="20"/>
+              </w:rPr>
+              <w:t xml:space="preserve">3</w:t>
+            </w:r>
+            <w:proofErr w:type="spellStart"/>
+            <w:r>
+              <w:rPr>
+                <w:sz w:val="20"/>
+                <w:szCs w:val="20"/>
+              </w:rPr>
+              <w:t/>
+            </w:r>
+            <w:proofErr w:type="spellEnd"/>
+            <w:r>
+              <w:rPr>
+                <w:sz w:val="20"/>
+                <w:szCs w:val="20"/>
+              </w:rPr>
+              <w:t/>
+            </w:r>
+          </w:p>
+        </w:tc>
+        <w:tc>
+          <w:tcPr>
+            <w:tcW w:w="878" w:type="dxa"/>
+          </w:tcPr>
+          <w:p>
+            <w:pPr>
+              <w:rPr>
+                <w:sz w:val="20"/>
+                <w:szCs w:val="20"/>
+                <w:lang w:val="de-DE"/>
+              </w:rPr>
+            </w:pPr>
+            <w:r>
+              <w:rPr>
+                <w:sz w:val="20"/>
+                <w:szCs w:val="20"/>
+              </w:rPr>
+              <w:t xml:space="preserve">Stck.</w:t>
+            </w:r>
+          </w:p>
+        </w:tc>
+        <w:tc>
+          <w:tcPr>
+            <w:tcW w:w="1303" w:type="dxa"/>
+          </w:tcPr>
+          <w:p>
+            <w:pPr>
+              <w:rPr>
+                <w:sz w:val="20"/>
+                <w:szCs w:val="20"/>
+                <w:lang w:val="de-DE"/>
+              </w:rPr>
+            </w:pPr>
+            <w:r>
+              <w:rPr>
+                <w:sz w:val="20"/>
+                <w:szCs w:val="20"/>
+              </w:rPr>
+              <w:t/>
+            </w:r>
+            <w:proofErr w:type="spellStart"/>
+            <w:r>
+              <w:rPr>
+                <w:sz w:val="20"/>
+                <w:szCs w:val="20"/>
+              </w:rPr>
+              <w:t/>
+            </w:r>
+            <w:proofErr w:type="spellEnd"/>
+            <w:r>
+              <w:rPr>
+                <w:sz w:val="20"/>
+                <w:szCs w:val="20"/>
+              </w:rPr>
+              <w:t/>
+            </w:r>
+          </w:p>
+        </w:tc>
+      </w:tr>
+      <w:tr>
+        <w:tc>
+          <w:tcPr>
+            <w:tcW w:w="2836" w:type="dxa"/>
+          </w:tcPr>
+          <w:p>
+            <w:pPr>
+              <w:rPr>
+                <w:sz w:val="20"/>
+                <w:szCs w:val="20"/>
+                <w:lang w:val="de-DE"/>
+              </w:rPr>
+            </w:pPr>
+            <w:r>
+              <w:rPr>
+                <w:sz w:val="20"/>
+                <w:szCs w:val="20"/>
+              </w:rPr>
+              <w:t xml:space="preserve">21</w:t>
+            </w:r>
+          </w:p>
+        </w:tc>
+        <w:tc>
+          <w:tcPr>
+            <w:tcW w:w="2041" w:type="dxa"/>
+          </w:tcPr>
+          <w:p>
+            <w:pPr>
+              <w:rPr>
+                <w:sz w:val="20"/>
+                <w:szCs w:val="20"/>
+                <w:lang w:val="de-DE"/>
+              </w:rPr>
+            </w:pPr>
+            <w:r>
+              <w:rPr>
+                <w:sz w:val="20"/>
+                <w:szCs w:val="20"/>
+              </w:rPr>
+              <w:t xml:space="preserve">V3V</w:t>
+            </w:r>
+            <w:proofErr w:type="spellStart"/>
+            <w:r>
+              <w:rPr>
+                <w:sz w:val="20"/>
+                <w:szCs w:val="20"/>
+              </w:rPr>
+              <w:t/>
+            </w:r>
+            <w:proofErr w:type="spellEnd"/>
+            <w:r>
+              <w:rPr>
+                <w:sz w:val="20"/>
+                <w:szCs w:val="20"/>
+              </w:rPr>
+              <w:t/>
+            </w:r>
+          </w:p>
+        </w:tc>
+        <w:tc>
+          <w:tcPr>
+            <w:tcW w:w="1440" w:type="dxa"/>
+          </w:tcPr>
+          <w:p>
+            <w:pPr>
+              <w:rPr>
+                <w:sz w:val="20"/>
+                <w:szCs w:val="20"/>
+                <w:lang w:val="de-DE"/>
+              </w:rPr>
+            </w:pPr>
+            <w:r>
+              <w:rPr>
+                <w:sz w:val="20"/>
+                <w:szCs w:val="20"/>
+              </w:rPr>
+              <w:t xml:space="preserve">Verbindungsprofil V3 255 cm silber eloxiert VIGOUR</w:t>
+            </w:r>
+            <w:proofErr w:type="spellStart"/>
+            <w:r>
+              <w:rPr>
+                <w:sz w:val="20"/>
+                <w:szCs w:val="20"/>
+              </w:rPr>
+              <w:t/>
+            </w:r>
+            <w:proofErr w:type="spellEnd"/>
+            <w:r>
+              <w:rPr>
+                <w:sz w:val="20"/>
+                <w:szCs w:val="20"/>
+              </w:rPr>
+              <w:t/>
+            </w:r>
+          </w:p>
+        </w:tc>
+        <w:tc>
+          <w:tcPr>
+            <w:tcW w:w="853" w:type="dxa"/>
+          </w:tcPr>
+          <w:p>
+            <w:pPr>
+              <w:rPr>
+                <w:sz w:val="20"/>
+                <w:szCs w:val="20"/>
+                <w:lang w:val="de-DE"/>
+              </w:rPr>
+            </w:pPr>
+            <w:r>
+              <w:rPr>
+                <w:sz w:val="20"/>
+                <w:szCs w:val="20"/>
+              </w:rPr>
+              <w:t xml:space="preserve">3</w:t>
+            </w:r>
+            <w:proofErr w:type="spellStart"/>
+            <w:r>
+              <w:rPr>
+                <w:sz w:val="20"/>
+                <w:szCs w:val="20"/>
+              </w:rPr>
+              <w:t/>
+            </w:r>
+            <w:proofErr w:type="spellEnd"/>
+            <w:r>
+              <w:rPr>
+                <w:sz w:val="20"/>
+                <w:szCs w:val="20"/>
+              </w:rPr>
+              <w:t/>
+            </w:r>
+          </w:p>
+        </w:tc>
+        <w:tc>
+          <w:tcPr>
+            <w:tcW w:w="878" w:type="dxa"/>
+          </w:tcPr>
+          <w:p>
+            <w:pPr>
+              <w:rPr>
+                <w:sz w:val="20"/>
+                <w:szCs w:val="20"/>
+                <w:lang w:val="de-DE"/>
+              </w:rPr>
+            </w:pPr>
+            <w:r>
+              <w:rPr>
+                <w:sz w:val="20"/>
+                <w:szCs w:val="20"/>
+              </w:rPr>
+              <w:t xml:space="preserve">Stck.</w:t>
+            </w:r>
+          </w:p>
+        </w:tc>
+        <w:tc>
+          <w:tcPr>
+            <w:tcW w:w="1303" w:type="dxa"/>
+          </w:tcPr>
+          <w:p>
+            <w:pPr>
+              <w:rPr>
+                <w:sz w:val="20"/>
+                <w:szCs w:val="20"/>
+                <w:lang w:val="de-DE"/>
+              </w:rPr>
+            </w:pPr>
+            <w:r>
+              <w:rPr>
+                <w:sz w:val="20"/>
+                <w:szCs w:val="20"/>
+              </w:rPr>
+              <w:t/>
+            </w:r>
+            <w:proofErr w:type="spellStart"/>
+            <w:r>
+              <w:rPr>
+                <w:sz w:val="20"/>
+                <w:szCs w:val="20"/>
+              </w:rPr>
+              <w:t/>
+            </w:r>
+            <w:proofErr w:type="spellEnd"/>
+            <w:r>
+              <w:rPr>
+                <w:sz w:val="20"/>
+                <w:szCs w:val="20"/>
+              </w:rPr>
+              <w:t/>
+            </w:r>
+          </w:p>
+        </w:tc>
+      </w:tr>
+      <w:tr>
+        <w:tc>
+          <w:tcPr>
+            <w:tcW w:w="2836" w:type="dxa"/>
+          </w:tcPr>
+          <w:p>
+            <w:pPr>
+              <w:rPr>
+                <w:sz w:val="20"/>
+                <w:szCs w:val="20"/>
+                <w:lang w:val="de-DE"/>
+              </w:rPr>
+            </w:pPr>
+            <w:r>
+              <w:rPr>
+                <w:sz w:val="20"/>
+                <w:szCs w:val="20"/>
+              </w:rPr>
+              <w:t xml:space="preserve">22</w:t>
+            </w:r>
+          </w:p>
+        </w:tc>
+        <w:tc>
+          <w:tcPr>
+            <w:tcW w:w="2041" w:type="dxa"/>
+          </w:tcPr>
+          <w:p>
+            <w:pPr>
+              <w:rPr>
+                <w:sz w:val="20"/>
+                <w:szCs w:val="20"/>
+                <w:lang w:val="de-DE"/>
+              </w:rPr>
+            </w:pPr>
+            <w:r>
+              <w:rPr>
+                <w:sz w:val="20"/>
+                <w:szCs w:val="20"/>
+              </w:rPr>
+              <w:t xml:space="preserve">V3WV09</w:t>
+            </w:r>
+            <w:proofErr w:type="spellStart"/>
+            <w:r>
+              <w:rPr>
+                <w:sz w:val="20"/>
+                <w:szCs w:val="20"/>
+              </w:rPr>
+              <w:t/>
+            </w:r>
+            <w:proofErr w:type="spellEnd"/>
+            <w:r>
+              <w:rPr>
+                <w:sz w:val="20"/>
+                <w:szCs w:val="20"/>
+              </w:rPr>
+              <w:t/>
+            </w:r>
+          </w:p>
+        </w:tc>
+        <w:tc>
+          <w:tcPr>
+            <w:tcW w:w="1440" w:type="dxa"/>
+          </w:tcPr>
+          <w:p>
+            <w:pPr>
+              <w:rPr>
+                <w:sz w:val="20"/>
+                <w:szCs w:val="20"/>
+                <w:lang w:val="de-DE"/>
+              </w:rPr>
+            </w:pPr>
+            <w:r>
+              <w:rPr>
+                <w:sz w:val="20"/>
+                <w:szCs w:val="20"/>
+              </w:rPr>
+              <w:t xml:space="preserve">Wandverkleidung V3 Alu 1497x 2550mm Marmor weiß VIGOUR — Farbe: Stein beige</w:t>
+            </w:r>
+            <w:proofErr w:type="spellStart"/>
+            <w:r>
+              <w:rPr>
+                <w:sz w:val="20"/>
+                <w:szCs w:val="20"/>
+              </w:rPr>
+              <w:t/>
+            </w:r>
+            <w:proofErr w:type="spellEnd"/>
+            <w:r>
+              <w:rPr>
+                <w:sz w:val="20"/>
+                <w:szCs w:val="20"/>
+              </w:rPr>
+              <w:t/>
+            </w:r>
+          </w:p>
+        </w:tc>
+        <w:tc>
+          <w:tcPr>
+            <w:tcW w:w="853" w:type="dxa"/>
+          </w:tcPr>
+          <w:p>
+            <w:pPr>
+              <w:rPr>
+                <w:sz w:val="20"/>
+                <w:szCs w:val="20"/>
+                <w:lang w:val="de-DE"/>
+              </w:rPr>
+            </w:pPr>
+            <w:r>
+              <w:rPr>
+                <w:sz w:val="20"/>
+                <w:szCs w:val="20"/>
+              </w:rPr>
+              <w:t xml:space="preserve">2</w:t>
+            </w:r>
+            <w:proofErr w:type="spellStart"/>
+            <w:r>
+              <w:rPr>
+                <w:sz w:val="20"/>
+                <w:szCs w:val="20"/>
+              </w:rPr>
+              <w:t/>
+            </w:r>
+            <w:proofErr w:type="spellEnd"/>
+            <w:r>
+              <w:rPr>
+                <w:sz w:val="20"/>
+                <w:szCs w:val="20"/>
+              </w:rPr>
+              <w:t/>
+            </w:r>
+          </w:p>
+        </w:tc>
+        <w:tc>
+          <w:tcPr>
+            <w:tcW w:w="878" w:type="dxa"/>
+          </w:tcPr>
+          <w:p>
+            <w:pPr>
+              <w:rPr>
+                <w:sz w:val="20"/>
+                <w:szCs w:val="20"/>
+                <w:lang w:val="de-DE"/>
+              </w:rPr>
+            </w:pPr>
+            <w:r>
+              <w:rPr>
+                <w:sz w:val="20"/>
+                <w:szCs w:val="20"/>
+              </w:rPr>
+              <w:t xml:space="preserve">Stck.</w:t>
+            </w:r>
+          </w:p>
+        </w:tc>
+        <w:tc>
+          <w:tcPr>
+            <w:tcW w:w="1303" w:type="dxa"/>
+          </w:tcPr>
+          <w:p>
+            <w:pPr>
+              <w:rPr>
+                <w:sz w:val="20"/>
+                <w:szCs w:val="20"/>
+                <w:lang w:val="de-DE"/>
+              </w:rPr>
+            </w:pPr>
+            <w:r>
+              <w:rPr>
+                <w:sz w:val="20"/>
+                <w:szCs w:val="20"/>
+              </w:rPr>
+              <w:t/>
+            </w:r>
+            <w:proofErr w:type="spellStart"/>
+            <w:r>
+              <w:rPr>
+                <w:sz w:val="20"/>
+                <w:szCs w:val="20"/>
+              </w:rPr>
+              <w:t/>
+            </w:r>
+            <w:proofErr w:type="spellEnd"/>
+            <w:r>
+              <w:rPr>
+                <w:sz w:val="20"/>
+                <w:szCs w:val="20"/>
+              </w:rPr>
+              <w:t/>
+            </w:r>
+          </w:p>
+        </w:tc>
+      </w:tr>
+      <w:tr>
+        <w:tc>
+          <w:tcPr>
+            <w:tcW w:w="2836" w:type="dxa"/>
+          </w:tcPr>
+          <w:p>
+            <w:pPr>
+              <w:rPr>
+                <w:sz w:val="20"/>
+                <w:szCs w:val="20"/>
+                <w:lang w:val="de-DE"/>
+              </w:rPr>
+            </w:pPr>
+            <w:r>
+              <w:rPr>
+                <w:sz w:val="20"/>
+                <w:szCs w:val="20"/>
+              </w:rPr>
+              <w:t xml:space="preserve">23</w:t>
+            </w:r>
+          </w:p>
+        </w:tc>
+        <w:tc>
+          <w:tcPr>
+            <w:tcW w:w="2041" w:type="dxa"/>
+          </w:tcPr>
+          <w:p>
+            <w:pPr>
+              <w:rPr>
+                <w:sz w:val="20"/>
+                <w:szCs w:val="20"/>
+                <w:lang w:val="de-DE"/>
+              </w:rPr>
+            </w:pPr>
+            <w:r>
+              <w:rPr>
+                <w:sz w:val="20"/>
+                <w:szCs w:val="20"/>
+              </w:rPr>
+              <w:t xml:space="preserve">V3WVK09</w:t>
+            </w:r>
+            <w:proofErr w:type="spellStart"/>
+            <w:r>
+              <w:rPr>
+                <w:sz w:val="20"/>
+                <w:szCs w:val="20"/>
+              </w:rPr>
+              <w:t/>
+            </w:r>
+            <w:proofErr w:type="spellEnd"/>
+            <w:r>
+              <w:rPr>
+                <w:sz w:val="20"/>
+                <w:szCs w:val="20"/>
+              </w:rPr>
+              <w:t/>
+            </w:r>
+          </w:p>
+        </w:tc>
+        <w:tc>
+          <w:tcPr>
+            <w:tcW w:w="1440" w:type="dxa"/>
+          </w:tcPr>
+          <w:p>
+            <w:pPr>
+              <w:rPr>
+                <w:sz w:val="20"/>
+                <w:szCs w:val="20"/>
+                <w:lang w:val="de-DE"/>
+              </w:rPr>
+            </w:pPr>
+            <w:r>
+              <w:rPr>
+                <w:sz w:val="20"/>
+                <w:szCs w:val="20"/>
+              </w:rPr>
+              <w:t xml:space="preserve">Wandverkleidung V3 Alu 997x 2550mm Marmor weiß VIGOUR — Farbe: Stein beige</w:t>
+            </w:r>
+            <w:proofErr w:type="spellStart"/>
+            <w:r>
+              <w:rPr>
+                <w:sz w:val="20"/>
+                <w:szCs w:val="20"/>
+              </w:rPr>
+              <w:t/>
+            </w:r>
+            <w:proofErr w:type="spellEnd"/>
+            <w:r>
+              <w:rPr>
+                <w:sz w:val="20"/>
+                <w:szCs w:val="20"/>
+              </w:rPr>
+              <w:t/>
+            </w:r>
+          </w:p>
+        </w:tc>
+        <w:tc>
+          <w:tcPr>
+            <w:tcW w:w="853" w:type="dxa"/>
+          </w:tcPr>
+          <w:p>
+            <w:pPr>
+              <w:rPr>
+                <w:sz w:val="20"/>
+                <w:szCs w:val="20"/>
+                <w:lang w:val="de-DE"/>
+              </w:rPr>
+            </w:pPr>
+            <w:r>
+              <w:rPr>
+                <w:sz w:val="20"/>
+                <w:szCs w:val="20"/>
+              </w:rPr>
+              <w:t xml:space="preserve">2</w:t>
+            </w:r>
+            <w:proofErr w:type="spellStart"/>
+            <w:r>
+              <w:rPr>
+                <w:sz w:val="20"/>
+                <w:szCs w:val="20"/>
+              </w:rPr>
+              <w:t/>
+            </w:r>
+            <w:proofErr w:type="spellEnd"/>
+            <w:r>
+              <w:rPr>
+                <w:sz w:val="20"/>
+                <w:szCs w:val="20"/>
+              </w:rPr>
+              <w:t/>
+            </w:r>
+          </w:p>
+        </w:tc>
+        <w:tc>
+          <w:tcPr>
+            <w:tcW w:w="878" w:type="dxa"/>
+          </w:tcPr>
+          <w:p>
+            <w:pPr>
+              <w:rPr>
+                <w:sz w:val="20"/>
+                <w:szCs w:val="20"/>
+                <w:lang w:val="de-DE"/>
+              </w:rPr>
+            </w:pPr>
+            <w:r>
+              <w:rPr>
+                <w:sz w:val="20"/>
+                <w:szCs w:val="20"/>
+              </w:rPr>
+              <w:t xml:space="preserve">Stck.</w:t>
+            </w:r>
+          </w:p>
+        </w:tc>
+        <w:tc>
+          <w:tcPr>
+            <w:tcW w:w="1303" w:type="dxa"/>
+          </w:tcPr>
+          <w:p>
+            <w:pPr>
+              <w:rPr>
+                <w:sz w:val="20"/>
+                <w:szCs w:val="20"/>
+                <w:lang w:val="de-DE"/>
+              </w:rPr>
+            </w:pPr>
+            <w:r>
+              <w:rPr>
+                <w:sz w:val="20"/>
+                <w:szCs w:val="20"/>
+              </w:rPr>
+              <w:t/>
+            </w:r>
+            <w:proofErr w:type="spellStart"/>
+            <w:r>
+              <w:rPr>
+                <w:sz w:val="20"/>
+                <w:szCs w:val="20"/>
+              </w:rPr>
+              <w:t/>
+            </w:r>
+            <w:proofErr w:type="spellEnd"/>
+            <w:r>
+              <w:rPr>
+                <w:sz w:val="20"/>
+                <w:szCs w:val="20"/>
+              </w:rPr>
+              <w:t/>
+            </w:r>
+          </w:p>
+        </w:tc>
+      </w:tr>
+      <w:tr>
+        <w:tc>
+          <w:tcPr>
+            <w:tcW w:w="2836" w:type="dxa"/>
+          </w:tcPr>
+          <w:p>
+            <w:pPr>
+              <w:rPr>
+                <w:sz w:val="20"/>
+                <w:szCs w:val="20"/>
+                <w:lang w:val="de-DE"/>
+              </w:rPr>
+            </w:pPr>
+            <w:r>
+              <w:rPr>
+                <w:sz w:val="20"/>
+                <w:szCs w:val="20"/>
+              </w:rPr>
+              <w:t xml:space="preserve">24</w:t>
+            </w:r>
+          </w:p>
+        </w:tc>
+        <w:tc>
+          <w:tcPr>
+            <w:tcW w:w="2041" w:type="dxa"/>
+          </w:tcPr>
+          <w:p>
+            <w:pPr>
+              <w:rPr>
+                <w:sz w:val="20"/>
+                <w:szCs w:val="20"/>
+                <w:lang w:val="de-DE"/>
+              </w:rPr>
+            </w:pPr>
+            <w:r>
+              <w:rPr>
+                <w:sz w:val="20"/>
+                <w:szCs w:val="20"/>
+              </w:rPr>
+              <w:t xml:space="preserve">QR3923540</w:t>
+            </w:r>
+            <w:proofErr w:type="spellStart"/>
+            <w:r>
+              <w:rPr>
+                <w:sz w:val="20"/>
+                <w:szCs w:val="20"/>
+              </w:rPr>
+              <w:t/>
+            </w:r>
+            <w:proofErr w:type="spellEnd"/>
+            <w:r>
+              <w:rPr>
+                <w:sz w:val="20"/>
+                <w:szCs w:val="20"/>
+              </w:rPr>
+              <w:t/>
+            </w:r>
+          </w:p>
+        </w:tc>
+        <w:tc>
+          <w:tcPr>
+            <w:tcW w:w="1440" w:type="dxa"/>
+          </w:tcPr>
+          <w:p>
+            <w:pPr>
+              <w:rPr>
+                <w:sz w:val="20"/>
+                <w:szCs w:val="20"/>
+                <w:lang w:val="de-DE"/>
+              </w:rPr>
+            </w:pPr>
+            <w:r>
+              <w:rPr>
+                <w:sz w:val="20"/>
+                <w:szCs w:val="20"/>
+              </w:rPr>
+              <w:t xml:space="preserve">Silikon-Duschabzieher mit Halter</w:t>
+            </w:r>
+            <w:proofErr w:type="spellStart"/>
+            <w:r>
+              <w:rPr>
+                <w:sz w:val="20"/>
+                <w:szCs w:val="20"/>
+              </w:rPr>
+              <w:t/>
+            </w:r>
+            <w:proofErr w:type="spellEnd"/>
+            <w:r>
+              <w:rPr>
+                <w:sz w:val="20"/>
+                <w:szCs w:val="20"/>
+              </w:rPr>
+              <w:t/>
+            </w:r>
+          </w:p>
+        </w:tc>
+        <w:tc>
+          <w:tcPr>
+            <w:tcW w:w="853" w:type="dxa"/>
+          </w:tcPr>
+          <w:p>
+            <w:pPr>
+              <w:rPr>
+                <w:sz w:val="20"/>
+                <w:szCs w:val="20"/>
+                <w:lang w:val="de-DE"/>
+              </w:rPr>
+            </w:pPr>
+            <w:r>
+              <w:rPr>
+                <w:sz w:val="20"/>
+                <w:szCs w:val="20"/>
+              </w:rPr>
+              <w:t xml:space="preserve">1</w:t>
+            </w:r>
+            <w:proofErr w:type="spellStart"/>
+            <w:r>
+              <w:rPr>
+                <w:sz w:val="20"/>
+                <w:szCs w:val="20"/>
+              </w:rPr>
+              <w:t/>
+            </w:r>
+            <w:proofErr w:type="spellEnd"/>
+            <w:r>
+              <w:rPr>
+                <w:sz w:val="20"/>
+                <w:szCs w:val="20"/>
+              </w:rPr>
+              <w:t/>
+            </w:r>
+          </w:p>
+        </w:tc>
+        <w:tc>
+          <w:tcPr>
+            <w:tcW w:w="878" w:type="dxa"/>
+          </w:tcPr>
+          <w:p>
+            <w:pPr>
+              <w:rPr>
+                <w:sz w:val="20"/>
+                <w:szCs w:val="20"/>
+                <w:lang w:val="de-DE"/>
+              </w:rPr>
+            </w:pPr>
+            <w:r>
+              <w:rPr>
+                <w:sz w:val="20"/>
+                <w:szCs w:val="20"/>
+              </w:rPr>
+              <w:t xml:space="preserve">Stck.</w:t>
+            </w:r>
+          </w:p>
+        </w:tc>
+        <w:tc>
+          <w:tcPr>
+            <w:tcW w:w="1303" w:type="dxa"/>
+          </w:tcPr>
+          <w:p>
+            <w:pPr>
+              <w:rPr>
+                <w:sz w:val="20"/>
+                <w:szCs w:val="20"/>
+                <w:lang w:val="de-DE"/>
+              </w:rPr>
+            </w:pPr>
+            <w:r>
+              <w:rPr>
+                <w:sz w:val="20"/>
+                <w:szCs w:val="20"/>
+              </w:rPr>
+              <w:t xml:space="preserve">Geschenk für den Kunden (nicht im Angebot ausgewiesen).</w:t>
             </w:r>
             <w:proofErr w:type="spellStart"/>
             <w:r>

</xml_diff>